<commit_message>
perbaikan bug restarting number point, tahap penyusunan logika dan algoritma
</commit_message>
<xml_diff>
--- a/formating-docx/doc/My Document.docx
+++ b/formating-docx/doc/My Document.docx
@@ -177,7 +177,7 @@
         <w:pStyle w:val="bold"/>
         <w:numPr>
           <w:ilvl w:val="0"/>
-          <w:numId w:val="58"/>
+          <w:numId w:val="7"/>
         </w:numPr>
         <w:spacing w:line="360"/>
         <w:ind w:left="283" w:hanging="272" w:firstLine="0"/>
@@ -208,28 +208,6 @@
         </w:rPr>
         <w:t xml:space="preserve">Kata “jihad” berasal dari kata “jahada”, yang berarti “usaha”, atau “jahdun” (جَهْدٌ), yang berarti “kekuatan”, dan “juhdun”(جُهْدٌ), yang berarti “kekuatan”. "Mengeluarkan segala kemampuan, kesungguhan, kekuatan, dan kesanggupan pada jalan yang diyakini kebenarannya" adalah definisi bahasa jihad. Akibatnya, kata ini juga dapat berarti ijtihad, yang berarti bersungguh-sungguh, rajin, giat, atau mencurahkan kemampuan, daya upaya, atau usaha keras untuk mencapai atau memperoleh sesuatu serta melepaskan diri dari keraguan sehingga mencapai peringkat yang yakin. Menurut pengertian bahasa, jihad sebenarnya memiliki makna yang sangat luas. Oleh karena itu, jihad secara bahasa dapat diterjemahkan sebagai usaha yang sungguh-sungguh dan berkualitas untuk menghasilkan sesuatu yang bermanfaat dan diridhai oleh Allah SWT. Usaha-usaha ini dapat mencakup amal saleh secara keseluruhan, keimanan yang kuat di dalam hati, atau upaya untuk menolak sesuatu yang dimurkai oleh Allah SWT.</w:t>
       </w:r>
-      <w:r>
-        <w:rPr>
-          <w:color w:val="000000"/>
-          <w:sz w:val="24"/>
-          <w:szCs w:val="24"/>
-          <w:rFonts w:ascii="Times New Roman" w:cs="Times New Roman" w:eastAsia="Times New Roman" w:hAnsi="Times New Roman"/>
-        </w:rPr>
-      </w:r>
-      <w:r>
-        <w:rPr>
-          <w:rStyle w:val="FootnoteReference"/>
-        </w:rPr>
-        <w:footnoteReference w:id="1"/>
-      </w:r>
-      <w:r>
-        <w:rPr>
-          <w:color w:val="000000"/>
-          <w:sz w:val="24"/>
-          <w:szCs w:val="24"/>
-          <w:rFonts w:ascii="Times New Roman" w:cs="Times New Roman" w:eastAsia="Times New Roman" w:hAnsi="Times New Roman"/>
-        </w:rPr>
-      </w:r>
     </w:p>
     <w:p>
       <w:pPr>
@@ -246,28 +224,6 @@
         </w:rPr>
         <w:t xml:space="preserve">Muhammad Fuad (1992) menyatakan bahwa term jihad dengan berbagai derivasinya disebutkan dalam Al-Qur'an sebanyak 41 kali. Dari 41 term tersebut, kebanyakan bergandengan dengan term "fisabilillah" (di jalan Allah). Kata jihad yang mengandung pengertian perjuangan tersebut memberikan indikasi bahwa jihad memiliki makna yang luas, yakni perjuangan secara total yang meliputi seluruh aspek kehidupan. Meskipun demikian, tidak dapat dipungkiri bahwa terdapat ayat yang mengandung pengertian jihad sebagai perang fisik atau mengangkat senjata terhadap para pembangkang atau musuh. Namun, ayat-ayat lain justru memaknai jihad sebagai perjuangan yang bersifat universal.</w:t>
       </w:r>
-      <w:r>
-        <w:rPr>
-          <w:color w:val="000000"/>
-          <w:sz w:val="24"/>
-          <w:szCs w:val="24"/>
-          <w:rFonts w:ascii="Times New Roman" w:cs="Times New Roman" w:eastAsia="Times New Roman" w:hAnsi="Times New Roman"/>
-        </w:rPr>
-      </w:r>
-      <w:r>
-        <w:rPr>
-          <w:rStyle w:val="FootnoteReference"/>
-        </w:rPr>
-        <w:footnoteReference w:id="2"/>
-      </w:r>
-      <w:r>
-        <w:rPr>
-          <w:color w:val="000000"/>
-          <w:sz w:val="24"/>
-          <w:szCs w:val="24"/>
-          <w:rFonts w:ascii="Times New Roman" w:cs="Times New Roman" w:eastAsia="Times New Roman" w:hAnsi="Times New Roman"/>
-        </w:rPr>
-      </w:r>
     </w:p>
     <w:p>
       <w:pPr>
@@ -284,28 +240,6 @@
         </w:rPr>
         <w:t xml:space="preserve">Sebagaimana ayat-ayat Al-Qur'an yang terbagi dalam dua kategori, yaitu ayat-ayat makkiyyah dan madaniyyah, ayat-ayat tentang jihad juga terbagi menjadi makkiyyah dan madaniyyah. Ayat-ayat jihad yang termasuk kategori makkiyyah lebih tepat dimaknai dengan pengertian menurut bahasa, yaitu mengerahkan segenap kemampuan untuk mencapai ridha Allah SWT. Ayat-ayat makkiyyah yang memerintahkan berjihad terhadap orang-orang kafir tidak dapat diartikan sebagai berperang melawan mereka, karena tidak ada bukti historis tentang peperangan yang dilakukan oleh Rasulullah selama periode Mekah. Keterangan di atas membuktikan bahwa jihad di dalam Al-Qur'an pada umumnya berarti bersungguh-sungguh. Dengan demikian, dapat dipahami bahwa pemahaman tentang jihad yang selalu mengidentikkan dengan perang bukanlah pemahaman yang bersumber dari Al-Qur'an. Oleh karena itu, keliru jika dikatakan bahwa semangat perang lahir dari ayat-ayat jihad dalam Al-Qur'an.</w:t>
       </w:r>
-      <w:r>
-        <w:rPr>
-          <w:color w:val="000000"/>
-          <w:sz w:val="24"/>
-          <w:szCs w:val="24"/>
-          <w:rFonts w:ascii="Times New Roman" w:cs="Times New Roman" w:eastAsia="Times New Roman" w:hAnsi="Times New Roman"/>
-        </w:rPr>
-      </w:r>
-      <w:r>
-        <w:rPr>
-          <w:rStyle w:val="FootnoteReference"/>
-        </w:rPr>
-        <w:footnoteReference w:id="3"/>
-      </w:r>
-      <w:r>
-        <w:rPr>
-          <w:color w:val="000000"/>
-          <w:sz w:val="24"/>
-          <w:szCs w:val="24"/>
-          <w:rFonts w:ascii="Times New Roman" w:cs="Times New Roman" w:eastAsia="Times New Roman" w:hAnsi="Times New Roman"/>
-        </w:rPr>
-      </w:r>
     </w:p>
     <w:p>
       <w:pPr>
@@ -338,28 +272,6 @@
         </w:rPr>
         <w:t xml:space="preserve">Jihad adalah berjuang dengan sungguh-sungguh menurut syariat Islam. Jihad dilaksanakan untuk menjalankan misi utama manusia, yaitu menegakkan agama Allah atau menjaga agama tetap tegak, dengan cara-cara yang sesuai dengan garis perjuangan para Rasul dan Al-Qur'an. Jihad yang dilaksanakan Rasul adalah berdakwah agar manusia meninggalkan kemusyrikan dan kembali kepada aturan Allah, menyucikan qalbu, memberikan pengajaran kepada umat, dan mendidik manusia agar sesuai dengan tujuan penciptaan mereka, yaitu menjadi khalifah Allah di bumi. 	Arti kata jihad sering disalahpahami oleh orang yang tidak mengenal prinsip-prinsip agama Islam sebagai 'perang suci' (holy war); istilah untuk perang adalah qital, bukan jihad. Jihad dalam bentuk perang dilaksanakan jika terjadi fitnah yang membahayakan eksistensi umat, seperti serangan-serangan dari luar. Pada dasarnya, arti kata jihad adalah "berjuang" atau "berusaha dengan keras", namun bukan berarti "perang dalam makna fisik". Jika sekarang jihad lebih sering diartikan sebagai "perjuangan untuk agama", itu tidak harus berarti perjuangan fisik. Mengartikan jihad hanya sebagai peperangan fisik dan eksternal untuk membela agama sangat berbahaya, karena mudah dimanfaatkan dan rentan terhadap fitnah.</w:t>
       </w:r>
-      <w:r>
-        <w:rPr>
-          <w:color w:val="000000"/>
-          <w:sz w:val="24"/>
-          <w:szCs w:val="24"/>
-          <w:rFonts w:ascii="Times New Roman" w:cs="Times New Roman" w:eastAsia="Times New Roman" w:hAnsi="Times New Roman"/>
-        </w:rPr>
-      </w:r>
-      <w:r>
-        <w:rPr>
-          <w:rStyle w:val="FootnoteReference"/>
-        </w:rPr>
-        <w:footnoteReference w:id="4"/>
-      </w:r>
-      <w:r>
-        <w:rPr>
-          <w:color w:val="000000"/>
-          <w:sz w:val="24"/>
-          <w:szCs w:val="24"/>
-          <w:rFonts w:ascii="Times New Roman" w:cs="Times New Roman" w:eastAsia="Times New Roman" w:hAnsi="Times New Roman"/>
-        </w:rPr>
-      </w:r>
     </w:p>
     <w:p>
       <w:pPr>
@@ -376,35 +288,13 @@
         </w:rPr>
         <w:t xml:space="preserve">Quraish Shihab (1996:494) mengatakan bahwa jihad juga mengandung arti "kemampuan" yang menuntut sang mujahid mengeluarkan segala daya dan kemampuannya demi mencapai tujuan. Karena itu, jihad adalah pengorbanan, dan dengan demikian sang mujahid tidak menuntut atau mengambil, tetapi memberi semua yang dimilikinya. Ketika memberi, dia tidak berhenti sebelum tujuannya tercapai atau yang dimilikinya habis.</w:t>
       </w:r>
-      <w:r>
-        <w:rPr>
-          <w:color w:val="000000"/>
-          <w:sz w:val="24"/>
-          <w:szCs w:val="24"/>
-          <w:rFonts w:ascii="Times New Roman" w:cs="Times New Roman" w:eastAsia="Times New Roman" w:hAnsi="Times New Roman"/>
-        </w:rPr>
-      </w:r>
-      <w:r>
-        <w:rPr>
-          <w:rStyle w:val="FootnoteReference"/>
-        </w:rPr>
-        <w:footnoteReference w:id="5"/>
-      </w:r>
-      <w:r>
-        <w:rPr>
-          <w:color w:val="000000"/>
-          <w:sz w:val="24"/>
-          <w:szCs w:val="24"/>
-          <w:rFonts w:ascii="Times New Roman" w:cs="Times New Roman" w:eastAsia="Times New Roman" w:hAnsi="Times New Roman"/>
-        </w:rPr>
-      </w:r>
     </w:p>
     <w:p>
       <w:pPr>
         <w:pStyle w:val="bold"/>
         <w:numPr>
           <w:ilvl w:val="0"/>
-          <w:numId w:val="58"/>
+          <w:numId w:val="7"/>
         </w:numPr>
         <w:spacing w:line="360"/>
         <w:ind w:left="283" w:hanging="272" w:firstLine="0"/>
@@ -451,28 +341,6 @@
         </w:rPr>
         <w:t xml:space="preserve">Terorisme dapat diartikan sebagai tindakan kekerasan atau ancaman kekerasan yang ditujukan kepada sasaran acak (yang tidak memiliki hubungan langsung dengan pelaku) dan mengakibatkan kerusakan, kematian, ketakutan, ketidakpastian, dan keputusasaan massal. Tindakan terorisme tersebut dilakukan dengan tujuan memaksakan kehendak kepada pihak yang dianggap lawan oleh kelompok teroris, agar kepentingan mereka diakui dan dihargai. Dengan definisi ini, unsur-unsur yang harus ada dalam pengertian terorisme adalah tindakan kekerasan yang mengakibatkan kerusakan, kematian, ketakutan, ketidakpastian, dan keputusasaan massal; sasaran tindakan adalah sasaran acak yang tidak memiliki hubungan langsung dengan pelaku; dan motivasi pelaku tidak dapat dikhususkan hanya pada motivasi politik saja, karena dalam banyak kasus, kepentingan non-politik seperti keyakinan juga merupakan latar belakangnya.</w:t>
       </w:r>
-      <w:r>
-        <w:rPr>
-          <w:color w:val="000000"/>
-          <w:sz w:val="24"/>
-          <w:szCs w:val="24"/>
-          <w:rFonts w:ascii="Times New Roman" w:cs="Times New Roman" w:eastAsia="Times New Roman" w:hAnsi="Times New Roman"/>
-        </w:rPr>
-      </w:r>
-      <w:r>
-        <w:rPr>
-          <w:rStyle w:val="FootnoteReference"/>
-        </w:rPr>
-        <w:footnoteReference w:id="6"/>
-      </w:r>
-      <w:r>
-        <w:rPr>
-          <w:color w:val="000000"/>
-          <w:sz w:val="24"/>
-          <w:szCs w:val="24"/>
-          <w:rFonts w:ascii="Times New Roman" w:cs="Times New Roman" w:eastAsia="Times New Roman" w:hAnsi="Times New Roman"/>
-        </w:rPr>
-      </w:r>
     </w:p>
     <w:p>
       <w:pPr>
@@ -489,28 +357,6 @@
         </w:rPr>
         <w:t xml:space="preserve">Fenomena terorisme yang berkembang di dunia internasional saat ini tidak dapat dipisahkan dari adanya wacana yang dibentuk untuk membangun pemahaman bersama terkait terorisme. Rainer Hülsse dan Alexander Spencer menjelaskan bahwa terorisme dihasilkan dari konstruksi sosial. Mereka lebih lanjut menyatakan bahwa realitas terkait terorisme merupakan hasil dari pembentukan wacana oleh musuh para teroris, yang kemudian membentuk motivasi, strategi, serta struktur organisasi dan tujuan para aktor teroris itu sendiri. Sebagai ilustrasi, konstruksi “metafora” Al-Qaeda oleh pers populer Jerman setelah serangan teroris di New York dan Washington pada tahun 2001, Madrid pada tahun 2004, dan London pada tahun 2005 dapat digunakan untuk memahami pendekatan ini. Kasus-kasus tersebut awalnya dimaknai sebagai bentuk “perang” antar aktor dalam lingkup dunia internasional. Namun, sejak tahun 2004 dan seterusnya, wacana yang berkembang menggeser makna serangan Al-Qaeda dari bentuk perang menjadi tindakan kriminal. Hal ini berdampak pada pembangunan makna tentang Al-Qaeda sebagai sebuah institusi kriminal yang kini dikenal sebagai lembaga teroris. Pergeseran ini juga telah mengubah pandangan terhadap Al-Qaeda dari ancaman eksternal menjadi ancaman internal, yang mensyaratkan pergeseran praktik kontra-terorisme dari perang antar militer ke respons instrumen yudisial (Hülsse &amp; Spencer, 2008).</w:t>
       </w:r>
-      <w:r>
-        <w:rPr>
-          <w:color w:val="000000"/>
-          <w:sz w:val="24"/>
-          <w:szCs w:val="24"/>
-          <w:rFonts w:ascii="Times New Roman" w:cs="Times New Roman" w:eastAsia="Times New Roman" w:hAnsi="Times New Roman"/>
-        </w:rPr>
-      </w:r>
-      <w:r>
-        <w:rPr>
-          <w:rStyle w:val="FootnoteReference"/>
-        </w:rPr>
-        <w:footnoteReference w:id="7"/>
-      </w:r>
-      <w:r>
-        <w:rPr>
-          <w:color w:val="000000"/>
-          <w:sz w:val="24"/>
-          <w:szCs w:val="24"/>
-          <w:rFonts w:ascii="Times New Roman" w:cs="Times New Roman" w:eastAsia="Times New Roman" w:hAnsi="Times New Roman"/>
-        </w:rPr>
-      </w:r>
     </w:p>
     <w:p>
       <w:pPr>
@@ -527,28 +373,6 @@
         </w:rPr>
         <w:t xml:space="preserve">Sementara itu, dinamika perkembangan terkait isu terorisme di Indonesia sebenarnya sudah ada sejak usia negara Indonesia sendiri. Artinya, sejak Indonesia merdeka pada tahun 1945, sudah ada gerakan-gerakan yang dapat dimasukkan ke dalam kategori konsep terorisme secara terminologi. Bahkan, perjuangan kemerdekaan Indonesia bisa jadi bagi pemerintah kolonial Belanda dikategorikan sebagai aksi teror dengan landasan nasionalis. Peristiwa-peristiwa yang masuk dalam kategori tindakan teror sudah ada jauh sebelum Indonesia memiliki instrumen hukum tentang anti-terorisme. Misalnya, kasus Pemberontakan PKI Madiun (1948), Pemberontakan oleh DII/TII di Jawa Barat (1949), Angkatan Perang Ratu Adil (APRA) pada tahun 1950, Republik Maluku Selatan (1950), Pemberontakan DI/TII Sulawesi Selatan (1952), Pemberontakan DI/TII Aceh (1953), Organisasi Papua Merdeka (1960-an), PRRI/PERMESTA (1958), Pemberontakan PKI (1965), dan Pemberontakan Fretelin di Timor-Timur (1975) (Muradi, 2012). Namun, peristiwa-peristiwa tersebut dipersepsikan sebagai kelompok gerakan pemberontakan oleh pemerintah Indonesia. Indonesia pada waktu itu belum memiliki instrumen hukum yang khusus untuk memaknai kelompok-kelompok tersebut sebagai kelompok teroris.</w:t>
       </w:r>
-      <w:r>
-        <w:rPr>
-          <w:color w:val="000000"/>
-          <w:sz w:val="24"/>
-          <w:szCs w:val="24"/>
-          <w:rFonts w:ascii="Times New Roman" w:cs="Times New Roman" w:eastAsia="Times New Roman" w:hAnsi="Times New Roman"/>
-        </w:rPr>
-      </w:r>
-      <w:r>
-        <w:rPr>
-          <w:rStyle w:val="FootnoteReference"/>
-        </w:rPr>
-        <w:footnoteReference w:id="8"/>
-      </w:r>
-      <w:r>
-        <w:rPr>
-          <w:color w:val="000000"/>
-          <w:sz w:val="24"/>
-          <w:szCs w:val="24"/>
-          <w:rFonts w:ascii="Times New Roman" w:cs="Times New Roman" w:eastAsia="Times New Roman" w:hAnsi="Times New Roman"/>
-        </w:rPr>
-      </w:r>
     </w:p>
     <w:p>
       <w:pPr>
@@ -565,28 +389,6 @@
         </w:rPr>
         <w:t xml:space="preserve">Baru pada tahun 2000-an, isu terorisme dianggap sebagai ancaman nasional. Pada waktu itu, aksi teror yang muncul lebih banyak dilandasi alasan tuntutan untuk merdeka atau landasan ideologi, yang dianggap oleh pemerintah Indonesia sebagai tindakan pemberontakan dalam negeri yang mengancam keamanan nasional, bukan sebagai tindakan terorisme yang dilakukan oleh jaringan terorisme internasional seperti yang terjadi saat ini.</w:t>
       </w:r>
-      <w:r>
-        <w:rPr>
-          <w:color w:val="000000"/>
-          <w:sz w:val="24"/>
-          <w:szCs w:val="24"/>
-          <w:rFonts w:ascii="Times New Roman" w:cs="Times New Roman" w:eastAsia="Times New Roman" w:hAnsi="Times New Roman"/>
-        </w:rPr>
-      </w:r>
-      <w:r>
-        <w:rPr>
-          <w:rStyle w:val="FootnoteReference"/>
-        </w:rPr>
-        <w:footnoteReference w:id="9"/>
-      </w:r>
-      <w:r>
-        <w:rPr>
-          <w:color w:val="000000"/>
-          <w:sz w:val="24"/>
-          <w:szCs w:val="24"/>
-          <w:rFonts w:ascii="Times New Roman" w:cs="Times New Roman" w:eastAsia="Times New Roman" w:hAnsi="Times New Roman"/>
-        </w:rPr>
-      </w:r>
     </w:p>
     <w:p>
       <w:pPr>
@@ -603,35 +405,13 @@
         </w:rPr>
         <w:t xml:space="preserve">Dari penjelasan di atas tentang terorisme dan apabila kita bandingkan dengan hakikat dari jihad sangatlah berbeda. dimana Jihad terambil dari kata juhd/jahd yang berarti antara lain kesulitan dan kemampuan. Dari sini lahir istilah “ijithad” yang bermakna mengerahkan kemampuan dalam menyelesaikan kesulitan, biasanya identik dengan kegiatan berfikir. Dari kata ini juga lahir “mujahadah” yang identik dengan pergulatan batin dalam melawan hawa nafsu. Kata jihad dalam al-Qur’an diartikan dalam beberapa makna antara lain:</w:t>
       </w:r>
-      <w:r>
-        <w:rPr>
-          <w:color w:val="000000"/>
-          <w:sz w:val="24"/>
-          <w:szCs w:val="24"/>
-          <w:rFonts w:ascii="Times New Roman" w:cs="Times New Roman" w:eastAsia="Times New Roman" w:hAnsi="Times New Roman"/>
-        </w:rPr>
-      </w:r>
-      <w:r>
-        <w:rPr>
-          <w:rStyle w:val="FootnoteReference"/>
-        </w:rPr>
-        <w:footnoteReference w:id="10"/>
-      </w:r>
-      <w:r>
-        <w:rPr>
-          <w:color w:val="000000"/>
-          <w:sz w:val="24"/>
-          <w:szCs w:val="24"/>
-          <w:rFonts w:ascii="Times New Roman" w:cs="Times New Roman" w:eastAsia="Times New Roman" w:hAnsi="Times New Roman"/>
-        </w:rPr>
-      </w:r>
     </w:p>
     <w:p>
       <w:pPr>
         <w:pStyle w:val="normal"/>
         <w:numPr>
           <w:ilvl w:val="1"/>
-          <w:numId w:val="59"/>
+          <w:numId w:val="8"/>
         </w:numPr>
         <w:spacing w:line="360"/>
         <w:ind w:left="566" w:hanging="277" w:firstLine="277"/>
@@ -652,7 +432,7 @@
         <w:pStyle w:val="normal"/>
         <w:numPr>
           <w:ilvl w:val="1"/>
-          <w:numId w:val="59"/>
+          <w:numId w:val="8"/>
         </w:numPr>
         <w:spacing w:line="360"/>
         <w:ind w:left="566" w:hanging="277" w:firstLine="277"/>
@@ -673,7 +453,7 @@
         <w:pStyle w:val="normal"/>
         <w:numPr>
           <w:ilvl w:val="1"/>
-          <w:numId w:val="59"/>
+          <w:numId w:val="8"/>
         </w:numPr>
         <w:spacing w:line="360"/>
         <w:ind w:left="566" w:hanging="277" w:firstLine="277"/>
@@ -710,7 +490,7 @@
         <w:pStyle w:val="normal"/>
         <w:numPr>
           <w:ilvl w:val="1"/>
-          <w:numId w:val="59"/>
+          <w:numId w:val="8"/>
         </w:numPr>
         <w:spacing w:line="360"/>
         <w:ind w:left="566" w:hanging="277" w:firstLine="277"/>
@@ -731,7 +511,7 @@
         <w:pStyle w:val="normal"/>
         <w:numPr>
           <w:ilvl w:val="1"/>
-          <w:numId w:val="59"/>
+          <w:numId w:val="8"/>
         </w:numPr>
         <w:spacing w:line="360"/>
         <w:ind w:left="566" w:hanging="277" w:firstLine="277"/>
@@ -768,7 +548,7 @@
         <w:pStyle w:val="normal"/>
         <w:numPr>
           <w:ilvl w:val="1"/>
-          <w:numId w:val="59"/>
+          <w:numId w:val="8"/>
         </w:numPr>
         <w:spacing w:line="360"/>
         <w:ind w:left="566" w:hanging="277" w:firstLine="277"/>
@@ -789,7 +569,7 @@
         <w:pStyle w:val="normal"/>
         <w:numPr>
           <w:ilvl w:val="1"/>
-          <w:numId w:val="59"/>
+          <w:numId w:val="8"/>
         </w:numPr>
         <w:spacing w:line="360"/>
         <w:ind w:left="566" w:hanging="277" w:firstLine="277"/>
@@ -810,7 +590,7 @@
         <w:pStyle w:val="normal"/>
         <w:numPr>
           <w:ilvl w:val="1"/>
-          <w:numId w:val="59"/>
+          <w:numId w:val="8"/>
         </w:numPr>
         <w:spacing w:line="360"/>
         <w:ind w:left="566" w:hanging="277" w:firstLine="277"/>
@@ -841,28 +621,6 @@
         </w:rPr>
         <w:t xml:space="preserve">Konteks perang dalam tata aturan Islam hanya diperkenankan membunuh terhadap mereka yang ikut berperang atau menyerang. Sebaliknya, meskipun mereka itu sehat, masih muda dan kuat, terlebih lagi jika mereka orang yang sakit, tua renta, buta, dan terlantar, maka tidak boleh dibunuh sepanjang mereka tidak ikut berperang. Perang dalam Islam dibolehkan dengan beberapa alasan. Pertama, jika pihak lawan menyerang lebih dahulu. Kedua, pihak lawan mengkhianati perjanjian dan kesepakatan bersama.</w:t>
       </w:r>
-      <w:r>
-        <w:rPr>
-          <w:color w:val="000000"/>
-          <w:sz w:val="24"/>
-          <w:szCs w:val="24"/>
-          <w:rFonts w:ascii="Times New Roman" w:cs="Times New Roman" w:eastAsia="Times New Roman" w:hAnsi="Times New Roman"/>
-        </w:rPr>
-      </w:r>
-      <w:r>
-        <w:rPr>
-          <w:rStyle w:val="FootnoteReference"/>
-        </w:rPr>
-        <w:footnoteReference w:id="11"/>
-      </w:r>
-      <w:r>
-        <w:rPr>
-          <w:color w:val="000000"/>
-          <w:sz w:val="24"/>
-          <w:szCs w:val="24"/>
-          <w:rFonts w:ascii="Times New Roman" w:cs="Times New Roman" w:eastAsia="Times New Roman" w:hAnsi="Times New Roman"/>
-        </w:rPr>
-      </w:r>
     </w:p>
     <w:p>
       <w:pPr>
@@ -879,28 +637,6 @@
         </w:rPr>
         <w:t xml:space="preserve">Jika melihat realitas sejarah perang dalam Islam, ternyata yang melatarbelakangi terjadinya perang berawal dari penindasan yang dialami oleh kaum muslimin sepeninggal Nabi hijrah ke Madinah yang amat memilukan. Penyiksaan bahkan pembunuhan dilakukan oleh Quraisy Makkah terhadap umat Islam. Kebencian itu terus berlanjut hingga pada upaya menghancurkan dan merusak tatanan masyarakat madani yang dibangun oleh Nabi Muhammad di Yathrib (Madinah). Suasana itu mengantar turunnya perintah jihad melalui perang, seperti yang tersebut dalam QS. Al-Hajj: 39:</w:t>
       </w:r>
-      <w:r>
-        <w:rPr>
-          <w:color w:val="000000"/>
-          <w:sz w:val="24"/>
-          <w:szCs w:val="24"/>
-          <w:rFonts w:ascii="Times New Roman" w:cs="Times New Roman" w:eastAsia="Times New Roman" w:hAnsi="Times New Roman"/>
-        </w:rPr>
-      </w:r>
-      <w:r>
-        <w:rPr>
-          <w:rStyle w:val="FootnoteReference"/>
-        </w:rPr>
-        <w:footnoteReference w:id="12"/>
-      </w:r>
-      <w:r>
-        <w:rPr>
-          <w:color w:val="000000"/>
-          <w:sz w:val="24"/>
-          <w:szCs w:val="24"/>
-          <w:rFonts w:ascii="Times New Roman" w:cs="Times New Roman" w:eastAsia="Times New Roman" w:hAnsi="Times New Roman"/>
-        </w:rPr>
-      </w:r>
     </w:p>
     <w:p>
       <w:pPr>
@@ -933,28 +669,6 @@
         </w:rPr>
         <w:t xml:space="preserve">Para ulama sependapat bahwa ayat di atas adalah ayat pertama yang memberi izin kepada umat Muslim untuk mengangkat senjata guna melindungi diri mereka. Ayat ini meletakkan dasar-dasar yang menjadi pedoman bagi umat Muslim dalam melakukan perang defensif. Ayat kemudian memperkuat legalisasi perang secara defensif dengan menjaga pranata sosial dan ibadah dengan tidak merusak secara membabi buta seperti yang disebut dalam QS. Al-Hajj: 40:</w:t>
       </w:r>
-      <w:r>
-        <w:rPr>
-          <w:color w:val="000000"/>
-          <w:sz w:val="24"/>
-          <w:szCs w:val="24"/>
-          <w:rFonts w:ascii="Times New Roman" w:cs="Times New Roman" w:eastAsia="Times New Roman" w:hAnsi="Times New Roman"/>
-        </w:rPr>
-      </w:r>
-      <w:r>
-        <w:rPr>
-          <w:rStyle w:val="FootnoteReference"/>
-        </w:rPr>
-        <w:footnoteReference w:id="13"/>
-      </w:r>
-      <w:r>
-        <w:rPr>
-          <w:color w:val="000000"/>
-          <w:sz w:val="24"/>
-          <w:szCs w:val="24"/>
-          <w:rFonts w:ascii="Times New Roman" w:cs="Times New Roman" w:eastAsia="Times New Roman" w:hAnsi="Times New Roman"/>
-        </w:rPr>
-      </w:r>
     </w:p>
     <w:p>
       <w:pPr>
@@ -1003,28 +717,6 @@
         </w:rPr>
         <w:t xml:space="preserve">Tindakan yang semena-mena dilakukan oleh Quraisy Makkah mendorong Nabi Muhammad saw bersama komunitas yang sudah kuat memasuki kota Makkah. Bayangan perang yang amat dahsyat atau pembalasan yang dilakukan oleh umat Islam segera muncul di benak orang ketika itu. Namun yang terjadi tidak seperti apa yang mereka prediksikan. Mereka mengira akan mendapat perlakuan balas dendam seperti kasus perlakuan saudara-saudara Nabi Yusuf. Namun Nabi Muhammad ternyata memaafkan dan melepaskan mereka dari hukuman. Bayangan orang Quraisy akan pembalasan yang dilakukan Muhammad ternyata berbeda dengan fakta. Pernyataan Nabi “antum thulaqa” artinya kalian bebas tanpa syarat, membuat orang-orang Quraisy simpatik terhadap Muhammad. Nabi Muhammad dan para sahabat sekalipun dalam keadaan kuat tidak pernah memaksakan ideologi Islam kepada kafir Quraisy. Beberapa ayat yang menjadi dasar antara lain:</w:t>
       </w:r>
-      <w:r>
-        <w:rPr>
-          <w:color w:val="000000"/>
-          <w:sz w:val="24"/>
-          <w:szCs w:val="24"/>
-          <w:rFonts w:ascii="Times New Roman" w:cs="Times New Roman" w:eastAsia="Times New Roman" w:hAnsi="Times New Roman"/>
-        </w:rPr>
-      </w:r>
-      <w:r>
-        <w:rPr>
-          <w:rStyle w:val="FootnoteReference"/>
-        </w:rPr>
-        <w:footnoteReference w:id="14"/>
-      </w:r>
-      <w:r>
-        <w:rPr>
-          <w:color w:val="000000"/>
-          <w:sz w:val="24"/>
-          <w:szCs w:val="24"/>
-          <w:rFonts w:ascii="Times New Roman" w:cs="Times New Roman" w:eastAsia="Times New Roman" w:hAnsi="Times New Roman"/>
-        </w:rPr>
-      </w:r>
     </w:p>
     <w:p>
       <w:pPr>
@@ -1089,28 +781,6 @@
         </w:rPr>
         <w:t xml:space="preserve">dapun tindakan teror yang dilakukan oleh sebagian orang terutama yang melakukannya di negara Indonesia ini adalah tindakan yang tidak dapat diterima dan tidak dapat dilegitimasi oleh ayat maupun hadis. Tindakan teror dengan mengatasnamakan agama sesungguhnya mencederai kemurnian agama yang menjunjung tinggi nilai-nilai kemanusiaan. Orang luar yang mengklaim Islam sebagai agama teror dan orang yang menganggap dirinya muslim tapi mengklaim tindakan terornya benar, sesungguhnya mereka tidak memahami esensi Islam dan mengabaikan banyak ayat dan hadis yang menjelaskan tentang nilai-nilai kerahmatan, toleransi, dan keadilan tanpa melihat jenis, suku, dan agama orang. Dalam analisis penulis, tindakan teror bertentangan dengan beberapa hal:</w:t>
       </w:r>
-      <w:r>
-        <w:rPr>
-          <w:color w:val="000000"/>
-          <w:sz w:val="24"/>
-          <w:szCs w:val="24"/>
-          <w:rFonts w:ascii="Times New Roman" w:cs="Times New Roman" w:eastAsia="Times New Roman" w:hAnsi="Times New Roman"/>
-        </w:rPr>
-      </w:r>
-      <w:r>
-        <w:rPr>
-          <w:rStyle w:val="FootnoteReference"/>
-        </w:rPr>
-        <w:footnoteReference w:id="15"/>
-      </w:r>
-      <w:r>
-        <w:rPr>
-          <w:color w:val="000000"/>
-          <w:sz w:val="24"/>
-          <w:szCs w:val="24"/>
-          <w:rFonts w:ascii="Times New Roman" w:cs="Times New Roman" w:eastAsia="Times New Roman" w:hAnsi="Times New Roman"/>
-        </w:rPr>
-      </w:r>
     </w:p>
     <w:p>
       <w:pPr>
@@ -1229,7 +899,7 @@
         <w:pStyle w:val="bold"/>
         <w:numPr>
           <w:ilvl w:val="0"/>
-          <w:numId w:val="58"/>
+          <w:numId w:val="7"/>
         </w:numPr>
         <w:spacing w:line="360"/>
         <w:ind w:left="283" w:hanging="272" w:firstLine="0"/>
@@ -1260,28 +930,6 @@
         </w:rPr>
         <w:t xml:space="preserve">Kata "bom" berasal dari bahasa Yunani βόμβος (bombos), istilah yang meniru suara ledakan "bom" dalam bahasa tersebut. Dalam Kamus Besar Bahasa Indonesia, bom diartikan sebagai senjata peledak atau peluru besar yang mampu meledak. Bunuh diri, dikenal sebagai suicide dalam bahasa Inggris dan harakiri dalam budaya Jepang, adalah tindakan mengakhiri hidup sendiri tanpa bantuan aktif orang lain. Bom bunuh diri merujuk pada tindakan seseorang yang menggunakan alat peledak untuk memenuhi ambisinya dengan cara bunuh diri. Biasanya, tindakan ini terjadi dalam situasi perang di mana seseorang merasa tidak memiliki pilihan lain untuk mengalahkan musuhnya. Bom sendiri adalah alat yang menghasilkan ledakan besar dan cepat, yang dapat menyebabkan kerusakan serius terhadap benda mati maupun hidup di sekitarnya.</w:t>
       </w:r>
-      <w:r>
-        <w:rPr>
-          <w:color w:val="000000"/>
-          <w:sz w:val="24"/>
-          <w:szCs w:val="24"/>
-          <w:rFonts w:ascii="Times New Roman" w:cs="Times New Roman" w:eastAsia="Times New Roman" w:hAnsi="Times New Roman"/>
-        </w:rPr>
-      </w:r>
-      <w:r>
-        <w:rPr>
-          <w:rStyle w:val="FootnoteReference"/>
-        </w:rPr>
-        <w:footnoteReference w:id="16"/>
-      </w:r>
-      <w:r>
-        <w:rPr>
-          <w:color w:val="000000"/>
-          <w:sz w:val="24"/>
-          <w:szCs w:val="24"/>
-          <w:rFonts w:ascii="Times New Roman" w:cs="Times New Roman" w:eastAsia="Times New Roman" w:hAnsi="Times New Roman"/>
-        </w:rPr>
-      </w:r>
     </w:p>
     <w:p>
       <w:pPr>
@@ -1298,28 +946,6 @@
         </w:rPr>
         <w:t xml:space="preserve">Menurut Nawaf Hail Takruri, bom bunuh diri atau dikenal juga sebagai bom manusia adalah ketika seorang mujahid mengisi tas atau mobilnya dengan bahan peledak, atau melilitkan bahan peledak pada tubuhnya, kemudian menyerang musuh di tempat mereka berkumpul, dengan risiko besar bahwa pelaku sendiri juga ikut terbunuh. Muhammad Tha’mah Al-Qadah mendefinisikan bom bunuh diri sebagai tindakan seorang mujahid yang mengorbankan hidupnya untuk melaksanakan tugas berat, dengan kemungkinan besar tidak selamat, tetapi diyakini memberikan manfaat besar bagi kaum Muslimin. Bom bunuh diri adalah bentuk perjuangan keyakinan bagi pelakunya, yang dianggap sebagai upaya untuk memperjuangkan kebenaran. Dalam bahasa Arab, bom bunuh diri dikenal sebagai intihaar, berasal dari kata kerja nahara yang artinya menyembelih dan membunuh diri sendiri.</w:t>
       </w:r>
-      <w:r>
-        <w:rPr>
-          <w:color w:val="000000"/>
-          <w:sz w:val="24"/>
-          <w:szCs w:val="24"/>
-          <w:rFonts w:ascii="Times New Roman" w:cs="Times New Roman" w:eastAsia="Times New Roman" w:hAnsi="Times New Roman"/>
-        </w:rPr>
-      </w:r>
-      <w:r>
-        <w:rPr>
-          <w:rStyle w:val="FootnoteReference"/>
-        </w:rPr>
-        <w:footnoteReference w:id="17"/>
-      </w:r>
-      <w:r>
-        <w:rPr>
-          <w:color w:val="000000"/>
-          <w:sz w:val="24"/>
-          <w:szCs w:val="24"/>
-          <w:rFonts w:ascii="Times New Roman" w:cs="Times New Roman" w:eastAsia="Times New Roman" w:hAnsi="Times New Roman"/>
-        </w:rPr>
-      </w:r>
     </w:p>
     <w:p>
       <w:pPr>
@@ -1336,28 +962,6 @@
         </w:rPr>
         <w:t xml:space="preserve">Istilah fundamentalisme dan radikalisme sering kali dicampuradukkan dengan terorisme dan bom bunuh diri, dan tidak jarang terorisme selalu dikaitkan dengan gerakan-gerakan Islam. Dalam wacana yang dikembangkan oleh dunia Barat dan sekutunya, terdapat pandangan bahwa Islam adalah yang paling mendukung terhadap tindakan terorisme. Namun, tindakan seperti perilaku terror atau bom bunuh diri yang dilakukan oleh mereka yang mengaku membela Islam, seharusnya dilihat kembali secara kasuistis. Sebagai contoh, peristiwa bom Bali pada 12 Oktober 2002, yang menewaskan 182 orang, sebagian besar warga negara asing, serta melukai ratusan lainnya, menandai fase baru dalam gerakan terorisme yang sering kali diberi label keagamaan. Tindakan ini seringkali berwajah keras, memaksa, merusak peradaban, dan bertentangan dengan martabat dan harkat manusia yang seharusnya menghargai keselamatan, kedamaian, dan kesejahteraan.</w:t>
       </w:r>
-      <w:r>
-        <w:rPr>
-          <w:color w:val="000000"/>
-          <w:sz w:val="24"/>
-          <w:szCs w:val="24"/>
-          <w:rFonts w:ascii="Times New Roman" w:cs="Times New Roman" w:eastAsia="Times New Roman" w:hAnsi="Times New Roman"/>
-        </w:rPr>
-      </w:r>
-      <w:r>
-        <w:rPr>
-          <w:rStyle w:val="FootnoteReference"/>
-        </w:rPr>
-        <w:footnoteReference w:id="18"/>
-      </w:r>
-      <w:r>
-        <w:rPr>
-          <w:color w:val="000000"/>
-          <w:sz w:val="24"/>
-          <w:szCs w:val="24"/>
-          <w:rFonts w:ascii="Times New Roman" w:cs="Times New Roman" w:eastAsia="Times New Roman" w:hAnsi="Times New Roman"/>
-        </w:rPr>
-      </w:r>
     </w:p>
     <w:p>
       <w:pPr>
@@ -1374,28 +978,6 @@
         </w:rPr>
         <w:t xml:space="preserve">Menurut Azumardi Azra, penyebab terorisme sering kali dipengaruhi oleh pemahaman yang salah tentang konsep jihad, yang sering disalahartikan sebagai perang suci untuk melawan orang kafir. Ada pandangan bahwa sistem pemerintahan di Indonesia tidak sesuai dengan pandangan mereka, yang menganggap bahwa hukum politik, fikih, dan syariah tidak boleh dipisahkan dari negara. Pimpinan negara harus patuh pada hukum Islam yang menetapkan cita-cita Islam sebagai satu-satunya hukum perang bagi mereka yang tidak mengikutinya. Ideologi Jihad menjadi semakin kentara dalam gerakan sosial Islam setelah tragedi 11 September. Peristiwa bom Bali 1 pada 12 Oktober 2002 sering dikaitkan dengan tragedi ini. Peristiwa bom Bali tidak hanya mencoreng nama Bali sebagai kawasan yang aman bagi masyarakat internasional, tetapi juga telah mengikutkan Indonesia sebagai sasaran perang global dalam terorisme, nama organisasi JI yang dikenal sebagai Jariangan Al-Qaeda di Asia Tenggara sangat diperbincangkan saat ini, dan menjadi awal perkenalan kalangan radikal yang masuk ke Indonesia. Bentuk penegakan hukum Islam diambil karena pemahaman agama yang radikal, dimana kekerasan atas nama agama sering di kaitkan dengan radikalisme agama.</w:t>
       </w:r>
-      <w:r>
-        <w:rPr>
-          <w:color w:val="000000"/>
-          <w:sz w:val="24"/>
-          <w:szCs w:val="24"/>
-          <w:rFonts w:ascii="Times New Roman" w:cs="Times New Roman" w:eastAsia="Times New Roman" w:hAnsi="Times New Roman"/>
-        </w:rPr>
-      </w:r>
-      <w:r>
-        <w:rPr>
-          <w:rStyle w:val="FootnoteReference"/>
-        </w:rPr>
-        <w:footnoteReference w:id="19"/>
-      </w:r>
-      <w:r>
-        <w:rPr>
-          <w:color w:val="000000"/>
-          <w:sz w:val="24"/>
-          <w:szCs w:val="24"/>
-          <w:rFonts w:ascii="Times New Roman" w:cs="Times New Roman" w:eastAsia="Times New Roman" w:hAnsi="Times New Roman"/>
-        </w:rPr>
-      </w:r>
     </w:p>
     <w:p>
       <w:pPr>
@@ -1418,7 +1000,7 @@
         <w:pStyle w:val="bold"/>
         <w:numPr>
           <w:ilvl w:val="0"/>
-          <w:numId w:val="58"/>
+          <w:numId w:val="7"/>
         </w:numPr>
         <w:spacing w:line="360"/>
         <w:ind w:left="283" w:hanging="272" w:firstLine="0"/>
@@ -1439,7 +1021,7 @@
         <w:pStyle w:val="normal"/>
         <w:numPr>
           <w:ilvl w:val="1"/>
-          <w:numId w:val="59"/>
+          <w:numId w:val="8"/>
         </w:numPr>
         <w:spacing w:line="360"/>
         <w:ind w:left="566" w:hanging="277" w:firstLine="277"/>
@@ -1470,28 +1052,6 @@
         </w:rPr>
         <w:t xml:space="preserve">Yusuf al-Qaradawi mengeluarkan fatwa bahwa beliau menegaskan bom bunuh diri dipandang sebagai salah satu bentuk jihad yang paling agung di jalan Allah, dengan melakukan teror terhadap musuh yang disyariatkan dalam Surat Al-Anfal ayat 60. Berdasarkan pernyataan ini, tindakan bom bunuh diri yang dilakukan oleh pemuda Palestina dalam menghadapi tentara Israel dipandang sebagai bentuk jihad yang mulia, bahkan dikategorikan sebagai pencarian syahid (‘amaliyah al-istisyhad) oleh al-Qaradawi. Motivasi agama merupakan faktor kuat bagi Muslim Palestina yang melakukan tindakan ini, dengan tujuan untuk menggentarkan musuh dan menimbulkan ketakutan di kalangan mereka.</w:t>
       </w:r>
-      <w:r>
-        <w:rPr>
-          <w:color w:val="000000"/>
-          <w:sz w:val="24"/>
-          <w:szCs w:val="24"/>
-          <w:rFonts w:ascii="Times New Roman" w:cs="Times New Roman" w:eastAsia="Times New Roman" w:hAnsi="Times New Roman"/>
-        </w:rPr>
-      </w:r>
-      <w:r>
-        <w:rPr>
-          <w:rStyle w:val="FootnoteReference"/>
-        </w:rPr>
-        <w:footnoteReference w:id="20"/>
-      </w:r>
-      <w:r>
-        <w:rPr>
-          <w:color w:val="000000"/>
-          <w:sz w:val="24"/>
-          <w:szCs w:val="24"/>
-          <w:rFonts w:ascii="Times New Roman" w:cs="Times New Roman" w:eastAsia="Times New Roman" w:hAnsi="Times New Roman"/>
-        </w:rPr>
-      </w:r>
     </w:p>
     <w:p>
       <w:pPr>
@@ -1508,28 +1068,6 @@
         </w:rPr>
         <w:t xml:space="preserve">Fatwa ini dikeluarkan oleh Yusuf al-Qaradhawi karena banyaknya pertanyaan mengenai tindakan bom bunuh diri yang terjadi di al-Quds Palestina, Tel Aviv, dan Asqalan, yang menyebabkan banyak korban jiwa di kalangan orang Israel. Pertanyaannya adalah apakah tindakan para pemuda yang mengorbankan nyawa mereka dengan cara ini dianggap sebagai syuhada (mati syahid) atau sebagai tindakan bunuh diri (al-intihar) karena mereka mati di tangan mereka sendiri? Apakah tindakan mereka termasuk kategori menceburkan diri ke dalam kebinasaan yang dilarang oleh Allah SWT dalam Al-Qur'an?.</w:t>
       </w:r>
-      <w:r>
-        <w:rPr>
-          <w:color w:val="000000"/>
-          <w:sz w:val="24"/>
-          <w:szCs w:val="24"/>
-          <w:rFonts w:ascii="Times New Roman" w:cs="Times New Roman" w:eastAsia="Times New Roman" w:hAnsi="Times New Roman"/>
-        </w:rPr>
-      </w:r>
-      <w:r>
-        <w:rPr>
-          <w:rStyle w:val="FootnoteReference"/>
-        </w:rPr>
-        <w:footnoteReference w:id="21"/>
-      </w:r>
-      <w:r>
-        <w:rPr>
-          <w:color w:val="000000"/>
-          <w:sz w:val="24"/>
-          <w:szCs w:val="24"/>
-          <w:rFonts w:ascii="Times New Roman" w:cs="Times New Roman" w:eastAsia="Times New Roman" w:hAnsi="Times New Roman"/>
-        </w:rPr>
-      </w:r>
     </w:p>
     <w:p>
       <w:pPr>
@@ -1546,28 +1084,6 @@
         </w:rPr>
         <w:t xml:space="preserve">Al-Qaradawi juga menjelaskan perbedaan antara bunuh diri (al-intihar) dan jihad (‘amaliyah al-istisyhad). Menurutnya, al-intihar dilakukan secara egois untuk kepentingan diri sendiri tanpa memprioritaskan kepentingan agama dan umat Islam, sementara al-mujahid (‘amaliyah al-istisyhad) dilakukan dengan harapan akan pertolongan dan rahmat Allah. Al-intihar merupakan bentuk pelarian dari kenyataan dengan cara bunuh diri, sedangkan al-mujahid (‘amaliyah al-istisyhad) adalah para pejuang yang memerangi musuh Allah dengan menggunakan teknologi atau senjata terbaru, seperti bom bunuh diri, yang ditakdirkan digunakan oleh mereka yang lemah menghadapi musuh yang kuat.</w:t>
       </w:r>
-      <w:r>
-        <w:rPr>
-          <w:color w:val="000000"/>
-          <w:sz w:val="24"/>
-          <w:szCs w:val="24"/>
-          <w:rFonts w:ascii="Times New Roman" w:cs="Times New Roman" w:eastAsia="Times New Roman" w:hAnsi="Times New Roman"/>
-        </w:rPr>
-      </w:r>
-      <w:r>
-        <w:rPr>
-          <w:rStyle w:val="FootnoteReference"/>
-        </w:rPr>
-        <w:footnoteReference w:id="22"/>
-      </w:r>
-      <w:r>
-        <w:rPr>
-          <w:color w:val="000000"/>
-          <w:sz w:val="24"/>
-          <w:szCs w:val="24"/>
-          <w:rFonts w:ascii="Times New Roman" w:cs="Times New Roman" w:eastAsia="Times New Roman" w:hAnsi="Times New Roman"/>
-        </w:rPr>
-      </w:r>
     </w:p>
     <w:p>
       <w:pPr>
@@ -1590,7 +1106,7 @@
         <w:pStyle w:val="normal"/>
         <w:numPr>
           <w:ilvl w:val="1"/>
-          <w:numId w:val="59"/>
+          <w:numId w:val="8"/>
         </w:numPr>
         <w:spacing w:line="360"/>
         <w:ind w:left="566" w:hanging="277" w:firstLine="277"/>
@@ -1605,35 +1121,13 @@
         </w:rPr>
         <w:t xml:space="preserve">pandangan ulama yang mengharamkan</w:t>
       </w:r>
-      <w:r>
-        <w:rPr>
-          <w:color w:val="000000"/>
-          <w:sz w:val="24"/>
-          <w:szCs w:val="24"/>
-          <w:rFonts w:ascii="Times New Roman" w:cs="Times New Roman" w:eastAsia="Times New Roman" w:hAnsi="Times New Roman"/>
-        </w:rPr>
-      </w:r>
-      <w:r>
-        <w:rPr>
-          <w:rStyle w:val="FootnoteReference"/>
-        </w:rPr>
-        <w:footnoteReference w:id="23"/>
-      </w:r>
-      <w:r>
-        <w:rPr>
-          <w:color w:val="000000"/>
-          <w:sz w:val="24"/>
-          <w:szCs w:val="24"/>
-          <w:rFonts w:ascii="Times New Roman" w:cs="Times New Roman" w:eastAsia="Times New Roman" w:hAnsi="Times New Roman"/>
-        </w:rPr>
-      </w:r>
     </w:p>
     <w:p>
       <w:pPr>
         <w:pStyle w:val="normal"/>
         <w:numPr>
           <w:ilvl w:val="2"/>
-          <w:numId w:val="60"/>
+          <w:numId w:val="9"/>
         </w:numPr>
         <w:spacing w:line="360"/>
         <w:ind w:left="850" w:hanging="283" w:firstLine="283"/>
@@ -1670,7 +1164,7 @@
         <w:pStyle w:val="normal"/>
         <w:numPr>
           <w:ilvl w:val="2"/>
-          <w:numId w:val="60"/>
+          <w:numId w:val="9"/>
         </w:numPr>
         <w:spacing w:line="360"/>
         <w:ind w:left="850" w:hanging="283" w:firstLine="283"/>
@@ -1707,7 +1201,7 @@
         <w:pStyle w:val="normal"/>
         <w:numPr>
           <w:ilvl w:val="2"/>
-          <w:numId w:val="60"/>
+          <w:numId w:val="9"/>
         </w:numPr>
         <w:spacing w:line="360"/>
         <w:ind w:left="850" w:hanging="283" w:firstLine="283"/>
@@ -1744,7 +1238,7 @@
         <w:pStyle w:val="normal"/>
         <w:numPr>
           <w:ilvl w:val="2"/>
-          <w:numId w:val="60"/>
+          <w:numId w:val="9"/>
         </w:numPr>
         <w:spacing w:line="360"/>
         <w:ind w:left="850" w:hanging="283" w:firstLine="283"/>
@@ -1781,7 +1275,7 @@
         <w:pStyle w:val="normal"/>
         <w:numPr>
           <w:ilvl w:val="2"/>
-          <w:numId w:val="60"/>
+          <w:numId w:val="9"/>
         </w:numPr>
         <w:spacing w:line="360"/>
         <w:ind w:left="850" w:hanging="283" w:firstLine="283"/>
@@ -1818,7 +1312,7 @@
         <w:pStyle w:val="normal"/>
         <w:numPr>
           <w:ilvl w:val="1"/>
-          <w:numId w:val="59"/>
+          <w:numId w:val="8"/>
         </w:numPr>
         <w:spacing w:line="360"/>
         <w:ind w:left="566" w:hanging="277" w:firstLine="277"/>
@@ -1833,35 +1327,13 @@
         </w:rPr>
         <w:t xml:space="preserve">daftar para ulama yang membolehkan dan mengharamkan</w:t>
       </w:r>
-      <w:r>
-        <w:rPr>
-          <w:color w:val="000000"/>
-          <w:sz w:val="24"/>
-          <w:szCs w:val="24"/>
-          <w:rFonts w:ascii="Times New Roman" w:cs="Times New Roman" w:eastAsia="Times New Roman" w:hAnsi="Times New Roman"/>
-        </w:rPr>
-      </w:r>
-      <w:r>
-        <w:rPr>
-          <w:rStyle w:val="FootnoteReference"/>
-        </w:rPr>
-        <w:footnoteReference w:id="24"/>
-      </w:r>
-      <w:r>
-        <w:rPr>
-          <w:color w:val="000000"/>
-          <w:sz w:val="24"/>
-          <w:szCs w:val="24"/>
-          <w:rFonts w:ascii="Times New Roman" w:cs="Times New Roman" w:eastAsia="Times New Roman" w:hAnsi="Times New Roman"/>
-        </w:rPr>
-      </w:r>
     </w:p>
     <w:p>
       <w:pPr>
         <w:pStyle w:val="normal"/>
         <w:numPr>
           <w:ilvl w:val="2"/>
-          <w:numId w:val="60"/>
+          <w:numId w:val="9"/>
         </w:numPr>
         <w:spacing w:line="360"/>
         <w:ind w:left="850" w:hanging="283" w:firstLine="283"/>
@@ -1882,7 +1354,7 @@
         <w:pStyle w:val="normal"/>
         <w:numPr>
           <w:ilvl w:val="3"/>
-          <w:numId w:val="61"/>
+          <w:numId w:val="10"/>
         </w:numPr>
         <w:spacing w:line="360"/>
         <w:ind w:left="1133" w:hanging="283" w:firstLine="283"/>
@@ -1903,7 +1375,7 @@
         <w:pStyle w:val="normal"/>
         <w:numPr>
           <w:ilvl w:val="3"/>
-          <w:numId w:val="61"/>
+          <w:numId w:val="10"/>
         </w:numPr>
         <w:spacing w:line="360"/>
         <w:ind w:left="1133" w:hanging="283" w:firstLine="283"/>
@@ -1924,7 +1396,7 @@
         <w:pStyle w:val="normal"/>
         <w:numPr>
           <w:ilvl w:val="3"/>
-          <w:numId w:val="61"/>
+          <w:numId w:val="10"/>
         </w:numPr>
         <w:spacing w:line="360"/>
         <w:ind w:left="1133" w:hanging="283" w:firstLine="283"/>
@@ -1945,7 +1417,7 @@
         <w:pStyle w:val="normal"/>
         <w:numPr>
           <w:ilvl w:val="3"/>
-          <w:numId w:val="61"/>
+          <w:numId w:val="10"/>
         </w:numPr>
         <w:spacing w:line="360"/>
         <w:ind w:left="1133" w:hanging="283" w:firstLine="283"/>
@@ -1966,7 +1438,7 @@
         <w:pStyle w:val="normal"/>
         <w:numPr>
           <w:ilvl w:val="3"/>
-          <w:numId w:val="61"/>
+          <w:numId w:val="10"/>
         </w:numPr>
         <w:spacing w:line="360"/>
         <w:ind w:left="1133" w:hanging="283" w:firstLine="283"/>
@@ -1987,7 +1459,7 @@
         <w:pStyle w:val="normal"/>
         <w:numPr>
           <w:ilvl w:val="3"/>
-          <w:numId w:val="61"/>
+          <w:numId w:val="10"/>
         </w:numPr>
         <w:spacing w:line="360"/>
         <w:ind w:left="1133" w:hanging="283" w:firstLine="283"/>
@@ -2008,7 +1480,7 @@
         <w:pStyle w:val="normal"/>
         <w:numPr>
           <w:ilvl w:val="3"/>
-          <w:numId w:val="61"/>
+          <w:numId w:val="10"/>
         </w:numPr>
         <w:spacing w:line="360"/>
         <w:ind w:left="1133" w:hanging="283" w:firstLine="283"/>
@@ -2029,7 +1501,7 @@
         <w:pStyle w:val="normal"/>
         <w:numPr>
           <w:ilvl w:val="3"/>
-          <w:numId w:val="61"/>
+          <w:numId w:val="10"/>
         </w:numPr>
         <w:spacing w:line="360"/>
         <w:ind w:left="1133" w:hanging="283" w:firstLine="283"/>
@@ -2050,7 +1522,7 @@
         <w:pStyle w:val="normal"/>
         <w:numPr>
           <w:ilvl w:val="3"/>
-          <w:numId w:val="61"/>
+          <w:numId w:val="10"/>
         </w:numPr>
         <w:spacing w:line="360"/>
         <w:ind w:left="1133" w:hanging="283" w:firstLine="283"/>
@@ -2167,7 +1639,7 @@
         <w:pStyle w:val="normal"/>
         <w:numPr>
           <w:ilvl w:val="2"/>
-          <w:numId w:val="60"/>
+          <w:numId w:val="9"/>
         </w:numPr>
         <w:spacing w:line="360"/>
         <w:ind w:left="850" w:hanging="283" w:firstLine="283"/>
@@ -2188,7 +1660,7 @@
         <w:pStyle w:val="normal"/>
         <w:numPr>
           <w:ilvl w:val="3"/>
-          <w:numId w:val="61"/>
+          <w:numId w:val="10"/>
         </w:numPr>
         <w:spacing w:line="360"/>
         <w:ind w:left="1133" w:hanging="283" w:firstLine="283"/>
@@ -2209,7 +1681,7 @@
         <w:pStyle w:val="normal"/>
         <w:numPr>
           <w:ilvl w:val="3"/>
-          <w:numId w:val="61"/>
+          <w:numId w:val="10"/>
         </w:numPr>
         <w:spacing w:line="360"/>
         <w:ind w:left="1133" w:hanging="283" w:firstLine="283"/>
@@ -2230,7 +1702,7 @@
         <w:pStyle w:val="normal"/>
         <w:numPr>
           <w:ilvl w:val="3"/>
-          <w:numId w:val="61"/>
+          <w:numId w:val="10"/>
         </w:numPr>
         <w:spacing w:line="360"/>
         <w:ind w:left="1133" w:hanging="283" w:firstLine="283"/>
@@ -2251,7 +1723,7 @@
         <w:pStyle w:val="normal"/>
         <w:numPr>
           <w:ilvl w:val="3"/>
-          <w:numId w:val="61"/>
+          <w:numId w:val="10"/>
         </w:numPr>
         <w:spacing w:line="360"/>
         <w:ind w:left="1133" w:hanging="283" w:firstLine="283"/>
@@ -2272,7 +1744,7 @@
         <w:pStyle w:val="normal"/>
         <w:numPr>
           <w:ilvl w:val="3"/>
-          <w:numId w:val="61"/>
+          <w:numId w:val="10"/>
         </w:numPr>
         <w:spacing w:line="360"/>
         <w:ind w:left="1133" w:hanging="283" w:firstLine="283"/>
@@ -2381,258 +1853,6 @@
           <w:szCs w:val="24"/>
           <w:rFonts w:ascii="Times New Roman" w:cs="Times New Roman" w:eastAsia="Times New Roman" w:hAnsi="Times New Roman"/>
         </w:rPr>
-      </w:r>
-    </w:p>
-    <w:p>
-      <w:pPr>
-        <w:spacing w:line="360"/>
-        <w:ind w:left="555" w:hanging="527"/>
-        <w:jc w:val="both"/>
-      </w:pPr>
-      <w:r>
-        <w:rPr>
-          <w:color w:val="000000"/>
-          <w:sz w:val="24"/>
-          <w:szCs w:val="24"/>
-          <w:rFonts w:ascii="Times New Roman" w:cs="Times New Roman" w:eastAsia="Times New Roman" w:hAnsi="Times New Roman"/>
-        </w:rPr>
-        <w:t xml:space="preserve">Ahmad Thobroni. 2017. "Bom Bunuh Diri dan Eutanasia  dalam Tinjauan Hukum Islam". </w:t>
-      </w:r>
-      <w:r>
-        <w:rPr>
-          <w:i/>
-          <w:iCs/>
-          <w:color w:val="000000"/>
-          <w:sz w:val="24"/>
-          <w:szCs w:val="24"/>
-          <w:rFonts w:ascii="Times New Roman" w:cs="Times New Roman" w:eastAsia="Times New Roman" w:hAnsi="Times New Roman"/>
-        </w:rPr>
-        <w:t xml:space="preserve">Jurnal Studi dan Penelitian Hukum Islam, </w:t>
-      </w:r>
-      <w:r>
-        <w:rPr>
-          <w:color w:val="000000"/>
-          <w:sz w:val="24"/>
-          <w:szCs w:val="24"/>
-          <w:rFonts w:ascii="Times New Roman" w:cs="Times New Roman" w:eastAsia="Times New Roman" w:hAnsi="Times New Roman"/>
-        </w:rPr>
-        <w:t xml:space="preserve">Vol. 1, No. 1.</w:t>
-      </w:r>
-    </w:p>
-    <w:p>
-      <w:pPr>
-        <w:spacing w:line="360"/>
-        <w:ind w:left="555" w:hanging="527"/>
-        <w:jc w:val="both"/>
-      </w:pPr>
-      <w:r>
-        <w:rPr>
-          <w:color w:val="000000"/>
-          <w:sz w:val="24"/>
-          <w:szCs w:val="24"/>
-          <w:rFonts w:ascii="Times New Roman" w:cs="Times New Roman" w:eastAsia="Times New Roman" w:hAnsi="Times New Roman"/>
-        </w:rPr>
-        <w:t xml:space="preserve">Muhammad Mustofa . 2002. "Memahami Terorisme:  Suatu Perspektif Kriminologi ". </w:t>
-      </w:r>
-      <w:r>
-        <w:rPr>
-          <w:i/>
-          <w:iCs/>
-          <w:color w:val="000000"/>
-          <w:sz w:val="24"/>
-          <w:szCs w:val="24"/>
-          <w:rFonts w:ascii="Times New Roman" w:cs="Times New Roman" w:eastAsia="Times New Roman" w:hAnsi="Times New Roman"/>
-        </w:rPr>
-        <w:t xml:space="preserve">Jurnal Kriminologi Indonesia, </w:t>
-      </w:r>
-      <w:r>
-        <w:rPr>
-          <w:color w:val="000000"/>
-          <w:sz w:val="24"/>
-          <w:szCs w:val="24"/>
-          <w:rFonts w:ascii="Times New Roman" w:cs="Times New Roman" w:eastAsia="Times New Roman" w:hAnsi="Times New Roman"/>
-        </w:rPr>
-        <w:t xml:space="preserve">Vol. 2, No. 3.</w:t>
-      </w:r>
-    </w:p>
-    <w:p>
-      <w:pPr>
-        <w:spacing w:line="360"/>
-        <w:ind w:left="555" w:hanging="527"/>
-        <w:jc w:val="both"/>
-      </w:pPr>
-      <w:r>
-        <w:rPr>
-          <w:color w:val="000000"/>
-          <w:sz w:val="24"/>
-          <w:szCs w:val="24"/>
-          <w:rFonts w:ascii="Times New Roman" w:cs="Times New Roman" w:eastAsia="Times New Roman" w:hAnsi="Times New Roman"/>
-        </w:rPr>
-        <w:t xml:space="preserve">Muhammad Mustofa . 2019. "Indonesia Dan Ancaman Terorisme: Dalam Analisis Dimensi Imaterial". </w:t>
-      </w:r>
-      <w:r>
-        <w:rPr>
-          <w:i/>
-          <w:iCs/>
-          <w:color w:val="000000"/>
-          <w:sz w:val="24"/>
-          <w:szCs w:val="24"/>
-          <w:rFonts w:ascii="Times New Roman" w:cs="Times New Roman" w:eastAsia="Times New Roman" w:hAnsi="Times New Roman"/>
-        </w:rPr>
-        <w:t xml:space="preserve">Sosiohumaniora, </w:t>
-      </w:r>
-      <w:r>
-        <w:rPr>
-          <w:color w:val="000000"/>
-          <w:sz w:val="24"/>
-          <w:szCs w:val="24"/>
-          <w:rFonts w:ascii="Times New Roman" w:cs="Times New Roman" w:eastAsia="Times New Roman" w:hAnsi="Times New Roman"/>
-        </w:rPr>
-        <w:t xml:space="preserve">Vol. 21, No. 3.</w:t>
-      </w:r>
-    </w:p>
-    <w:p>
-      <w:pPr>
-        <w:spacing w:line="360"/>
-        <w:ind w:left="555" w:hanging="527"/>
-        <w:jc w:val="both"/>
-      </w:pPr>
-      <w:r>
-        <w:rPr>
-          <w:color w:val="000000"/>
-          <w:sz w:val="24"/>
-          <w:szCs w:val="24"/>
-          <w:rFonts w:ascii="Times New Roman" w:cs="Times New Roman" w:eastAsia="Times New Roman" w:hAnsi="Times New Roman"/>
-        </w:rPr>
-        <w:t xml:space="preserve">Busyro. 2016. "Bom bunuh diri dalam fatwa kontemporer Yusuf al-Qaradawi dan relevansinya dengan maqasid al-Shari’ah". </w:t>
-      </w:r>
-      <w:r>
-        <w:rPr>
-          <w:i/>
-          <w:iCs/>
-          <w:color w:val="000000"/>
-          <w:sz w:val="24"/>
-          <w:szCs w:val="24"/>
-          <w:rFonts w:ascii="Times New Roman" w:cs="Times New Roman" w:eastAsia="Times New Roman" w:hAnsi="Times New Roman"/>
-        </w:rPr>
-        <w:t xml:space="preserve">Jurnal Wacana Hukum Islam dan Kemanusiaan, </w:t>
-      </w:r>
-      <w:r>
-        <w:rPr>
-          <w:color w:val="000000"/>
-          <w:sz w:val="24"/>
-          <w:szCs w:val="24"/>
-          <w:rFonts w:ascii="Times New Roman" w:cs="Times New Roman" w:eastAsia="Times New Roman" w:hAnsi="Times New Roman"/>
-        </w:rPr>
-        <w:t xml:space="preserve">Vol. 16, No. 1.</w:t>
-      </w:r>
-    </w:p>
-    <w:p>
-      <w:pPr>
-        <w:spacing w:line="360"/>
-        <w:ind w:left="555" w:hanging="527"/>
-        <w:jc w:val="both"/>
-      </w:pPr>
-      <w:r>
-        <w:rPr>
-          <w:color w:val="000000"/>
-          <w:sz w:val="24"/>
-          <w:szCs w:val="24"/>
-          <w:rFonts w:ascii="Times New Roman" w:cs="Times New Roman" w:eastAsia="Times New Roman" w:hAnsi="Times New Roman"/>
-        </w:rPr>
-        <w:t xml:space="preserve">Amri Rahman. 2018. "Memahami Jihad Dalam Perspektif Islam (Upaya Menangkal Tuduhan Terorisme Dalam Islam) ". </w:t>
-      </w:r>
-      <w:r>
-        <w:rPr>
-          <w:i/>
-          <w:iCs/>
-          <w:color w:val="000000"/>
-          <w:sz w:val="24"/>
-          <w:szCs w:val="24"/>
-          <w:rFonts w:ascii="Times New Roman" w:cs="Times New Roman" w:eastAsia="Times New Roman" w:hAnsi="Times New Roman"/>
-        </w:rPr>
-        <w:t xml:space="preserve"> Jurnal Pendidikan Agama Islam, </w:t>
-      </w:r>
-      <w:r>
-        <w:rPr>
-          <w:color w:val="000000"/>
-          <w:sz w:val="24"/>
-          <w:szCs w:val="24"/>
-          <w:rFonts w:ascii="Times New Roman" w:cs="Times New Roman" w:eastAsia="Times New Roman" w:hAnsi="Times New Roman"/>
-        </w:rPr>
-        <w:t xml:space="preserve">Vol. 4, No. 2.</w:t>
-      </w:r>
-    </w:p>
-    <w:p>
-      <w:pPr>
-        <w:spacing w:line="360"/>
-        <w:ind w:left="555" w:hanging="527"/>
-        <w:jc w:val="both"/>
-      </w:pPr>
-      <w:r>
-        <w:rPr>
-          <w:color w:val="000000"/>
-          <w:sz w:val="24"/>
-          <w:szCs w:val="24"/>
-          <w:rFonts w:ascii="Times New Roman" w:cs="Times New Roman" w:eastAsia="Times New Roman" w:hAnsi="Times New Roman"/>
-        </w:rPr>
-        <w:t xml:space="preserve">Herlina Nurani dan Ahmad Ali Nurdin. 2018. "Pandangan Keagmaan Pelaku Bom Bunuh Diri DI Indonesia". </w:t>
-      </w:r>
-      <w:r>
-        <w:rPr>
-          <w:i/>
-          <w:iCs/>
-          <w:color w:val="000000"/>
-          <w:sz w:val="24"/>
-          <w:szCs w:val="24"/>
-          <w:rFonts w:ascii="Times New Roman" w:cs="Times New Roman" w:eastAsia="Times New Roman" w:hAnsi="Times New Roman"/>
-        </w:rPr>
-        <w:t xml:space="preserve">Journal of Islamic Studies and Humanitites, </w:t>
-      </w:r>
-      <w:r>
-        <w:rPr>
-          <w:color w:val="000000"/>
-          <w:sz w:val="24"/>
-          <w:szCs w:val="24"/>
-          <w:rFonts w:ascii="Times New Roman" w:cs="Times New Roman" w:eastAsia="Times New Roman" w:hAnsi="Times New Roman"/>
-        </w:rPr>
-        <w:t xml:space="preserve">Vol. 3, No. 1.</w:t>
-      </w:r>
-    </w:p>
-    <w:p>
-      <w:pPr>
-        <w:spacing w:line="360"/>
-        <w:ind w:left="555" w:hanging="527"/>
-        <w:jc w:val="both"/>
-      </w:pPr>
-      <w:r>
-        <w:rPr>
-          <w:color w:val="000000"/>
-          <w:sz w:val="24"/>
-          <w:szCs w:val="24"/>
-          <w:rFonts w:ascii="Times New Roman" w:cs="Times New Roman" w:eastAsia="Times New Roman" w:hAnsi="Times New Roman"/>
-        </w:rPr>
-        <w:t xml:space="preserve"> Abdul Wahid Haddade, dkk. 2017. </w:t>
-      </w:r>
-      <w:r>
-        <w:rPr>
-          <w:i/>
-          <w:iCs/>
-          <w:color w:val="000000"/>
-          <w:sz w:val="24"/>
-          <w:szCs w:val="24"/>
-          <w:rFonts w:ascii="Times New Roman" w:cs="Times New Roman" w:eastAsia="Times New Roman" w:hAnsi="Times New Roman"/>
-        </w:rPr>
-        <w:t xml:space="preserve">Jihad Dalam Islam Kedamaian Atau Kekerasan. </w:t>
-      </w:r>
-      <w:r>
-        <w:rPr>
-          <w:color w:val="000000"/>
-          <w:sz w:val="24"/>
-          <w:szCs w:val="24"/>
-          <w:rFonts w:ascii="Times New Roman" w:cs="Times New Roman" w:eastAsia="Times New Roman" w:hAnsi="Times New Roman"/>
-        </w:rPr>
-        <w:t xml:space="preserve"> Yogyakarta:  Lembaga Ladang Kata.</w:t>
       </w:r>
     </w:p>
     <w:sectPr>
@@ -2736,873 +1956,12 @@
       </w:r>
     </w:p>
   </w:footnote>
-  <w:footnote w:id="1">
-    <w:p>
-      <w:pPr>
-        <w:spacing w:line="240"/>
-        <w:ind w:left="0" w:firstLine="272"/>
-        <w:jc w:val="both"/>
-      </w:pPr>
-      <w:r>
-        <w:rPr>
-          <w:rStyle w:val="FootnoteReference"/>
-        </w:rPr>
-        <w:footnoteRef/>
-      </w:r>
-      <w:r>
-        <w:rPr>
-          <w:color w:val="000000"/>
-          <w:sz w:val="20"/>
-          <w:szCs w:val="20"/>
-          <w:rFonts w:ascii="Times New Roman" w:cs="Times New Roman" w:eastAsia="Times New Roman" w:hAnsi="Times New Roman"/>
-        </w:rPr>
-        <w:t xml:space="preserve"> Abdul Wahid Haddade, dkk, </w:t>
-      </w:r>
-      <w:r>
-        <w:rPr>
-          <w:i/>
-          <w:iCs/>
-          <w:color w:val="000000"/>
-          <w:sz w:val="20"/>
-          <w:szCs w:val="20"/>
-          <w:rFonts w:ascii="Times New Roman" w:cs="Times New Roman" w:eastAsia="Times New Roman" w:hAnsi="Times New Roman"/>
-        </w:rPr>
-        <w:t xml:space="preserve">Jihad Dalam Islam Kedamaian Atau Kekerasan, </w:t>
-      </w:r>
-      <w:r>
-        <w:rPr>
-          <w:color w:val="000000"/>
-          <w:sz w:val="20"/>
-          <w:szCs w:val="20"/>
-          <w:rFonts w:ascii="Times New Roman" w:cs="Times New Roman" w:eastAsia="Times New Roman" w:hAnsi="Times New Roman"/>
-        </w:rPr>
-        <w:t xml:space="preserve">(Yogyakarta:  Lembaga Ladang Kata, 2017), Hal. 1-173.</w:t>
-      </w:r>
-    </w:p>
-  </w:footnote>
-  <w:footnote w:id="2">
-    <w:p>
-      <w:pPr>
-        <w:spacing w:line="240"/>
-        <w:ind w:left="0" w:firstLine="272"/>
-        <w:jc w:val="both"/>
-      </w:pPr>
-      <w:r>
-        <w:rPr>
-          <w:rStyle w:val="FootnoteReference"/>
-        </w:rPr>
-        <w:footnoteRef/>
-      </w:r>
-      <w:r>
-        <w:rPr>
-          <w:color w:val="000000"/>
-          <w:sz w:val="20"/>
-          <w:szCs w:val="20"/>
-          <w:rFonts w:ascii="Times New Roman" w:cs="Times New Roman" w:eastAsia="Times New Roman" w:hAnsi="Times New Roman"/>
-        </w:rPr>
-        <w:t xml:space="preserve">Amri Rahman, "Memahami Jihad Dalam Perspektif Islam (Upaya Menangkal Tuduhan Terorisme Dalam Islam) ", </w:t>
-      </w:r>
-      <w:r>
-        <w:rPr>
-          <w:i/>
-          <w:iCs/>
-          <w:color w:val="000000"/>
-          <w:sz w:val="20"/>
-          <w:szCs w:val="20"/>
-          <w:rFonts w:ascii="Times New Roman" w:cs="Times New Roman" w:eastAsia="Times New Roman" w:hAnsi="Times New Roman"/>
-        </w:rPr>
-        <w:t xml:space="preserve"> Jurnal Pendidikan Agama Islam, </w:t>
-      </w:r>
-      <w:r>
-        <w:rPr>
-          <w:color w:val="000000"/>
-          <w:sz w:val="20"/>
-          <w:szCs w:val="20"/>
-          <w:rFonts w:ascii="Times New Roman" w:cs="Times New Roman" w:eastAsia="Times New Roman" w:hAnsi="Times New Roman"/>
-        </w:rPr>
-        <w:t xml:space="preserve">Vol. 4, No. 2 (2018), Hal. 142-156.</w:t>
-      </w:r>
-    </w:p>
-  </w:footnote>
-  <w:footnote w:id="3">
-    <w:p>
-      <w:pPr>
-        <w:spacing w:line="240"/>
-        <w:ind w:left="0" w:firstLine="272"/>
-        <w:jc w:val="both"/>
-      </w:pPr>
-      <w:r>
-        <w:rPr>
-          <w:rStyle w:val="FootnoteReference"/>
-        </w:rPr>
-        <w:footnoteRef/>
-      </w:r>
-      <w:r>
-        <w:rPr>
-          <w:color w:val="000000"/>
-          <w:sz w:val="20"/>
-          <w:szCs w:val="20"/>
-          <w:rFonts w:ascii="Times New Roman" w:cs="Times New Roman" w:eastAsia="Times New Roman" w:hAnsi="Times New Roman"/>
-        </w:rPr>
-        <w:t xml:space="preserve">Ibid.,</w:t>
-      </w:r>
-      <w:r>
-        <w:rPr>
-          <w:color w:val="000000"/>
-          <w:sz w:val="20"/>
-          <w:szCs w:val="20"/>
-          <w:rFonts w:ascii="Times New Roman" w:cs="Times New Roman" w:eastAsia="Times New Roman" w:hAnsi="Times New Roman"/>
-        </w:rPr>
-      </w:r>
-    </w:p>
-  </w:footnote>
-  <w:footnote w:id="4">
-    <w:p>
-      <w:pPr>
-        <w:spacing w:line="240"/>
-        <w:ind w:left="0" w:firstLine="272"/>
-        <w:jc w:val="both"/>
-      </w:pPr>
-      <w:r>
-        <w:rPr>
-          <w:rStyle w:val="FootnoteReference"/>
-        </w:rPr>
-        <w:footnoteRef/>
-      </w:r>
-      <w:r>
-        <w:rPr>
-          <w:color w:val="000000"/>
-          <w:sz w:val="20"/>
-          <w:szCs w:val="20"/>
-          <w:rFonts w:ascii="Times New Roman" w:cs="Times New Roman" w:eastAsia="Times New Roman" w:hAnsi="Times New Roman"/>
-        </w:rPr>
-        <w:t xml:space="preserve">Ibid.,</w:t>
-      </w:r>
-      <w:r>
-        <w:rPr>
-          <w:color w:val="000000"/>
-          <w:sz w:val="20"/>
-          <w:szCs w:val="20"/>
-          <w:rFonts w:ascii="Times New Roman" w:cs="Times New Roman" w:eastAsia="Times New Roman" w:hAnsi="Times New Roman"/>
-        </w:rPr>
-      </w:r>
-    </w:p>
-  </w:footnote>
-  <w:footnote w:id="5">
-    <w:p>
-      <w:pPr>
-        <w:spacing w:line="240"/>
-        <w:ind w:left="0" w:firstLine="272"/>
-        <w:jc w:val="both"/>
-      </w:pPr>
-      <w:r>
-        <w:rPr>
-          <w:rStyle w:val="FootnoteReference"/>
-        </w:rPr>
-        <w:footnoteRef/>
-      </w:r>
-      <w:r>
-        <w:rPr>
-          <w:color w:val="000000"/>
-          <w:sz w:val="20"/>
-          <w:szCs w:val="20"/>
-          <w:rFonts w:ascii="Times New Roman" w:cs="Times New Roman" w:eastAsia="Times New Roman" w:hAnsi="Times New Roman"/>
-        </w:rPr>
-        <w:t xml:space="preserve">Ibid.,</w:t>
-      </w:r>
-      <w:r>
-        <w:rPr>
-          <w:color w:val="000000"/>
-          <w:sz w:val="20"/>
-          <w:szCs w:val="20"/>
-          <w:rFonts w:ascii="Times New Roman" w:cs="Times New Roman" w:eastAsia="Times New Roman" w:hAnsi="Times New Roman"/>
-        </w:rPr>
-      </w:r>
-    </w:p>
-  </w:footnote>
-  <w:footnote w:id="6">
-    <w:p>
-      <w:pPr>
-        <w:spacing w:line="240"/>
-        <w:ind w:left="0" w:firstLine="272"/>
-        <w:jc w:val="both"/>
-      </w:pPr>
-      <w:r>
-        <w:rPr>
-          <w:rStyle w:val="FootnoteReference"/>
-        </w:rPr>
-        <w:footnoteRef/>
-      </w:r>
-      <w:r>
-        <w:rPr>
-          <w:color w:val="000000"/>
-          <w:sz w:val="20"/>
-          <w:szCs w:val="20"/>
-          <w:rFonts w:ascii="Times New Roman" w:cs="Times New Roman" w:eastAsia="Times New Roman" w:hAnsi="Times New Roman"/>
-        </w:rPr>
-        <w:t xml:space="preserve">Muhammad Mustofa , "Memahami Terorisme:  Suatu Perspektif Kriminologi ", </w:t>
-      </w:r>
-      <w:r>
-        <w:rPr>
-          <w:i/>
-          <w:iCs/>
-          <w:color w:val="000000"/>
-          <w:sz w:val="20"/>
-          <w:szCs w:val="20"/>
-          <w:rFonts w:ascii="Times New Roman" w:cs="Times New Roman" w:eastAsia="Times New Roman" w:hAnsi="Times New Roman"/>
-        </w:rPr>
-        <w:t xml:space="preserve">Jurnal Kriminologi Indonesia, </w:t>
-      </w:r>
-      <w:r>
-        <w:rPr>
-          <w:color w:val="000000"/>
-          <w:sz w:val="20"/>
-          <w:szCs w:val="20"/>
-          <w:rFonts w:ascii="Times New Roman" w:cs="Times New Roman" w:eastAsia="Times New Roman" w:hAnsi="Times New Roman"/>
-        </w:rPr>
-        <w:t xml:space="preserve">Vol. 2, No. 3 (2002), Hal. 30-38.</w:t>
-      </w:r>
-    </w:p>
-  </w:footnote>
-  <w:footnote w:id="7">
-    <w:p>
-      <w:pPr>
-        <w:spacing w:line="240"/>
-        <w:ind w:left="0" w:firstLine="272"/>
-        <w:jc w:val="both"/>
-      </w:pPr>
-      <w:r>
-        <w:rPr>
-          <w:rStyle w:val="FootnoteReference"/>
-        </w:rPr>
-        <w:footnoteRef/>
-      </w:r>
-      <w:r>
-        <w:rPr>
-          <w:color w:val="000000"/>
-          <w:sz w:val="20"/>
-          <w:szCs w:val="20"/>
-          <w:rFonts w:ascii="Times New Roman" w:cs="Times New Roman" w:eastAsia="Times New Roman" w:hAnsi="Times New Roman"/>
-        </w:rPr>
-        <w:t xml:space="preserve">Muhammad Mustofa , "Indonesia Dan Ancaman Terorisme: Dalam Analisis Dimensi Imaterial", </w:t>
-      </w:r>
-      <w:r>
-        <w:rPr>
-          <w:i/>
-          <w:iCs/>
-          <w:color w:val="000000"/>
-          <w:sz w:val="20"/>
-          <w:szCs w:val="20"/>
-          <w:rFonts w:ascii="Times New Roman" w:cs="Times New Roman" w:eastAsia="Times New Roman" w:hAnsi="Times New Roman"/>
-        </w:rPr>
-        <w:t xml:space="preserve">Sosiohumaniora, </w:t>
-      </w:r>
-      <w:r>
-        <w:rPr>
-          <w:color w:val="000000"/>
-          <w:sz w:val="20"/>
-          <w:szCs w:val="20"/>
-          <w:rFonts w:ascii="Times New Roman" w:cs="Times New Roman" w:eastAsia="Times New Roman" w:hAnsi="Times New Roman"/>
-        </w:rPr>
-        <w:t xml:space="preserve">Vol. 21, No. 3 (2019), Hal. 334-339.</w:t>
-      </w:r>
-    </w:p>
-  </w:footnote>
-  <w:footnote w:id="8">
-    <w:p>
-      <w:pPr>
-        <w:spacing w:line="240"/>
-        <w:ind w:left="0" w:firstLine="272"/>
-        <w:jc w:val="both"/>
-      </w:pPr>
-      <w:r>
-        <w:rPr>
-          <w:rStyle w:val="FootnoteReference"/>
-        </w:rPr>
-        <w:footnoteRef/>
-      </w:r>
-      <w:r>
-        <w:rPr>
-          <w:color w:val="000000"/>
-          <w:sz w:val="20"/>
-          <w:szCs w:val="20"/>
-          <w:rFonts w:ascii="Times New Roman" w:cs="Times New Roman" w:eastAsia="Times New Roman" w:hAnsi="Times New Roman"/>
-        </w:rPr>
-        <w:t xml:space="preserve">Ibid.,</w:t>
-      </w:r>
-      <w:r>
-        <w:rPr>
-          <w:color w:val="000000"/>
-          <w:sz w:val="20"/>
-          <w:szCs w:val="20"/>
-          <w:rFonts w:ascii="Times New Roman" w:cs="Times New Roman" w:eastAsia="Times New Roman" w:hAnsi="Times New Roman"/>
-        </w:rPr>
-      </w:r>
-    </w:p>
-  </w:footnote>
-  <w:footnote w:id="9">
-    <w:p>
-      <w:pPr>
-        <w:spacing w:line="240"/>
-        <w:ind w:left="0" w:firstLine="272"/>
-        <w:jc w:val="both"/>
-      </w:pPr>
-      <w:r>
-        <w:rPr>
-          <w:rStyle w:val="FootnoteReference"/>
-        </w:rPr>
-        <w:footnoteRef/>
-      </w:r>
-      <w:r>
-        <w:rPr>
-          <w:color w:val="000000"/>
-          <w:sz w:val="20"/>
-          <w:szCs w:val="20"/>
-          <w:rFonts w:ascii="Times New Roman" w:cs="Times New Roman" w:eastAsia="Times New Roman" w:hAnsi="Times New Roman"/>
-        </w:rPr>
-        <w:t xml:space="preserve">Ibid.,</w:t>
-      </w:r>
-      <w:r>
-        <w:rPr>
-          <w:color w:val="000000"/>
-          <w:sz w:val="20"/>
-          <w:szCs w:val="20"/>
-          <w:rFonts w:ascii="Times New Roman" w:cs="Times New Roman" w:eastAsia="Times New Roman" w:hAnsi="Times New Roman"/>
-        </w:rPr>
-      </w:r>
-    </w:p>
-  </w:footnote>
-  <w:footnote w:id="10">
-    <w:p>
-      <w:pPr>
-        <w:spacing w:line="240"/>
-        <w:ind w:left="0" w:firstLine="272"/>
-        <w:jc w:val="both"/>
-      </w:pPr>
-      <w:r>
-        <w:rPr>
-          <w:rStyle w:val="FootnoteReference"/>
-        </w:rPr>
-        <w:footnoteRef/>
-      </w:r>
-      <w:r>
-        <w:rPr>
-          <w:color w:val="000000"/>
-          <w:sz w:val="20"/>
-          <w:szCs w:val="20"/>
-          <w:rFonts w:ascii="Times New Roman" w:cs="Times New Roman" w:eastAsia="Times New Roman" w:hAnsi="Times New Roman"/>
-        </w:rPr>
-        <w:t xml:space="preserve"> Abdul Wahid Haddade, dkk, </w:t>
-      </w:r>
-      <w:r>
-        <w:rPr>
-          <w:i/>
-          <w:iCs/>
-          <w:color w:val="000000"/>
-          <w:sz w:val="20"/>
-          <w:szCs w:val="20"/>
-          <w:rFonts w:ascii="Times New Roman" w:cs="Times New Roman" w:eastAsia="Times New Roman" w:hAnsi="Times New Roman"/>
-        </w:rPr>
-        <w:t xml:space="preserve">Loc.Cit., </w:t>
-      </w:r>
-    </w:p>
-  </w:footnote>
-  <w:footnote w:id="11">
-    <w:p>
-      <w:pPr>
-        <w:spacing w:line="240"/>
-        <w:ind w:left="0" w:firstLine="272"/>
-        <w:jc w:val="both"/>
-      </w:pPr>
-      <w:r>
-        <w:rPr>
-          <w:rStyle w:val="FootnoteReference"/>
-        </w:rPr>
-        <w:footnoteRef/>
-      </w:r>
-      <w:r>
-        <w:rPr>
-          <w:color w:val="000000"/>
-          <w:sz w:val="20"/>
-          <w:szCs w:val="20"/>
-          <w:rFonts w:ascii="Times New Roman" w:cs="Times New Roman" w:eastAsia="Times New Roman" w:hAnsi="Times New Roman"/>
-        </w:rPr>
-        <w:t xml:space="preserve">Ibid.,</w:t>
-      </w:r>
-      <w:r>
-        <w:rPr>
-          <w:color w:val="000000"/>
-          <w:sz w:val="20"/>
-          <w:szCs w:val="20"/>
-          <w:rFonts w:ascii="Times New Roman" w:cs="Times New Roman" w:eastAsia="Times New Roman" w:hAnsi="Times New Roman"/>
-        </w:rPr>
-      </w:r>
-    </w:p>
-  </w:footnote>
-  <w:footnote w:id="12">
-    <w:p>
-      <w:pPr>
-        <w:spacing w:line="240"/>
-        <w:ind w:left="0" w:firstLine="272"/>
-        <w:jc w:val="both"/>
-      </w:pPr>
-      <w:r>
-        <w:rPr>
-          <w:rStyle w:val="FootnoteReference"/>
-        </w:rPr>
-        <w:footnoteRef/>
-      </w:r>
-      <w:r>
-        <w:rPr>
-          <w:color w:val="000000"/>
-          <w:sz w:val="20"/>
-          <w:szCs w:val="20"/>
-          <w:rFonts w:ascii="Times New Roman" w:cs="Times New Roman" w:eastAsia="Times New Roman" w:hAnsi="Times New Roman"/>
-        </w:rPr>
-        <w:t xml:space="preserve">Ibid.,</w:t>
-      </w:r>
-      <w:r>
-        <w:rPr>
-          <w:color w:val="000000"/>
-          <w:sz w:val="20"/>
-          <w:szCs w:val="20"/>
-          <w:rFonts w:ascii="Times New Roman" w:cs="Times New Roman" w:eastAsia="Times New Roman" w:hAnsi="Times New Roman"/>
-        </w:rPr>
-      </w:r>
-    </w:p>
-  </w:footnote>
-  <w:footnote w:id="13">
-    <w:p>
-      <w:pPr>
-        <w:spacing w:line="240"/>
-        <w:ind w:left="0" w:firstLine="272"/>
-        <w:jc w:val="both"/>
-      </w:pPr>
-      <w:r>
-        <w:rPr>
-          <w:rStyle w:val="FootnoteReference"/>
-        </w:rPr>
-        <w:footnoteRef/>
-      </w:r>
-      <w:r>
-        <w:rPr>
-          <w:color w:val="000000"/>
-          <w:sz w:val="20"/>
-          <w:szCs w:val="20"/>
-          <w:rFonts w:ascii="Times New Roman" w:cs="Times New Roman" w:eastAsia="Times New Roman" w:hAnsi="Times New Roman"/>
-        </w:rPr>
-        <w:t xml:space="preserve">Ibid.,</w:t>
-      </w:r>
-      <w:r>
-        <w:rPr>
-          <w:color w:val="000000"/>
-          <w:sz w:val="20"/>
-          <w:szCs w:val="20"/>
-          <w:rFonts w:ascii="Times New Roman" w:cs="Times New Roman" w:eastAsia="Times New Roman" w:hAnsi="Times New Roman"/>
-        </w:rPr>
-      </w:r>
-    </w:p>
-  </w:footnote>
-  <w:footnote w:id="14">
-    <w:p>
-      <w:pPr>
-        <w:spacing w:line="240"/>
-        <w:ind w:left="0" w:firstLine="272"/>
-        <w:jc w:val="both"/>
-      </w:pPr>
-      <w:r>
-        <w:rPr>
-          <w:rStyle w:val="FootnoteReference"/>
-        </w:rPr>
-        <w:footnoteRef/>
-      </w:r>
-      <w:r>
-        <w:rPr>
-          <w:color w:val="000000"/>
-          <w:sz w:val="20"/>
-          <w:szCs w:val="20"/>
-          <w:rFonts w:ascii="Times New Roman" w:cs="Times New Roman" w:eastAsia="Times New Roman" w:hAnsi="Times New Roman"/>
-        </w:rPr>
-        <w:t xml:space="preserve">Ibid.,</w:t>
-      </w:r>
-      <w:r>
-        <w:rPr>
-          <w:color w:val="000000"/>
-          <w:sz w:val="20"/>
-          <w:szCs w:val="20"/>
-          <w:rFonts w:ascii="Times New Roman" w:cs="Times New Roman" w:eastAsia="Times New Roman" w:hAnsi="Times New Roman"/>
-        </w:rPr>
-      </w:r>
-    </w:p>
-  </w:footnote>
-  <w:footnote w:id="15">
-    <w:p>
-      <w:pPr>
-        <w:spacing w:line="240"/>
-        <w:ind w:left="0" w:firstLine="272"/>
-        <w:jc w:val="both"/>
-      </w:pPr>
-      <w:r>
-        <w:rPr>
-          <w:rStyle w:val="FootnoteReference"/>
-        </w:rPr>
-        <w:footnoteRef/>
-      </w:r>
-      <w:r>
-        <w:rPr>
-          <w:color w:val="000000"/>
-          <w:sz w:val="20"/>
-          <w:szCs w:val="20"/>
-          <w:rFonts w:ascii="Times New Roman" w:cs="Times New Roman" w:eastAsia="Times New Roman" w:hAnsi="Times New Roman"/>
-        </w:rPr>
-        <w:t xml:space="preserve">Ibid.,</w:t>
-      </w:r>
-      <w:r>
-        <w:rPr>
-          <w:color w:val="000000"/>
-          <w:sz w:val="20"/>
-          <w:szCs w:val="20"/>
-          <w:rFonts w:ascii="Times New Roman" w:cs="Times New Roman" w:eastAsia="Times New Roman" w:hAnsi="Times New Roman"/>
-        </w:rPr>
-      </w:r>
-    </w:p>
-  </w:footnote>
-  <w:footnote w:id="16">
-    <w:p>
-      <w:pPr>
-        <w:spacing w:line="240"/>
-        <w:ind w:left="0" w:firstLine="272"/>
-        <w:jc w:val="both"/>
-      </w:pPr>
-      <w:r>
-        <w:rPr>
-          <w:rStyle w:val="FootnoteReference"/>
-        </w:rPr>
-        <w:footnoteRef/>
-      </w:r>
-      <w:r>
-        <w:rPr>
-          <w:color w:val="000000"/>
-          <w:sz w:val="20"/>
-          <w:szCs w:val="20"/>
-          <w:rFonts w:ascii="Times New Roman" w:cs="Times New Roman" w:eastAsia="Times New Roman" w:hAnsi="Times New Roman"/>
-        </w:rPr>
-        <w:t xml:space="preserve">Ahmad Thobroni, "Bom Bunuh Diri dan Eutanasia  dalam Tinjauan Hukum Islam", </w:t>
-      </w:r>
-      <w:r>
-        <w:rPr>
-          <w:i/>
-          <w:iCs/>
-          <w:color w:val="000000"/>
-          <w:sz w:val="20"/>
-          <w:szCs w:val="20"/>
-          <w:rFonts w:ascii="Times New Roman" w:cs="Times New Roman" w:eastAsia="Times New Roman" w:hAnsi="Times New Roman"/>
-        </w:rPr>
-        <w:t xml:space="preserve">Jurnal Studi dan Penelitian Hukum Islam, </w:t>
-      </w:r>
-      <w:r>
-        <w:rPr>
-          <w:color w:val="000000"/>
-          <w:sz w:val="20"/>
-          <w:szCs w:val="20"/>
-          <w:rFonts w:ascii="Times New Roman" w:cs="Times New Roman" w:eastAsia="Times New Roman" w:hAnsi="Times New Roman"/>
-        </w:rPr>
-        <w:t xml:space="preserve">Vol. 1, No. 1 (2017), Hal. 135-150.</w:t>
-      </w:r>
-    </w:p>
-  </w:footnote>
-  <w:footnote w:id="17">
-    <w:p>
-      <w:pPr>
-        <w:spacing w:line="240"/>
-        <w:ind w:left="0" w:firstLine="272"/>
-        <w:jc w:val="both"/>
-      </w:pPr>
-      <w:r>
-        <w:rPr>
-          <w:rStyle w:val="FootnoteReference"/>
-        </w:rPr>
-        <w:footnoteRef/>
-      </w:r>
-      <w:r>
-        <w:rPr>
-          <w:color w:val="000000"/>
-          <w:sz w:val="20"/>
-          <w:szCs w:val="20"/>
-          <w:rFonts w:ascii="Times New Roman" w:cs="Times New Roman" w:eastAsia="Times New Roman" w:hAnsi="Times New Roman"/>
-        </w:rPr>
-        <w:t xml:space="preserve">Ibid.,</w:t>
-      </w:r>
-      <w:r>
-        <w:rPr>
-          <w:color w:val="000000"/>
-          <w:sz w:val="20"/>
-          <w:szCs w:val="20"/>
-          <w:rFonts w:ascii="Times New Roman" w:cs="Times New Roman" w:eastAsia="Times New Roman" w:hAnsi="Times New Roman"/>
-        </w:rPr>
-      </w:r>
-    </w:p>
-  </w:footnote>
-  <w:footnote w:id="18">
-    <w:p>
-      <w:pPr>
-        <w:spacing w:line="240"/>
-        <w:ind w:left="0" w:firstLine="272"/>
-        <w:jc w:val="both"/>
-      </w:pPr>
-      <w:r>
-        <w:rPr>
-          <w:rStyle w:val="FootnoteReference"/>
-        </w:rPr>
-        <w:footnoteRef/>
-      </w:r>
-      <w:r>
-        <w:rPr>
-          <w:color w:val="000000"/>
-          <w:sz w:val="20"/>
-          <w:szCs w:val="20"/>
-          <w:rFonts w:ascii="Times New Roman" w:cs="Times New Roman" w:eastAsia="Times New Roman" w:hAnsi="Times New Roman"/>
-        </w:rPr>
-        <w:t xml:space="preserve">Herlina Nurani dan Ahmad Ali Nurdin, "Pandangan Keagmaan Pelaku Bom Bunuh Diri DI Indonesia", </w:t>
-      </w:r>
-      <w:r>
-        <w:rPr>
-          <w:i/>
-          <w:iCs/>
-          <w:color w:val="000000"/>
-          <w:sz w:val="20"/>
-          <w:szCs w:val="20"/>
-          <w:rFonts w:ascii="Times New Roman" w:cs="Times New Roman" w:eastAsia="Times New Roman" w:hAnsi="Times New Roman"/>
-        </w:rPr>
-        <w:t xml:space="preserve">Journal of Islamic Studies and Humanitites, </w:t>
-      </w:r>
-      <w:r>
-        <w:rPr>
-          <w:color w:val="000000"/>
-          <w:sz w:val="20"/>
-          <w:szCs w:val="20"/>
-          <w:rFonts w:ascii="Times New Roman" w:cs="Times New Roman" w:eastAsia="Times New Roman" w:hAnsi="Times New Roman"/>
-        </w:rPr>
-        <w:t xml:space="preserve">Vol. 3, No. 1 (2018), Hal. 80-99.</w:t>
-      </w:r>
-    </w:p>
-  </w:footnote>
-  <w:footnote w:id="19">
-    <w:p>
-      <w:pPr>
-        <w:spacing w:line="240"/>
-        <w:ind w:left="0" w:firstLine="272"/>
-        <w:jc w:val="both"/>
-      </w:pPr>
-      <w:r>
-        <w:rPr>
-          <w:rStyle w:val="FootnoteReference"/>
-        </w:rPr>
-        <w:footnoteRef/>
-      </w:r>
-      <w:r>
-        <w:rPr>
-          <w:color w:val="000000"/>
-          <w:sz w:val="20"/>
-          <w:szCs w:val="20"/>
-          <w:rFonts w:ascii="Times New Roman" w:cs="Times New Roman" w:eastAsia="Times New Roman" w:hAnsi="Times New Roman"/>
-        </w:rPr>
-        <w:t xml:space="preserve">Ibid.,</w:t>
-      </w:r>
-      <w:r>
-        <w:rPr>
-          <w:color w:val="000000"/>
-          <w:sz w:val="20"/>
-          <w:szCs w:val="20"/>
-          <w:rFonts w:ascii="Times New Roman" w:cs="Times New Roman" w:eastAsia="Times New Roman" w:hAnsi="Times New Roman"/>
-        </w:rPr>
-      </w:r>
-    </w:p>
-  </w:footnote>
-  <w:footnote w:id="20">
-    <w:p>
-      <w:pPr>
-        <w:spacing w:line="240"/>
-        <w:ind w:left="0" w:firstLine="272"/>
-        <w:jc w:val="both"/>
-      </w:pPr>
-      <w:r>
-        <w:rPr>
-          <w:rStyle w:val="FootnoteReference"/>
-        </w:rPr>
-        <w:footnoteRef/>
-      </w:r>
-      <w:r>
-        <w:rPr>
-          <w:color w:val="000000"/>
-          <w:sz w:val="20"/>
-          <w:szCs w:val="20"/>
-          <w:rFonts w:ascii="Times New Roman" w:cs="Times New Roman" w:eastAsia="Times New Roman" w:hAnsi="Times New Roman"/>
-        </w:rPr>
-        <w:t xml:space="preserve">Busyro, "Bom bunuh diri dalam fatwa kontemporer Yusuf al-Qaradawi dan relevansinya dengan maqasid al-Shari’ah", </w:t>
-      </w:r>
-      <w:r>
-        <w:rPr>
-          <w:i/>
-          <w:iCs/>
-          <w:color w:val="000000"/>
-          <w:sz w:val="20"/>
-          <w:szCs w:val="20"/>
-          <w:rFonts w:ascii="Times New Roman" w:cs="Times New Roman" w:eastAsia="Times New Roman" w:hAnsi="Times New Roman"/>
-        </w:rPr>
-        <w:t xml:space="preserve">Jurnal Wacana Hukum Islam dan Kemanusiaan, </w:t>
-      </w:r>
-      <w:r>
-        <w:rPr>
-          <w:color w:val="000000"/>
-          <w:sz w:val="20"/>
-          <w:szCs w:val="20"/>
-          <w:rFonts w:ascii="Times New Roman" w:cs="Times New Roman" w:eastAsia="Times New Roman" w:hAnsi="Times New Roman"/>
-        </w:rPr>
-        <w:t xml:space="preserve">Vol. 16, No. 1 (2016), Hal. 85-103.</w:t>
-      </w:r>
-    </w:p>
-  </w:footnote>
-  <w:footnote w:id="21">
-    <w:p>
-      <w:pPr>
-        <w:spacing w:line="240"/>
-        <w:ind w:left="0" w:firstLine="272"/>
-        <w:jc w:val="both"/>
-      </w:pPr>
-      <w:r>
-        <w:rPr>
-          <w:rStyle w:val="FootnoteReference"/>
-        </w:rPr>
-        <w:footnoteRef/>
-      </w:r>
-      <w:r>
-        <w:rPr>
-          <w:color w:val="000000"/>
-          <w:sz w:val="20"/>
-          <w:szCs w:val="20"/>
-          <w:rFonts w:ascii="Times New Roman" w:cs="Times New Roman" w:eastAsia="Times New Roman" w:hAnsi="Times New Roman"/>
-        </w:rPr>
-        <w:t xml:space="preserve">Ibid.,</w:t>
-      </w:r>
-      <w:r>
-        <w:rPr>
-          <w:color w:val="000000"/>
-          <w:sz w:val="20"/>
-          <w:szCs w:val="20"/>
-          <w:rFonts w:ascii="Times New Roman" w:cs="Times New Roman" w:eastAsia="Times New Roman" w:hAnsi="Times New Roman"/>
-        </w:rPr>
-      </w:r>
-    </w:p>
-  </w:footnote>
-  <w:footnote w:id="22">
-    <w:p>
-      <w:pPr>
-        <w:spacing w:line="240"/>
-        <w:ind w:left="0" w:firstLine="272"/>
-        <w:jc w:val="both"/>
-      </w:pPr>
-      <w:r>
-        <w:rPr>
-          <w:rStyle w:val="FootnoteReference"/>
-        </w:rPr>
-        <w:footnoteRef/>
-      </w:r>
-      <w:r>
-        <w:rPr>
-          <w:color w:val="000000"/>
-          <w:sz w:val="20"/>
-          <w:szCs w:val="20"/>
-          <w:rFonts w:ascii="Times New Roman" w:cs="Times New Roman" w:eastAsia="Times New Roman" w:hAnsi="Times New Roman"/>
-        </w:rPr>
-        <w:t xml:space="preserve">Ibid.,</w:t>
-      </w:r>
-      <w:r>
-        <w:rPr>
-          <w:color w:val="000000"/>
-          <w:sz w:val="20"/>
-          <w:szCs w:val="20"/>
-          <w:rFonts w:ascii="Times New Roman" w:cs="Times New Roman" w:eastAsia="Times New Roman" w:hAnsi="Times New Roman"/>
-        </w:rPr>
-      </w:r>
-    </w:p>
-  </w:footnote>
-  <w:footnote w:id="23">
-    <w:p>
-      <w:pPr>
-        <w:spacing w:line="240"/>
-        <w:ind w:left="0" w:firstLine="272"/>
-        <w:jc w:val="both"/>
-      </w:pPr>
-      <w:r>
-        <w:rPr>
-          <w:rStyle w:val="FootnoteReference"/>
-        </w:rPr>
-        <w:footnoteRef/>
-      </w:r>
-      <w:r>
-        <w:rPr>
-          <w:color w:val="000000"/>
-          <w:sz w:val="20"/>
-          <w:szCs w:val="20"/>
-          <w:rFonts w:ascii="Times New Roman" w:cs="Times New Roman" w:eastAsia="Times New Roman" w:hAnsi="Times New Roman"/>
-        </w:rPr>
-        <w:t xml:space="preserve"> Abdul Wahid Haddade, dkk, </w:t>
-      </w:r>
-      <w:r>
-        <w:rPr>
-          <w:i/>
-          <w:iCs/>
-          <w:color w:val="000000"/>
-          <w:sz w:val="20"/>
-          <w:szCs w:val="20"/>
-          <w:rFonts w:ascii="Times New Roman" w:cs="Times New Roman" w:eastAsia="Times New Roman" w:hAnsi="Times New Roman"/>
-        </w:rPr>
-        <w:t xml:space="preserve">Loc.Cit., </w:t>
-      </w:r>
-    </w:p>
-  </w:footnote>
-  <w:footnote w:id="24">
-    <w:p>
-      <w:pPr>
-        <w:spacing w:line="240"/>
-        <w:ind w:left="0" w:firstLine="272"/>
-        <w:jc w:val="both"/>
-      </w:pPr>
-      <w:r>
-        <w:rPr>
-          <w:rStyle w:val="FootnoteReference"/>
-        </w:rPr>
-        <w:footnoteRef/>
-      </w:r>
-      <w:r>
-        <w:rPr>
-          <w:color w:val="000000"/>
-          <w:sz w:val="20"/>
-          <w:szCs w:val="20"/>
-          <w:rFonts w:ascii="Times New Roman" w:cs="Times New Roman" w:eastAsia="Times New Roman" w:hAnsi="Times New Roman"/>
-        </w:rPr>
-        <w:t xml:space="preserve">Ahmad Thobroni, </w:t>
-      </w:r>
-      <w:r>
-        <w:rPr>
-          <w:i/>
-          <w:iCs/>
-          <w:color w:val="000000"/>
-          <w:sz w:val="20"/>
-          <w:szCs w:val="20"/>
-          <w:rFonts w:ascii="Times New Roman" w:cs="Times New Roman" w:eastAsia="Times New Roman" w:hAnsi="Times New Roman"/>
-        </w:rPr>
-        <w:t xml:space="preserve">Loc.Cit., </w:t>
-      </w:r>
-    </w:p>
-  </w:footnote>
 </w:footnotes>
 </file>
 
 <file path=word/numbering.xml><?xml version="1.0" encoding="utf-8"?>
 <w:numbering xmlns:wpc="http://schemas.microsoft.com/office/word/2010/wordprocessingCanvas" xmlns:mc="http://schemas.openxmlformats.org/markup-compatibility/2006" xmlns:o="urn:schemas-microsoft-com:office:office" xmlns:r="http://schemas.openxmlformats.org/officeDocument/2006/relationships" xmlns:m="http://schemas.openxmlformats.org/officeDocument/2006/math" xmlns:v="urn:schemas-microsoft-com:vml" xmlns:wp14="http://schemas.microsoft.com/office/word/2010/wordprocessingDrawing" xmlns:wp="http://schemas.openxmlformats.org/drawingml/2006/wordprocessingDrawing" xmlns:w10="urn:schemas-microsoft-com:office:word" xmlns:w="http://schemas.openxmlformats.org/wordprocessingml/2006/main" xmlns:w14="http://schemas.microsoft.com/office/word/2010/wordml" xmlns:w15="http://schemas.microsoft.com/office/word/2012/wordml" xmlns:wpg="http://schemas.microsoft.com/office/word/2010/wordprocessingGroup" xmlns:wpi="http://schemas.microsoft.com/office/word/2010/wordprocessingInk" xmlns:wne="http://schemas.microsoft.com/office/word/2006/wordml" xmlns:wps="http://schemas.microsoft.com/office/word/2010/wordprocessingShape" mc:Ignorable="w14 w15 wp14">
-  <w:abstractNum w:abstractNumId="52" w15:restartNumberingAfterBreak="0">
+  <w:abstractNum w:abstractNumId="1" w15:restartNumberingAfterBreak="0">
     <w:multiLevelType w:val="hybridMultilevel"/>
     <w:lvl w:ilvl="0" w15:tentative="1">
       <w:start w:val="1"/>
@@ -3686,7 +2045,7 @@
       </w:pPr>
     </w:lvl>
   </w:abstractNum>
-  <w:abstractNum w:abstractNumId="53" w15:restartNumberingAfterBreak="0">
+  <w:abstractNum w:abstractNumId="2" w15:restartNumberingAfterBreak="0">
     <w:multiLevelType w:val="hybridMultilevel"/>
     <w:lvl w:ilvl="0" w15:tentative="1">
       <w:start w:val="1"/>
@@ -3695,7 +2054,7 @@
       <w:lvlJc w:val="left"/>
     </w:lvl>
   </w:abstractNum>
-  <w:abstractNum w:abstractNumId="54" w15:restartNumberingAfterBreak="0">
+  <w:abstractNum w:abstractNumId="3" w15:restartNumberingAfterBreak="0">
     <w:multiLevelType w:val="hybridMultilevel"/>
     <w:lvl w:ilvl="1" w15:tentative="1">
       <w:start w:val="1"/>
@@ -3704,7 +2063,7 @@
       <w:lvlJc w:val="left"/>
     </w:lvl>
   </w:abstractNum>
-  <w:abstractNum w:abstractNumId="55" w15:restartNumberingAfterBreak="0">
+  <w:abstractNum w:abstractNumId="4" w15:restartNumberingAfterBreak="0">
     <w:multiLevelType w:val="hybridMultilevel"/>
     <w:lvl w:ilvl="2" w15:tentative="1">
       <w:start w:val="1"/>
@@ -3713,7 +2072,7 @@
       <w:lvlJc w:val="left"/>
     </w:lvl>
   </w:abstractNum>
-  <w:abstractNum w:abstractNumId="56" w15:restartNumberingAfterBreak="0">
+  <w:abstractNum w:abstractNumId="5" w15:restartNumberingAfterBreak="0">
     <w:multiLevelType w:val="hybridMultilevel"/>
     <w:lvl w:ilvl="3" w15:tentative="1">
       <w:start w:val="1"/>
@@ -3722,7 +2081,7 @@
       <w:lvlJc w:val="left"/>
     </w:lvl>
   </w:abstractNum>
-  <w:abstractNum w:abstractNumId="57" w15:restartNumberingAfterBreak="0">
+  <w:abstractNum w:abstractNumId="6" w15:restartNumberingAfterBreak="0">
     <w:multiLevelType w:val="hybridMultilevel"/>
     <w:lvl w:ilvl="4" w15:tentative="1">
       <w:start w:val="1"/>
@@ -3732,31 +2091,31 @@
     </w:lvl>
   </w:abstractNum>
   <w:num w:numId="1">
-    <w:abstractNumId w:val="52"/>
+    <w:abstractNumId w:val="1"/>
     <w:lvlOverride w:ilvl="0">
       <w:startOverride w:val="1"/>
     </w:lvlOverride>
   </w:num>
-  <w:num w:numId="58">
-    <w:abstractNumId w:val="53"/>
+  <w:num w:numId="7">
+    <w:abstractNumId w:val="2"/>
     <w:lvlOverride w:ilvl="0">
       <w:startOverride w:val="1"/>
     </w:lvlOverride>
   </w:num>
-  <w:num w:numId="59">
-    <w:abstractNumId w:val="54"/>
+  <w:num w:numId="8">
+    <w:abstractNumId w:val="3"/>
     <w:lvlOverride w:ilvl="0">
       <w:startOverride w:val="1"/>
     </w:lvlOverride>
   </w:num>
-  <w:num w:numId="60">
-    <w:abstractNumId w:val="55"/>
+  <w:num w:numId="9">
+    <w:abstractNumId w:val="4"/>
     <w:lvlOverride w:ilvl="0">
       <w:startOverride w:val="1"/>
     </w:lvlOverride>
   </w:num>
-  <w:num w:numId="61">
-    <w:abstractNumId w:val="56"/>
+  <w:num w:numId="10">
+    <w:abstractNumId w:val="5"/>
     <w:lvlOverride w:ilvl="0">
       <w:startOverride w:val="1"/>
     </w:lvlOverride>

</xml_diff>

<commit_message>
perbaikan bug ke-2 yaitu pergantian nomor hal
</commit_message>
<xml_diff>
--- a/formating-docx/doc/My Document.docx
+++ b/formating-docx/doc/My Document.docx
@@ -208,6 +208,28 @@
         </w:rPr>
         <w:t xml:space="preserve">Kata “jihad” berasal dari kata “jahada”, yang berarti “usaha”, atau “jahdun” (جَهْدٌ), yang berarti “kekuatan”, dan “juhdun”(جُهْدٌ), yang berarti “kekuatan”. "Mengeluarkan segala kemampuan, kesungguhan, kekuatan, dan kesanggupan pada jalan yang diyakini kebenarannya" adalah definisi bahasa jihad. Akibatnya, kata ini juga dapat berarti ijtihad, yang berarti bersungguh-sungguh, rajin, giat, atau mencurahkan kemampuan, daya upaya, atau usaha keras untuk mencapai atau memperoleh sesuatu serta melepaskan diri dari keraguan sehingga mencapai peringkat yang yakin. Menurut pengertian bahasa, jihad sebenarnya memiliki makna yang sangat luas. Oleh karena itu, jihad secara bahasa dapat diterjemahkan sebagai usaha yang sungguh-sungguh dan berkualitas untuk menghasilkan sesuatu yang bermanfaat dan diridhai oleh Allah SWT. Usaha-usaha ini dapat mencakup amal saleh secara keseluruhan, keimanan yang kuat di dalam hati, atau 	upaya untuk menolak sesuatu yang dimurkai oleh Allah SWT.</w:t>
       </w:r>
+      <w:r>
+        <w:rPr>
+          <w:color w:val="000000"/>
+          <w:sz w:val="24"/>
+          <w:szCs w:val="24"/>
+          <w:rFonts w:ascii="Times New Roman" w:cs="Times New Roman" w:eastAsia="Times New Roman" w:hAnsi="Times New Roman"/>
+        </w:rPr>
+      </w:r>
+      <w:r>
+        <w:rPr>
+          <w:rStyle w:val="FootnoteReference"/>
+        </w:rPr>
+        <w:footnoteReference w:id="1"/>
+      </w:r>
+      <w:r>
+        <w:rPr>
+          <w:color w:val="000000"/>
+          <w:sz w:val="24"/>
+          <w:szCs w:val="24"/>
+          <w:rFonts w:ascii="Times New Roman" w:cs="Times New Roman" w:eastAsia="Times New Roman" w:hAnsi="Times New Roman"/>
+        </w:rPr>
+      </w:r>
     </w:p>
     <w:p>
       <w:pPr>
@@ -224,6 +246,28 @@
         </w:rPr>
         <w:t xml:space="preserve">Muhammad Fuad (1992) menyatakan bahwa term jihad dengan berbagai derivasinya disebutkan dalam Al-Qur'an sebanyak 41 kali. Dari 41 term tersebut, kebanyakan bergandengan dengan term "fisabilillah" (di jalan Allah). Kata jihad yang mengandung pengertian perjuangan tersebut memberikan indikasi bahwa jihad memiliki makna yang luas, yakni perjuangan secara total yang meliputi seluruh aspek kehidupan. Meskipun demikian, tidak dapat dipungkiri bahwa terdapat ayat yang mengandung pengertian jihad sebagai perang fisik atau mengangkat senjata terhadap para pembangkang atau musuh. Namun, ayat-ayat lain justru memaknai jihad sebagai perjuangan yang bersifat universal.</w:t>
       </w:r>
+      <w:r>
+        <w:rPr>
+          <w:color w:val="000000"/>
+          <w:sz w:val="24"/>
+          <w:szCs w:val="24"/>
+          <w:rFonts w:ascii="Times New Roman" w:cs="Times New Roman" w:eastAsia="Times New Roman" w:hAnsi="Times New Roman"/>
+        </w:rPr>
+      </w:r>
+      <w:r>
+        <w:rPr>
+          <w:rStyle w:val="FootnoteReference"/>
+        </w:rPr>
+        <w:footnoteReference w:id="2"/>
+      </w:r>
+      <w:r>
+        <w:rPr>
+          <w:color w:val="000000"/>
+          <w:sz w:val="24"/>
+          <w:szCs w:val="24"/>
+          <w:rFonts w:ascii="Times New Roman" w:cs="Times New Roman" w:eastAsia="Times New Roman" w:hAnsi="Times New Roman"/>
+        </w:rPr>
+      </w:r>
     </w:p>
     <w:p>
       <w:pPr>
@@ -240,6 +284,28 @@
         </w:rPr>
         <w:t xml:space="preserve">Sebagaimana ayat-ayat Al-Qur'an yang terbagi dalam dua kategori, yaitu ayat-ayat makkiyyah dan madaniyyah, ayat-ayat tentang jihad juga terbagi menjadi makkiyyah dan madaniyyah. Ayat-ayat jihad yang termasuk kategori makkiyyah lebih tepat dimaknai dengan pengertian menurut bahasa, yaitu mengerahkan segenap kemampuan untuk mencapai ridha Allah SWT. Ayat-ayat makkiyyah yang memerintahkan berjihad terhadap orang-orang kafir tidak dapat diartikan sebagai berperang melawan mereka, karena tidak ada bukti historis tentang peperangan yang dilakukan oleh Rasulullah selama periode Mekah. Keterangan di atas membuktikan bahwa jihad di dalam Al-Qur'an pada umumnya berarti bersungguh-sungguh. Dengan demikian, dapat dipahami bahwa pemahaman tentang jihad yang selalu mengidentikkan dengan perang bukanlah pemahaman yang bersumber dari Al-Qur'an. Oleh karena itu, keliru jika dikatakan bahwa semangat perang lahir dari ayat-ayat jihad dalam Al-Qur'an.</w:t>
       </w:r>
+      <w:r>
+        <w:rPr>
+          <w:color w:val="000000"/>
+          <w:sz w:val="24"/>
+          <w:szCs w:val="24"/>
+          <w:rFonts w:ascii="Times New Roman" w:cs="Times New Roman" w:eastAsia="Times New Roman" w:hAnsi="Times New Roman"/>
+        </w:rPr>
+      </w:r>
+      <w:r>
+        <w:rPr>
+          <w:rStyle w:val="FootnoteReference"/>
+        </w:rPr>
+        <w:footnoteReference w:id="3"/>
+      </w:r>
+      <w:r>
+        <w:rPr>
+          <w:color w:val="000000"/>
+          <w:sz w:val="24"/>
+          <w:szCs w:val="24"/>
+          <w:rFonts w:ascii="Times New Roman" w:cs="Times New Roman" w:eastAsia="Times New Roman" w:hAnsi="Times New Roman"/>
+        </w:rPr>
+      </w:r>
     </w:p>
     <w:p>
       <w:pPr>
@@ -272,6 +338,28 @@
         </w:rPr>
         <w:t xml:space="preserve">Jihad adalah berjuang dengan sungguh-sungguh menurut syariat Islam. Jihad dilaksanakan untuk menjalankan misi utama manusia, yaitu menegakkan agama Allah atau menjaga agama tetap tegak, dengan cara-cara yang sesuai dengan garis perjuangan para Rasul dan Al-Qur'an. Jihad yang dilaksanakan Rasul adalah berdakwah agar manusia meninggalkan kemusyrikan dan kembali kepada aturan Allah, menyucikan qalbu, memberikan pengajaran kepada umat, dan mendidik manusia agar sesuai dengan tujuan penciptaan mereka, yaitu menjadi khalifah Allah di bumi. 	Arti kata jihad sering disalahpahami oleh orang yang tidak mengenal prinsip-prinsip agama Islam sebagai 'perang suci' (holy war); istilah untuk perang adalah qital, bukan jihad. Jihad dalam bentuk perang dilaksanakan jika terjadi fitnah yang membahayakan eksistensi umat, seperti serangan-serangan dari luar. Pada dasarnya, arti kata jihad adalah "berjuang" atau "berusaha dengan keras", namun bukan berarti "perang dalam makna fisik". Jika sekarang jihad lebih sering diartikan sebagai "perjuangan untuk agama", itu tidak harus berarti perjuangan fisik. Mengartikan jihad hanya sebagai peperangan fisik dan eksternal untuk membela agama sangat berbahaya, karena mudah dimanfaatkan dan rentan terhadap fitnah.</w:t>
       </w:r>
+      <w:r>
+        <w:rPr>
+          <w:color w:val="000000"/>
+          <w:sz w:val="24"/>
+          <w:szCs w:val="24"/>
+          <w:rFonts w:ascii="Times New Roman" w:cs="Times New Roman" w:eastAsia="Times New Roman" w:hAnsi="Times New Roman"/>
+        </w:rPr>
+      </w:r>
+      <w:r>
+        <w:rPr>
+          <w:rStyle w:val="FootnoteReference"/>
+        </w:rPr>
+        <w:footnoteReference w:id="4"/>
+      </w:r>
+      <w:r>
+        <w:rPr>
+          <w:color w:val="000000"/>
+          <w:sz w:val="24"/>
+          <w:szCs w:val="24"/>
+          <w:rFonts w:ascii="Times New Roman" w:cs="Times New Roman" w:eastAsia="Times New Roman" w:hAnsi="Times New Roman"/>
+        </w:rPr>
+      </w:r>
     </w:p>
     <w:p>
       <w:pPr>
@@ -287,6 +375,28 @@
           <w:rFonts w:ascii="Times New Roman" w:cs="Times New Roman" w:eastAsia="Times New Roman" w:hAnsi="Times New Roman"/>
         </w:rPr>
         <w:t xml:space="preserve">Quraish Shihab (1996:494) mengatakan bahwa jihad juga mengandung arti "kemampuan" yang menuntut sang mujahid mengeluarkan segala daya dan kemampuannya demi mencapai tujuan. Karena itu, jihad adalah pengorbanan, dan dengan demikian sang mujahid tidak menuntut atau mengambil, tetapi memberi semua yang dimilikinya. Ketika memberi, dia tidak berhenti sebelum tujuannya tercapai atau yang dimilikinya habis.</w:t>
+      </w:r>
+      <w:r>
+        <w:rPr>
+          <w:color w:val="000000"/>
+          <w:sz w:val="24"/>
+          <w:szCs w:val="24"/>
+          <w:rFonts w:ascii="Times New Roman" w:cs="Times New Roman" w:eastAsia="Times New Roman" w:hAnsi="Times New Roman"/>
+        </w:rPr>
+      </w:r>
+      <w:r>
+        <w:rPr>
+          <w:rStyle w:val="FootnoteReference"/>
+        </w:rPr>
+        <w:footnoteReference w:id="5"/>
+      </w:r>
+      <w:r>
+        <w:rPr>
+          <w:color w:val="000000"/>
+          <w:sz w:val="24"/>
+          <w:szCs w:val="24"/>
+          <w:rFonts w:ascii="Times New Roman" w:cs="Times New Roman" w:eastAsia="Times New Roman" w:hAnsi="Times New Roman"/>
+        </w:rPr>
       </w:r>
     </w:p>
     <w:p>
@@ -341,6 +451,28 @@
         </w:rPr>
         <w:t xml:space="preserve">Terorisme dapat diartikan sebagai tindakan kekerasan atau ancaman kekerasan yang ditujukan kepada sasaran acak (yang tidak memiliki hubungan langsung dengan pelaku) dan mengakibatkan kerusakan, kematian, ketakutan, ketidakpastian, dan keputusasaan massal. Tindakan terorisme tersebut dilakukan dengan tujuan memaksakan kehendak kepada pihak yang dianggap lawan oleh kelompok teroris, agar kepentingan mereka diakui dan dihargai. Dengan definisi ini, unsur-unsur yang harus ada dalam pengertian terorisme adalah tindakan kekerasan yang mengakibatkan kerusakan, kematian, ketakutan, ketidakpastian, dan keputusasaan massal; sasaran tindakan adalah sasaran acak yang tidak memiliki hubungan langsung dengan pelaku; dan motivasi pelaku tidak dapat dikhususkan hanya pada motivasi politik saja, karena dalam banyak kasus, kepentingan non-politik seperti keyakinan juga merupakan latar belakangnya.</w:t>
       </w:r>
+      <w:r>
+        <w:rPr>
+          <w:color w:val="000000"/>
+          <w:sz w:val="24"/>
+          <w:szCs w:val="24"/>
+          <w:rFonts w:ascii="Times New Roman" w:cs="Times New Roman" w:eastAsia="Times New Roman" w:hAnsi="Times New Roman"/>
+        </w:rPr>
+      </w:r>
+      <w:r>
+        <w:rPr>
+          <w:rStyle w:val="FootnoteReference"/>
+        </w:rPr>
+        <w:footnoteReference w:id="6"/>
+      </w:r>
+      <w:r>
+        <w:rPr>
+          <w:color w:val="000000"/>
+          <w:sz w:val="24"/>
+          <w:szCs w:val="24"/>
+          <w:rFonts w:ascii="Times New Roman" w:cs="Times New Roman" w:eastAsia="Times New Roman" w:hAnsi="Times New Roman"/>
+        </w:rPr>
+      </w:r>
     </w:p>
     <w:p>
       <w:pPr>
@@ -357,6 +489,28 @@
         </w:rPr>
         <w:t xml:space="preserve">Fenomena terorisme yang berkembang di dunia internasional saat ini tidak dapat dipisahkan dari adanya wacana yang dibentuk untuk membangun pemahaman bersama terkait terorisme. Rainer Hülsse dan Alexander Spencer menjelaskan bahwa terorisme dihasilkan dari konstruksi sosial. Mereka lebih lanjut menyatakan bahwa realitas terkait terorisme merupakan hasil dari pembentukan wacana oleh musuh para teroris, yang kemudian membentuk motivasi, strategi, serta struktur organisasi dan tujuan para aktor teroris itu sendiri. Sebagai ilustrasi, konstruksi “metafora” Al-Qaeda oleh pers populer Jerman setelah serangan teroris di New York dan Washington pada tahun 2001, Madrid pada tahun 2004, dan London pada tahun 2005 dapat digunakan untuk memahami pendekatan ini. Kasus-kasus tersebut awalnya dimaknai sebagai bentuk “perang” antar aktor dalam lingkup dunia internasional. Namun, sejak tahun 2004 dan seterusnya, wacana yang berkembang menggeser makna serangan Al-Qaeda dari bentuk perang menjadi tindakan kriminal. Hal ini berdampak pada pembangunan makna tentang Al-Qaeda sebagai sebuah institusi kriminal yang kini dikenal sebagai lembaga teroris. Pergeseran ini juga telah mengubah pandangan terhadap Al-Qaeda dari ancaman eksternal menjadi ancaman internal, yang mensyaratkan pergeseran praktik kontra-terorisme dari perang antar militer ke respons instrumen yudisial (Hülsse &amp; Spencer, 2008).</w:t>
       </w:r>
+      <w:r>
+        <w:rPr>
+          <w:color w:val="000000"/>
+          <w:sz w:val="24"/>
+          <w:szCs w:val="24"/>
+          <w:rFonts w:ascii="Times New Roman" w:cs="Times New Roman" w:eastAsia="Times New Roman" w:hAnsi="Times New Roman"/>
+        </w:rPr>
+      </w:r>
+      <w:r>
+        <w:rPr>
+          <w:rStyle w:val="FootnoteReference"/>
+        </w:rPr>
+        <w:footnoteReference w:id="7"/>
+      </w:r>
+      <w:r>
+        <w:rPr>
+          <w:color w:val="000000"/>
+          <w:sz w:val="24"/>
+          <w:szCs w:val="24"/>
+          <w:rFonts w:ascii="Times New Roman" w:cs="Times New Roman" w:eastAsia="Times New Roman" w:hAnsi="Times New Roman"/>
+        </w:rPr>
+      </w:r>
     </w:p>
     <w:p>
       <w:pPr>
@@ -373,6 +527,28 @@
         </w:rPr>
         <w:t xml:space="preserve">Sementara itu, dinamika perkembangan terkait isu terorisme di Indonesia sebenarnya sudah ada sejak usia negara Indonesia sendiri. Artinya, sejak Indonesia merdeka pada tahun 1945, sudah ada gerakan-gerakan yang dapat dimasukkan ke dalam kategori konsep terorisme secara terminologi. Bahkan, perjuangan kemerdekaan Indonesia bisa jadi bagi pemerintah kolonial Belanda dikategorikan sebagai aksi teror dengan landasan nasionalis. Peristiwa-peristiwa yang masuk dalam kategori tindakan teror sudah ada jauh sebelum Indonesia memiliki instrumen hukum tentang anti-terorisme. Misalnya, kasus Pemberontakan PKI Madiun (1948), Pemberontakan oleh DII/TII di Jawa Barat (1949), Angkatan Perang Ratu Adil (APRA) pada tahun 1950, Republik Maluku Selatan (1950), Pemberontakan DI/TII Sulawesi Selatan (1952), Pemberontakan DI/TII Aceh (1953), Organisasi Papua Merdeka (1960-an), PRRI/PERMESTA (1958), Pemberontakan PKI (1965), dan Pemberontakan Fretelin di Timor-Timur (1975) (Muradi, 2012). Namun, peristiwa-peristiwa tersebut dipersepsikan sebagai kelompok gerakan pemberontakan oleh pemerintah Indonesia. Indonesia pada waktu itu belum memiliki instrumen hukum yang khusus untuk memaknai kelompok-kelompok tersebut sebagai kelompok teroris.</w:t>
       </w:r>
+      <w:r>
+        <w:rPr>
+          <w:color w:val="000000"/>
+          <w:sz w:val="24"/>
+          <w:szCs w:val="24"/>
+          <w:rFonts w:ascii="Times New Roman" w:cs="Times New Roman" w:eastAsia="Times New Roman" w:hAnsi="Times New Roman"/>
+        </w:rPr>
+      </w:r>
+      <w:r>
+        <w:rPr>
+          <w:rStyle w:val="FootnoteReference"/>
+        </w:rPr>
+        <w:footnoteReference w:id="8"/>
+      </w:r>
+      <w:r>
+        <w:rPr>
+          <w:color w:val="000000"/>
+          <w:sz w:val="24"/>
+          <w:szCs w:val="24"/>
+          <w:rFonts w:ascii="Times New Roman" w:cs="Times New Roman" w:eastAsia="Times New Roman" w:hAnsi="Times New Roman"/>
+        </w:rPr>
+      </w:r>
     </w:p>
     <w:p>
       <w:pPr>
@@ -389,6 +565,28 @@
         </w:rPr>
         <w:t xml:space="preserve">Baru pada tahun 2000-an, isu terorisme dianggap sebagai ancaman nasional. Pada waktu itu, aksi teror yang muncul lebih banyak dilandasi alasan tuntutan untuk merdeka atau landasan ideologi, yang dianggap oleh pemerintah Indonesia sebagai tindakan pemberontakan dalam negeri yang mengancam keamanan nasional, bukan sebagai tindakan terorisme yang dilakukan oleh jaringan terorisme internasional seperti yang terjadi saat ini.</w:t>
       </w:r>
+      <w:r>
+        <w:rPr>
+          <w:color w:val="000000"/>
+          <w:sz w:val="24"/>
+          <w:szCs w:val="24"/>
+          <w:rFonts w:ascii="Times New Roman" w:cs="Times New Roman" w:eastAsia="Times New Roman" w:hAnsi="Times New Roman"/>
+        </w:rPr>
+      </w:r>
+      <w:r>
+        <w:rPr>
+          <w:rStyle w:val="FootnoteReference"/>
+        </w:rPr>
+        <w:footnoteReference w:id="9"/>
+      </w:r>
+      <w:r>
+        <w:rPr>
+          <w:color w:val="000000"/>
+          <w:sz w:val="24"/>
+          <w:szCs w:val="24"/>
+          <w:rFonts w:ascii="Times New Roman" w:cs="Times New Roman" w:eastAsia="Times New Roman" w:hAnsi="Times New Roman"/>
+        </w:rPr>
+      </w:r>
     </w:p>
     <w:p>
       <w:pPr>
@@ -404,6 +602,28 @@
           <w:rFonts w:ascii="Times New Roman" w:cs="Times New Roman" w:eastAsia="Times New Roman" w:hAnsi="Times New Roman"/>
         </w:rPr>
         <w:t xml:space="preserve">Dari penjelasan di atas tentang terorisme dan apabila kita bandingkan dengan hakikat dari jihad sangatlah berbeda. dimana Jihad terambil dari kata juhd/jahd yang berarti antara lain kesulitan dan kemampuan. Dari sini lahir istilah “ijithad” yang bermakna mengerahkan kemampuan dalam menyelesaikan kesulitan, biasanya identik dengan kegiatan berfikir. Dari kata ini juga lahir “mujahadah” yang identik dengan pergulatan batin dalam melawan hawa nafsu. Kata jihad dalam al-Qur’an diartikan dalam beberapa makna antara lain:</w:t>
+      </w:r>
+      <w:r>
+        <w:rPr>
+          <w:color w:val="000000"/>
+          <w:sz w:val="24"/>
+          <w:szCs w:val="24"/>
+          <w:rFonts w:ascii="Times New Roman" w:cs="Times New Roman" w:eastAsia="Times New Roman" w:hAnsi="Times New Roman"/>
+        </w:rPr>
+      </w:r>
+      <w:r>
+        <w:rPr>
+          <w:rStyle w:val="FootnoteReference"/>
+        </w:rPr>
+        <w:footnoteReference w:id="10"/>
+      </w:r>
+      <w:r>
+        <w:rPr>
+          <w:color w:val="000000"/>
+          <w:sz w:val="24"/>
+          <w:szCs w:val="24"/>
+          <w:rFonts w:ascii="Times New Roman" w:cs="Times New Roman" w:eastAsia="Times New Roman" w:hAnsi="Times New Roman"/>
+        </w:rPr>
       </w:r>
     </w:p>
     <w:p>
@@ -621,6 +841,28 @@
         </w:rPr>
         <w:t xml:space="preserve">Konteks perang dalam tata aturan Islam hanya diperkenankan membunuh terhadap mereka yang ikut berperang atau menyerang. Sebaliknya, meskipun mereka itu sehat, masih muda dan kuat, terlebih lagi jika mereka orang yang sakit, tua renta, buta, dan terlantar, maka tidak boleh dibunuh sepanjang mereka tidak ikut berperang. Perang dalam Islam dibolehkan dengan beberapa alasan. Pertama, jika pihak lawan menyerang lebih dahulu. Kedua, pihak lawan mengkhianati perjanjian dan kesepakatan bersama.</w:t>
       </w:r>
+      <w:r>
+        <w:rPr>
+          <w:color w:val="000000"/>
+          <w:sz w:val="24"/>
+          <w:szCs w:val="24"/>
+          <w:rFonts w:ascii="Times New Roman" w:cs="Times New Roman" w:eastAsia="Times New Roman" w:hAnsi="Times New Roman"/>
+        </w:rPr>
+      </w:r>
+      <w:r>
+        <w:rPr>
+          <w:rStyle w:val="FootnoteReference"/>
+        </w:rPr>
+        <w:footnoteReference w:id="11"/>
+      </w:r>
+      <w:r>
+        <w:rPr>
+          <w:color w:val="000000"/>
+          <w:sz w:val="24"/>
+          <w:szCs w:val="24"/>
+          <w:rFonts w:ascii="Times New Roman" w:cs="Times New Roman" w:eastAsia="Times New Roman" w:hAnsi="Times New Roman"/>
+        </w:rPr>
+      </w:r>
     </w:p>
     <w:p>
       <w:pPr>
@@ -637,6 +879,28 @@
         </w:rPr>
         <w:t xml:space="preserve">Jika melihat realitas sejarah perang dalam Islam, ternyata yang melatarbelakangi terjadinya perang berawal dari penindasan yang dialami oleh kaum muslimin sepeninggal Nabi hijrah ke Madinah yang amat memilukan. Penyiksaan bahkan pembunuhan dilakukan oleh Quraisy Makkah terhadap umat Islam. Kebencian itu terus berlanjut hingga pada upaya menghancurkan dan merusak tatanan masyarakat madani yang dibangun oleh Nabi Muhammad di Yathrib (Madinah). Suasana itu mengantar turunnya perintah jihad melalui perang, seperti yang tersebut dalam QS. Al-Hajj: 39:</w:t>
       </w:r>
+      <w:r>
+        <w:rPr>
+          <w:color w:val="000000"/>
+          <w:sz w:val="24"/>
+          <w:szCs w:val="24"/>
+          <w:rFonts w:ascii="Times New Roman" w:cs="Times New Roman" w:eastAsia="Times New Roman" w:hAnsi="Times New Roman"/>
+        </w:rPr>
+      </w:r>
+      <w:r>
+        <w:rPr>
+          <w:rStyle w:val="FootnoteReference"/>
+        </w:rPr>
+        <w:footnoteReference w:id="12"/>
+      </w:r>
+      <w:r>
+        <w:rPr>
+          <w:color w:val="000000"/>
+          <w:sz w:val="24"/>
+          <w:szCs w:val="24"/>
+          <w:rFonts w:ascii="Times New Roman" w:cs="Times New Roman" w:eastAsia="Times New Roman" w:hAnsi="Times New Roman"/>
+        </w:rPr>
+      </w:r>
     </w:p>
     <w:p>
       <w:pPr>
@@ -669,6 +933,28 @@
         </w:rPr>
         <w:t xml:space="preserve">Para ulama sependapat bahwa ayat di atas adalah ayat pertama yang memberi izin kepada umat Muslim untuk mengangkat senjata guna melindungi diri mereka. Ayat ini meletakkan dasar-dasar yang menjadi pedoman bagi umat Muslim dalam melakukan perang defensif. Ayat kemudian memperkuat legalisasi perang secara defensif dengan menjaga pranata sosial dan ibadah dengan tidak merusak secara membabi buta seperti yang disebut dalam QS. Al-Hajj: 40:</w:t>
       </w:r>
+      <w:r>
+        <w:rPr>
+          <w:color w:val="000000"/>
+          <w:sz w:val="24"/>
+          <w:szCs w:val="24"/>
+          <w:rFonts w:ascii="Times New Roman" w:cs="Times New Roman" w:eastAsia="Times New Roman" w:hAnsi="Times New Roman"/>
+        </w:rPr>
+      </w:r>
+      <w:r>
+        <w:rPr>
+          <w:rStyle w:val="FootnoteReference"/>
+        </w:rPr>
+        <w:footnoteReference w:id="13"/>
+      </w:r>
+      <w:r>
+        <w:rPr>
+          <w:color w:val="000000"/>
+          <w:sz w:val="24"/>
+          <w:szCs w:val="24"/>
+          <w:rFonts w:ascii="Times New Roman" w:cs="Times New Roman" w:eastAsia="Times New Roman" w:hAnsi="Times New Roman"/>
+        </w:rPr>
+      </w:r>
     </w:p>
     <w:p>
       <w:pPr>
@@ -717,6 +1003,28 @@
         </w:rPr>
         <w:t xml:space="preserve">Tindakan yang semena-mena dilakukan oleh Quraisy Makkah mendorong Nabi Muhammad saw bersama komunitas yang sudah kuat memasuki kota Makkah. Bayangan perang yang amat dahsyat atau pembalasan yang dilakukan oleh umat Islam segera muncul di benak orang ketika itu. Namun yang terjadi tidak seperti apa yang mereka prediksikan. Mereka mengira akan mendapat perlakuan balas dendam seperti kasus perlakuan saudara-saudara Nabi Yusuf. Namun Nabi Muhammad ternyata memaafkan dan melepaskan mereka dari hukuman. Bayangan orang Quraisy akan pembalasan yang dilakukan Muhammad ternyata berbeda dengan fakta. Pernyataan Nabi “antum thulaqa” artinya kalian bebas tanpa syarat, membuat orang-orang Quraisy simpatik terhadap Muhammad. Nabi Muhammad dan para sahabat sekalipun dalam keadaan kuat tidak pernah memaksakan ideologi Islam kepada kafir Quraisy. Beberapa ayat yang menjadi dasar antara lain:</w:t>
       </w:r>
+      <w:r>
+        <w:rPr>
+          <w:color w:val="000000"/>
+          <w:sz w:val="24"/>
+          <w:szCs w:val="24"/>
+          <w:rFonts w:ascii="Times New Roman" w:cs="Times New Roman" w:eastAsia="Times New Roman" w:hAnsi="Times New Roman"/>
+        </w:rPr>
+      </w:r>
+      <w:r>
+        <w:rPr>
+          <w:rStyle w:val="FootnoteReference"/>
+        </w:rPr>
+        <w:footnoteReference w:id="14"/>
+      </w:r>
+      <w:r>
+        <w:rPr>
+          <w:color w:val="000000"/>
+          <w:sz w:val="24"/>
+          <w:szCs w:val="24"/>
+          <w:rFonts w:ascii="Times New Roman" w:cs="Times New Roman" w:eastAsia="Times New Roman" w:hAnsi="Times New Roman"/>
+        </w:rPr>
+      </w:r>
     </w:p>
     <w:p>
       <w:pPr>
@@ -780,6 +1088,28 @@
           <w:rFonts w:ascii="Times New Roman" w:cs="Times New Roman" w:eastAsia="Times New Roman" w:hAnsi="Times New Roman"/>
         </w:rPr>
         <w:t xml:space="preserve">dapun tindakan teror yang dilakukan oleh sebagian orang terutama yang melakukannya di negara Indonesia ini adalah tindakan yang tidak dapat diterima dan tidak dapat dilegitimasi oleh ayat maupun hadis. Tindakan teror dengan mengatasnamakan agama sesungguhnya mencederai kemurnian agama yang menjunjung tinggi nilai-nilai kemanusiaan. Orang luar yang mengklaim Islam sebagai agama teror dan orang yang menganggap dirinya muslim tapi mengklaim tindakan terornya benar, sesungguhnya mereka tidak memahami esensi Islam dan mengabaikan banyak ayat dan hadis yang menjelaskan tentang nilai-nilai kerahmatan, toleransi, dan keadilan tanpa melihat jenis, suku, dan agama orang. Dalam analisis penulis, tindakan teror bertentangan dengan beberapa hal:</w:t>
+      </w:r>
+      <w:r>
+        <w:rPr>
+          <w:color w:val="000000"/>
+          <w:sz w:val="24"/>
+          <w:szCs w:val="24"/>
+          <w:rFonts w:ascii="Times New Roman" w:cs="Times New Roman" w:eastAsia="Times New Roman" w:hAnsi="Times New Roman"/>
+        </w:rPr>
+      </w:r>
+      <w:r>
+        <w:rPr>
+          <w:rStyle w:val="FootnoteReference"/>
+        </w:rPr>
+        <w:footnoteReference w:id="15"/>
+      </w:r>
+      <w:r>
+        <w:rPr>
+          <w:color w:val="000000"/>
+          <w:sz w:val="24"/>
+          <w:szCs w:val="24"/>
+          <w:rFonts w:ascii="Times New Roman" w:cs="Times New Roman" w:eastAsia="Times New Roman" w:hAnsi="Times New Roman"/>
+        </w:rPr>
       </w:r>
     </w:p>
     <w:p>
@@ -930,6 +1260,28 @@
         </w:rPr>
         <w:t xml:space="preserve">Kata "bom" berasal dari bahasa Yunani βόμβος (bombos), istilah yang meniru suara ledakan "bom" dalam bahasa tersebut. Dalam Kamus Besar Bahasa Indonesia, bom diartikan sebagai senjata peledak atau peluru besar yang mampu meledak. Bunuh diri, dikenal sebagai suicide dalam bahasa Inggris dan harakiri dalam budaya Jepang, adalah tindakan mengakhiri hidup sendiri tanpa bantuan aktif orang lain. Bom bunuh diri merujuk pada tindakan seseorang yang menggunakan alat peledak untuk memenuhi ambisinya dengan cara bunuh diri. Biasanya, tindakan ini terjadi dalam situasi perang di mana seseorang merasa tidak memiliki pilihan lain untuk mengalahkan musuhnya. Bom sendiri adalah alat yang menghasilkan ledakan besar dan cepat, yang dapat menyebabkan kerusakan serius terhadap benda mati maupun hidup di sekitarnya.</w:t>
       </w:r>
+      <w:r>
+        <w:rPr>
+          <w:color w:val="000000"/>
+          <w:sz w:val="24"/>
+          <w:szCs w:val="24"/>
+          <w:rFonts w:ascii="Times New Roman" w:cs="Times New Roman" w:eastAsia="Times New Roman" w:hAnsi="Times New Roman"/>
+        </w:rPr>
+      </w:r>
+      <w:r>
+        <w:rPr>
+          <w:rStyle w:val="FootnoteReference"/>
+        </w:rPr>
+        <w:footnoteReference w:id="16"/>
+      </w:r>
+      <w:r>
+        <w:rPr>
+          <w:color w:val="000000"/>
+          <w:sz w:val="24"/>
+          <w:szCs w:val="24"/>
+          <w:rFonts w:ascii="Times New Roman" w:cs="Times New Roman" w:eastAsia="Times New Roman" w:hAnsi="Times New Roman"/>
+        </w:rPr>
+      </w:r>
     </w:p>
     <w:p>
       <w:pPr>
@@ -946,6 +1298,28 @@
         </w:rPr>
         <w:t xml:space="preserve">Menurut Nawaf Hail Takruri, bom bunuh diri atau dikenal juga sebagai bom manusia adalah ketika seorang mujahid mengisi tas atau mobilnya dengan bahan peledak, atau melilitkan bahan peledak pada tubuhnya, kemudian menyerang musuh di tempat mereka berkumpul, dengan risiko besar bahwa pelaku sendiri juga ikut terbunuh. Muhammad Tha’mah Al-Qadah mendefinisikan bom bunuh diri sebagai tindakan seorang mujahid yang mengorbankan hidupnya untuk melaksanakan tugas berat, dengan kemungkinan besar tidak selamat, tetapi diyakini memberikan manfaat besar bagi kaum Muslimin. Bom bunuh diri adalah bentuk perjuangan keyakinan bagi pelakunya, yang dianggap sebagai upaya untuk memperjuangkan kebenaran. Dalam bahasa Arab, bom bunuh diri dikenal sebagai intihaar, berasal dari kata kerja nahara yang artinya menyembelih dan membunuh diri sendiri.</w:t>
       </w:r>
+      <w:r>
+        <w:rPr>
+          <w:color w:val="000000"/>
+          <w:sz w:val="24"/>
+          <w:szCs w:val="24"/>
+          <w:rFonts w:ascii="Times New Roman" w:cs="Times New Roman" w:eastAsia="Times New Roman" w:hAnsi="Times New Roman"/>
+        </w:rPr>
+      </w:r>
+      <w:r>
+        <w:rPr>
+          <w:rStyle w:val="FootnoteReference"/>
+        </w:rPr>
+        <w:footnoteReference w:id="17"/>
+      </w:r>
+      <w:r>
+        <w:rPr>
+          <w:color w:val="000000"/>
+          <w:sz w:val="24"/>
+          <w:szCs w:val="24"/>
+          <w:rFonts w:ascii="Times New Roman" w:cs="Times New Roman" w:eastAsia="Times New Roman" w:hAnsi="Times New Roman"/>
+        </w:rPr>
+      </w:r>
     </w:p>
     <w:p>
       <w:pPr>
@@ -962,6 +1336,28 @@
         </w:rPr>
         <w:t xml:space="preserve">Istilah fundamentalisme dan radikalisme sering kali dicampuradukkan dengan terorisme dan bom bunuh diri, dan tidak jarang terorisme selalu dikaitkan dengan gerakan-gerakan Islam. Dalam wacana yang dikembangkan oleh dunia Barat dan sekutunya, terdapat pandangan bahwa Islam adalah yang paling mendukung terhadap tindakan terorisme. Namun, tindakan seperti perilaku terror atau bom bunuh diri yang dilakukan oleh mereka yang mengaku membela Islam, seharusnya dilihat kembali secara kasuistis. Sebagai contoh, peristiwa bom Bali pada 12 Oktober 2002, yang menewaskan 182 orang, sebagian besar warga negara asing, serta melukai ratusan lainnya, menandai fase baru dalam gerakan terorisme yang sering kali diberi label keagamaan. Tindakan ini seringkali berwajah keras, memaksa, merusak peradaban, dan bertentangan dengan martabat dan harkat manusia yang seharusnya menghargai keselamatan, kedamaian, dan kesejahteraan.</w:t>
       </w:r>
+      <w:r>
+        <w:rPr>
+          <w:color w:val="000000"/>
+          <w:sz w:val="24"/>
+          <w:szCs w:val="24"/>
+          <w:rFonts w:ascii="Times New Roman" w:cs="Times New Roman" w:eastAsia="Times New Roman" w:hAnsi="Times New Roman"/>
+        </w:rPr>
+      </w:r>
+      <w:r>
+        <w:rPr>
+          <w:rStyle w:val="FootnoteReference"/>
+        </w:rPr>
+        <w:footnoteReference w:id="18"/>
+      </w:r>
+      <w:r>
+        <w:rPr>
+          <w:color w:val="000000"/>
+          <w:sz w:val="24"/>
+          <w:szCs w:val="24"/>
+          <w:rFonts w:ascii="Times New Roman" w:cs="Times New Roman" w:eastAsia="Times New Roman" w:hAnsi="Times New Roman"/>
+        </w:rPr>
+      </w:r>
     </w:p>
     <w:p>
       <w:pPr>
@@ -977,6 +1373,28 @@
           <w:rFonts w:ascii="Times New Roman" w:cs="Times New Roman" w:eastAsia="Times New Roman" w:hAnsi="Times New Roman"/>
         </w:rPr>
         <w:t xml:space="preserve">Menurut Azumardi Azra, penyebab terorisme sering kali dipengaruhi oleh pemahaman yang salah tentang konsep jihad, yang sering disalahartikan sebagai perang suci untuk melawan orang kafir. Ada pandangan bahwa sistem pemerintahan di Indonesia tidak sesuai dengan pandangan mereka, yang menganggap bahwa hukum politik, fikih, dan syariah tidak boleh dipisahkan dari negara. Pimpinan negara harus patuh pada hukum Islam yang menetapkan cita-cita Islam sebagai satu-satunya hukum perang bagi mereka yang tidak mengikutinya. Ideologi Jihad menjadi semakin kentara dalam gerakan sosial Islam setelah tragedi 11 September. Peristiwa bom Bali 1 pada 12 Oktober 2002 sering dikaitkan dengan tragedi ini. Peristiwa bom Bali tidak hanya mencoreng nama Bali sebagai kawasan yang aman bagi masyarakat internasional, tetapi juga telah mengikutkan Indonesia sebagai sasaran perang global dalam terorisme, nama organisasi JI yang dikenal sebagai Jariangan Al-Qaeda di Asia Tenggara sangat diperbincangkan saat ini, dan menjadi awal perkenalan kalangan radikal yang masuk ke Indonesia. Bentuk penegakan hukum Islam diambil karena pemahaman agama yang radikal, dimana kekerasan atas nama agama sering di kaitkan dengan radikalisme agama.</w:t>
+      </w:r>
+      <w:r>
+        <w:rPr>
+          <w:color w:val="000000"/>
+          <w:sz w:val="24"/>
+          <w:szCs w:val="24"/>
+          <w:rFonts w:ascii="Times New Roman" w:cs="Times New Roman" w:eastAsia="Times New Roman" w:hAnsi="Times New Roman"/>
+        </w:rPr>
+      </w:r>
+      <w:r>
+        <w:rPr>
+          <w:rStyle w:val="FootnoteReference"/>
+        </w:rPr>
+        <w:footnoteReference w:id="19"/>
+      </w:r>
+      <w:r>
+        <w:rPr>
+          <w:color w:val="000000"/>
+          <w:sz w:val="24"/>
+          <w:szCs w:val="24"/>
+          <w:rFonts w:ascii="Times New Roman" w:cs="Times New Roman" w:eastAsia="Times New Roman" w:hAnsi="Times New Roman"/>
+        </w:rPr>
       </w:r>
     </w:p>
     <w:p>
@@ -1052,6 +1470,28 @@
         </w:rPr>
         <w:t xml:space="preserve">Yusuf al-Qaradawi mengeluarkan fatwa bahwa beliau menegaskan bom bunuh diri dipandang sebagai salah satu bentuk jihad yang paling agung di jalan Allah, dengan melakukan teror terhadap musuh yang disyariatkan dalam Surat Al-Anfal ayat 60. Berdasarkan pernyataan ini, tindakan bom bunuh diri yang dilakukan oleh pemuda Palestina dalam menghadapi tentara Israel dipandang sebagai bentuk jihad yang mulia, bahkan dikategorikan sebagai pencarian syahid (‘amaliyah al-istisyhad) oleh al-Qaradawi. Motivasi agama merupakan faktor kuat bagi Muslim Palestina yang melakukan tindakan ini, dengan tujuan untuk menggentarkan musuh dan menimbulkan ketakutan di kalangan mereka.</w:t>
       </w:r>
+      <w:r>
+        <w:rPr>
+          <w:color w:val="000000"/>
+          <w:sz w:val="24"/>
+          <w:szCs w:val="24"/>
+          <w:rFonts w:ascii="Times New Roman" w:cs="Times New Roman" w:eastAsia="Times New Roman" w:hAnsi="Times New Roman"/>
+        </w:rPr>
+      </w:r>
+      <w:r>
+        <w:rPr>
+          <w:rStyle w:val="FootnoteReference"/>
+        </w:rPr>
+        <w:footnoteReference w:id="20"/>
+      </w:r>
+      <w:r>
+        <w:rPr>
+          <w:color w:val="000000"/>
+          <w:sz w:val="24"/>
+          <w:szCs w:val="24"/>
+          <w:rFonts w:ascii="Times New Roman" w:cs="Times New Roman" w:eastAsia="Times New Roman" w:hAnsi="Times New Roman"/>
+        </w:rPr>
+      </w:r>
     </w:p>
     <w:p>
       <w:pPr>
@@ -1068,6 +1508,28 @@
         </w:rPr>
         <w:t xml:space="preserve">Fatwa ini dikeluarkan oleh Yusuf al-Qaradhawi karena banyaknya pertanyaan mengenai tindakan bom bunuh diri yang terjadi di al-Quds Palestina, Tel Aviv, dan Asqalan, yang menyebabkan banyak korban jiwa di kalangan orang Israel. Pertanyaannya adalah apakah tindakan para pemuda yang mengorbankan nyawa mereka dengan cara ini dianggap sebagai syuhada (mati syahid) atau sebagai tindakan bunuh diri (al-intihar) karena mereka mati di tangan mereka sendiri? Apakah tindakan mereka termasuk kategori menceburkan diri ke dalam kebinasaan yang dilarang oleh Allah SWT dalam Al-Qur'an?.</w:t>
       </w:r>
+      <w:r>
+        <w:rPr>
+          <w:color w:val="000000"/>
+          <w:sz w:val="24"/>
+          <w:szCs w:val="24"/>
+          <w:rFonts w:ascii="Times New Roman" w:cs="Times New Roman" w:eastAsia="Times New Roman" w:hAnsi="Times New Roman"/>
+        </w:rPr>
+      </w:r>
+      <w:r>
+        <w:rPr>
+          <w:rStyle w:val="FootnoteReference"/>
+        </w:rPr>
+        <w:footnoteReference w:id="21"/>
+      </w:r>
+      <w:r>
+        <w:rPr>
+          <w:color w:val="000000"/>
+          <w:sz w:val="24"/>
+          <w:szCs w:val="24"/>
+          <w:rFonts w:ascii="Times New Roman" w:cs="Times New Roman" w:eastAsia="Times New Roman" w:hAnsi="Times New Roman"/>
+        </w:rPr>
+      </w:r>
     </w:p>
     <w:p>
       <w:pPr>
@@ -1083,6 +1545,28 @@
           <w:rFonts w:ascii="Times New Roman" w:cs="Times New Roman" w:eastAsia="Times New Roman" w:hAnsi="Times New Roman"/>
         </w:rPr>
         <w:t xml:space="preserve">Al-Qaradawi juga menjelaskan perbedaan antara bunuh diri (al-intihar) dan jihad (‘amaliyah al-istisyhad). Menurutnya, al-intihar dilakukan secara egois untuk kepentingan diri sendiri tanpa memprioritaskan kepentingan agama dan umat Islam, sementara al-mujahid (‘amaliyah al-istisyhad) dilakukan dengan harapan akan pertolongan dan rahmat Allah. Al-intihar merupakan bentuk pelarian dari kenyataan dengan cara bunuh diri, sedangkan al-mujahid (‘amaliyah al-istisyhad) adalah para pejuang yang memerangi musuh Allah dengan menggunakan teknologi atau senjata terbaru, seperti bom bunuh diri, yang ditakdirkan digunakan oleh mereka yang lemah menghadapi musuh yang kuat.</w:t>
+      </w:r>
+      <w:r>
+        <w:rPr>
+          <w:color w:val="000000"/>
+          <w:sz w:val="24"/>
+          <w:szCs w:val="24"/>
+          <w:rFonts w:ascii="Times New Roman" w:cs="Times New Roman" w:eastAsia="Times New Roman" w:hAnsi="Times New Roman"/>
+        </w:rPr>
+      </w:r>
+      <w:r>
+        <w:rPr>
+          <w:rStyle w:val="FootnoteReference"/>
+        </w:rPr>
+        <w:footnoteReference w:id="22"/>
+      </w:r>
+      <w:r>
+        <w:rPr>
+          <w:color w:val="000000"/>
+          <w:sz w:val="24"/>
+          <w:szCs w:val="24"/>
+          <w:rFonts w:ascii="Times New Roman" w:cs="Times New Roman" w:eastAsia="Times New Roman" w:hAnsi="Times New Roman"/>
+        </w:rPr>
       </w:r>
     </w:p>
     <w:p>
@@ -1121,6 +1605,28 @@
         </w:rPr>
         <w:t xml:space="preserve">pandangan ulama yang mengharamkan</w:t>
       </w:r>
+      <w:r>
+        <w:rPr>
+          <w:color w:val="000000"/>
+          <w:sz w:val="24"/>
+          <w:szCs w:val="24"/>
+          <w:rFonts w:ascii="Times New Roman" w:cs="Times New Roman" w:eastAsia="Times New Roman" w:hAnsi="Times New Roman"/>
+        </w:rPr>
+      </w:r>
+      <w:r>
+        <w:rPr>
+          <w:rStyle w:val="FootnoteReference"/>
+        </w:rPr>
+        <w:footnoteReference w:id="23"/>
+      </w:r>
+      <w:r>
+        <w:rPr>
+          <w:color w:val="000000"/>
+          <w:sz w:val="24"/>
+          <w:szCs w:val="24"/>
+          <w:rFonts w:ascii="Times New Roman" w:cs="Times New Roman" w:eastAsia="Times New Roman" w:hAnsi="Times New Roman"/>
+        </w:rPr>
+      </w:r>
     </w:p>
     <w:p>
       <w:pPr>
@@ -1326,6 +1832,28 @@
           <w:rFonts w:ascii="Times New Roman" w:cs="Times New Roman" w:eastAsia="Times New Roman" w:hAnsi="Times New Roman"/>
         </w:rPr>
         <w:t xml:space="preserve">daftar para ulama yang membolehkan dan mengharamkan</w:t>
+      </w:r>
+      <w:r>
+        <w:rPr>
+          <w:color w:val="000000"/>
+          <w:sz w:val="24"/>
+          <w:szCs w:val="24"/>
+          <w:rFonts w:ascii="Times New Roman" w:cs="Times New Roman" w:eastAsia="Times New Roman" w:hAnsi="Times New Roman"/>
+        </w:rPr>
+      </w:r>
+      <w:r>
+        <w:rPr>
+          <w:rStyle w:val="FootnoteReference"/>
+        </w:rPr>
+        <w:footnoteReference w:id="24"/>
+      </w:r>
+      <w:r>
+        <w:rPr>
+          <w:color w:val="000000"/>
+          <w:sz w:val="24"/>
+          <w:szCs w:val="24"/>
+          <w:rFonts w:ascii="Times New Roman" w:cs="Times New Roman" w:eastAsia="Times New Roman" w:hAnsi="Times New Roman"/>
+        </w:rPr>
       </w:r>
     </w:p>
     <w:p>
@@ -1853,6 +2381,258 @@
           <w:szCs w:val="24"/>
           <w:rFonts w:ascii="Times New Roman" w:cs="Times New Roman" w:eastAsia="Times New Roman" w:hAnsi="Times New Roman"/>
         </w:rPr>
+      </w:r>
+    </w:p>
+    <w:p>
+      <w:pPr>
+        <w:spacing w:line="360"/>
+        <w:ind w:left="555" w:hanging="527"/>
+        <w:jc w:val="both"/>
+      </w:pPr>
+      <w:r>
+        <w:rPr>
+          <w:color w:val="000000"/>
+          <w:sz w:val="24"/>
+          <w:szCs w:val="24"/>
+          <w:rFonts w:ascii="Times New Roman" w:cs="Times New Roman" w:eastAsia="Times New Roman" w:hAnsi="Times New Roman"/>
+        </w:rPr>
+        <w:t xml:space="preserve">dasd. asdas. "asdas". </w:t>
+      </w:r>
+      <w:r>
+        <w:rPr>
+          <w:i/>
+          <w:iCs/>
+          <w:color w:val="000000"/>
+          <w:sz w:val="24"/>
+          <w:szCs w:val="24"/>
+          <w:rFonts w:ascii="Times New Roman" w:cs="Times New Roman" w:eastAsia="Times New Roman" w:hAnsi="Times New Roman"/>
+        </w:rPr>
+        <w:t xml:space="preserve">asdasd, </w:t>
+      </w:r>
+      <w:r>
+        <w:rPr>
+          <w:color w:val="000000"/>
+          <w:sz w:val="24"/>
+          <w:szCs w:val="24"/>
+          <w:rFonts w:ascii="Times New Roman" w:cs="Times New Roman" w:eastAsia="Times New Roman" w:hAnsi="Times New Roman"/>
+        </w:rPr>
+        <w:t xml:space="preserve">Vol. asd, No. dasd.</w:t>
+      </w:r>
+    </w:p>
+    <w:p>
+      <w:pPr>
+        <w:spacing w:line="360"/>
+        <w:ind w:left="555" w:hanging="527"/>
+        <w:jc w:val="both"/>
+      </w:pPr>
+      <w:r>
+        <w:rPr>
+          <w:color w:val="000000"/>
+          <w:sz w:val="24"/>
+          <w:szCs w:val="24"/>
+          <w:rFonts w:ascii="Times New Roman" w:cs="Times New Roman" w:eastAsia="Times New Roman" w:hAnsi="Times New Roman"/>
+        </w:rPr>
+        <w:t xml:space="preserve">sda. asd. "asda". </w:t>
+      </w:r>
+      <w:r>
+        <w:rPr>
+          <w:i/>
+          <w:iCs/>
+          <w:color w:val="000000"/>
+          <w:sz w:val="24"/>
+          <w:szCs w:val="24"/>
+          <w:rFonts w:ascii="Times New Roman" w:cs="Times New Roman" w:eastAsia="Times New Roman" w:hAnsi="Times New Roman"/>
+        </w:rPr>
+        <w:t xml:space="preserve">sasd, </w:t>
+      </w:r>
+      <w:r>
+        <w:rPr>
+          <w:color w:val="000000"/>
+          <w:sz w:val="24"/>
+          <w:szCs w:val="24"/>
+          <w:rFonts w:ascii="Times New Roman" w:cs="Times New Roman" w:eastAsia="Times New Roman" w:hAnsi="Times New Roman"/>
+        </w:rPr>
+        <w:t xml:space="preserve">Vol. asd, No. adasd.</w:t>
+      </w:r>
+    </w:p>
+    <w:p>
+      <w:pPr>
+        <w:spacing w:line="360"/>
+        <w:ind w:left="555" w:hanging="527"/>
+        <w:jc w:val="both"/>
+      </w:pPr>
+      <w:r>
+        <w:rPr>
+          <w:color w:val="000000"/>
+          <w:sz w:val="24"/>
+          <w:szCs w:val="24"/>
+          <w:rFonts w:ascii="Times New Roman" w:cs="Times New Roman" w:eastAsia="Times New Roman" w:hAnsi="Times New Roman"/>
+        </w:rPr>
+        <w:t xml:space="preserve">sda. asd. "asda". </w:t>
+      </w:r>
+      <w:r>
+        <w:rPr>
+          <w:i/>
+          <w:iCs/>
+          <w:color w:val="000000"/>
+          <w:sz w:val="24"/>
+          <w:szCs w:val="24"/>
+          <w:rFonts w:ascii="Times New Roman" w:cs="Times New Roman" w:eastAsia="Times New Roman" w:hAnsi="Times New Roman"/>
+        </w:rPr>
+        <w:t xml:space="preserve">sasd, </w:t>
+      </w:r>
+      <w:r>
+        <w:rPr>
+          <w:color w:val="000000"/>
+          <w:sz w:val="24"/>
+          <w:szCs w:val="24"/>
+          <w:rFonts w:ascii="Times New Roman" w:cs="Times New Roman" w:eastAsia="Times New Roman" w:hAnsi="Times New Roman"/>
+        </w:rPr>
+        <w:t xml:space="preserve">Vol. asd, No. adasd.</w:t>
+      </w:r>
+    </w:p>
+    <w:p>
+      <w:pPr>
+        <w:spacing w:line="360"/>
+        <w:ind w:left="555" w:hanging="527"/>
+        <w:jc w:val="both"/>
+      </w:pPr>
+      <w:r>
+        <w:rPr>
+          <w:color w:val="000000"/>
+          <w:sz w:val="24"/>
+          <w:szCs w:val="24"/>
+          <w:rFonts w:ascii="Times New Roman" w:cs="Times New Roman" w:eastAsia="Times New Roman" w:hAnsi="Times New Roman"/>
+        </w:rPr>
+        <w:t xml:space="preserve">sda. asd. "asda". </w:t>
+      </w:r>
+      <w:r>
+        <w:rPr>
+          <w:i/>
+          <w:iCs/>
+          <w:color w:val="000000"/>
+          <w:sz w:val="24"/>
+          <w:szCs w:val="24"/>
+          <w:rFonts w:ascii="Times New Roman" w:cs="Times New Roman" w:eastAsia="Times New Roman" w:hAnsi="Times New Roman"/>
+        </w:rPr>
+        <w:t xml:space="preserve">sasd, </w:t>
+      </w:r>
+      <w:r>
+        <w:rPr>
+          <w:color w:val="000000"/>
+          <w:sz w:val="24"/>
+          <w:szCs w:val="24"/>
+          <w:rFonts w:ascii="Times New Roman" w:cs="Times New Roman" w:eastAsia="Times New Roman" w:hAnsi="Times New Roman"/>
+        </w:rPr>
+        <w:t xml:space="preserve">Vol. asd, No. adasd.</w:t>
+      </w:r>
+    </w:p>
+    <w:p>
+      <w:pPr>
+        <w:spacing w:line="360"/>
+        <w:ind w:left="555" w:hanging="527"/>
+        <w:jc w:val="both"/>
+      </w:pPr>
+      <w:r>
+        <w:rPr>
+          <w:color w:val="000000"/>
+          <w:sz w:val="24"/>
+          <w:szCs w:val="24"/>
+          <w:rFonts w:ascii="Times New Roman" w:cs="Times New Roman" w:eastAsia="Times New Roman" w:hAnsi="Times New Roman"/>
+        </w:rPr>
+        <w:t xml:space="preserve">sda. asd. "asda". </w:t>
+      </w:r>
+      <w:r>
+        <w:rPr>
+          <w:i/>
+          <w:iCs/>
+          <w:color w:val="000000"/>
+          <w:sz w:val="24"/>
+          <w:szCs w:val="24"/>
+          <w:rFonts w:ascii="Times New Roman" w:cs="Times New Roman" w:eastAsia="Times New Roman" w:hAnsi="Times New Roman"/>
+        </w:rPr>
+        <w:t xml:space="preserve">sasd, </w:t>
+      </w:r>
+      <w:r>
+        <w:rPr>
+          <w:color w:val="000000"/>
+          <w:sz w:val="24"/>
+          <w:szCs w:val="24"/>
+          <w:rFonts w:ascii="Times New Roman" w:cs="Times New Roman" w:eastAsia="Times New Roman" w:hAnsi="Times New Roman"/>
+        </w:rPr>
+        <w:t xml:space="preserve">Vol. asd, No. adasd.</w:t>
+      </w:r>
+    </w:p>
+    <w:p>
+      <w:pPr>
+        <w:spacing w:line="360"/>
+        <w:ind w:left="555" w:hanging="527"/>
+        <w:jc w:val="both"/>
+      </w:pPr>
+      <w:r>
+        <w:rPr>
+          <w:color w:val="000000"/>
+          <w:sz w:val="24"/>
+          <w:szCs w:val="24"/>
+          <w:rFonts w:ascii="Times New Roman" w:cs="Times New Roman" w:eastAsia="Times New Roman" w:hAnsi="Times New Roman"/>
+        </w:rPr>
+        <w:t xml:space="preserve">sda. asd. "asda". </w:t>
+      </w:r>
+      <w:r>
+        <w:rPr>
+          <w:i/>
+          <w:iCs/>
+          <w:color w:val="000000"/>
+          <w:sz w:val="24"/>
+          <w:szCs w:val="24"/>
+          <w:rFonts w:ascii="Times New Roman" w:cs="Times New Roman" w:eastAsia="Times New Roman" w:hAnsi="Times New Roman"/>
+        </w:rPr>
+        <w:t xml:space="preserve">sasd, </w:t>
+      </w:r>
+      <w:r>
+        <w:rPr>
+          <w:color w:val="000000"/>
+          <w:sz w:val="24"/>
+          <w:szCs w:val="24"/>
+          <w:rFonts w:ascii="Times New Roman" w:cs="Times New Roman" w:eastAsia="Times New Roman" w:hAnsi="Times New Roman"/>
+        </w:rPr>
+        <w:t xml:space="preserve">Vol. asd, No. adasd.</w:t>
+      </w:r>
+    </w:p>
+    <w:p>
+      <w:pPr>
+        <w:spacing w:line="360"/>
+        <w:ind w:left="555" w:hanging="527"/>
+        <w:jc w:val="both"/>
+      </w:pPr>
+      <w:r>
+        <w:rPr>
+          <w:color w:val="000000"/>
+          <w:sz w:val="24"/>
+          <w:szCs w:val="24"/>
+          <w:rFonts w:ascii="Times New Roman" w:cs="Times New Roman" w:eastAsia="Times New Roman" w:hAnsi="Times New Roman"/>
+        </w:rPr>
+        <w:t xml:space="preserve">asd. aswda. "asd". </w:t>
+      </w:r>
+      <w:r>
+        <w:rPr>
+          <w:i/>
+          <w:iCs/>
+          <w:color w:val="000000"/>
+          <w:sz w:val="24"/>
+          <w:szCs w:val="24"/>
+          <w:rFonts w:ascii="Times New Roman" w:cs="Times New Roman" w:eastAsia="Times New Roman" w:hAnsi="Times New Roman"/>
+        </w:rPr>
+        <w:t xml:space="preserve">asd, </w:t>
+      </w:r>
+      <w:r>
+        <w:rPr>
+          <w:color w:val="000000"/>
+          <w:sz w:val="24"/>
+          <w:szCs w:val="24"/>
+          <w:rFonts w:ascii="Times New Roman" w:cs="Times New Roman" w:eastAsia="Times New Roman" w:hAnsi="Times New Roman"/>
+        </w:rPr>
+        <w:t xml:space="preserve">Vol. sdas, No. ds.</w:t>
       </w:r>
     </w:p>
     <w:sectPr>
@@ -1953,6 +2733,868 @@
       </w:r>
       <w:r>
         <w:continuationSeparator/>
+      </w:r>
+    </w:p>
+  </w:footnote>
+  <w:footnote w:id="1">
+    <w:p>
+      <w:pPr>
+        <w:spacing w:line="240"/>
+        <w:ind w:left="0" w:firstLine="272"/>
+        <w:jc w:val="both"/>
+      </w:pPr>
+      <w:r>
+        <w:rPr>
+          <w:rStyle w:val="FootnoteReference"/>
+        </w:rPr>
+        <w:footnoteRef/>
+      </w:r>
+      <w:r>
+        <w:rPr>
+          <w:color w:val="000000"/>
+          <w:sz w:val="20"/>
+          <w:szCs w:val="20"/>
+          <w:rFonts w:ascii="Times New Roman" w:cs="Times New Roman" w:eastAsia="Times New Roman" w:hAnsi="Times New Roman"/>
+        </w:rPr>
+        <w:t xml:space="preserve">asd, "asd", </w:t>
+      </w:r>
+      <w:r>
+        <w:rPr>
+          <w:i/>
+          <w:iCs/>
+          <w:color w:val="000000"/>
+          <w:sz w:val="20"/>
+          <w:szCs w:val="20"/>
+          <w:rFonts w:ascii="Times New Roman" w:cs="Times New Roman" w:eastAsia="Times New Roman" w:hAnsi="Times New Roman"/>
+        </w:rPr>
+        <w:t xml:space="preserve">asd, </w:t>
+      </w:r>
+      <w:r>
+        <w:rPr>
+          <w:color w:val="000000"/>
+          <w:sz w:val="20"/>
+          <w:szCs w:val="20"/>
+          <w:rFonts w:ascii="Times New Roman" w:cs="Times New Roman" w:eastAsia="Times New Roman" w:hAnsi="Times New Roman"/>
+        </w:rPr>
+        <w:t xml:space="preserve">Vol. sdas, No. ds (aswda), Hal. dasdas.</w:t>
+      </w:r>
+    </w:p>
+  </w:footnote>
+  <w:footnote w:id="2">
+    <w:p>
+      <w:pPr>
+        <w:spacing w:line="240"/>
+        <w:ind w:left="0" w:firstLine="272"/>
+        <w:jc w:val="both"/>
+      </w:pPr>
+      <w:r>
+        <w:rPr>
+          <w:rStyle w:val="FootnoteReference"/>
+        </w:rPr>
+        <w:footnoteRef/>
+      </w:r>
+      <w:r>
+        <w:rPr>
+          <w:color w:val="000000"/>
+          <w:sz w:val="20"/>
+          <w:szCs w:val="20"/>
+          <w:rFonts w:ascii="Times New Roman" w:cs="Times New Roman" w:eastAsia="Times New Roman" w:hAnsi="Times New Roman"/>
+        </w:rPr>
+        <w:t xml:space="preserve">sda, "asda", </w:t>
+      </w:r>
+      <w:r>
+        <w:rPr>
+          <w:i/>
+          <w:iCs/>
+          <w:color w:val="000000"/>
+          <w:sz w:val="20"/>
+          <w:szCs w:val="20"/>
+          <w:rFonts w:ascii="Times New Roman" w:cs="Times New Roman" w:eastAsia="Times New Roman" w:hAnsi="Times New Roman"/>
+        </w:rPr>
+        <w:t xml:space="preserve">sasd, </w:t>
+      </w:r>
+      <w:r>
+        <w:rPr>
+          <w:color w:val="000000"/>
+          <w:sz w:val="20"/>
+          <w:szCs w:val="20"/>
+          <w:rFonts w:ascii="Times New Roman" w:cs="Times New Roman" w:eastAsia="Times New Roman" w:hAnsi="Times New Roman"/>
+        </w:rPr>
+        <w:t xml:space="preserve">Vol. asd, No. adasd (asd), Hal. asdasd.</w:t>
+      </w:r>
+    </w:p>
+  </w:footnote>
+  <w:footnote w:id="3">
+    <w:p>
+      <w:pPr>
+        <w:spacing w:line="240"/>
+        <w:ind w:left="0" w:firstLine="272"/>
+        <w:jc w:val="both"/>
+      </w:pPr>
+      <w:r>
+        <w:rPr>
+          <w:rStyle w:val="FootnoteReference"/>
+        </w:rPr>
+        <w:footnoteRef/>
+      </w:r>
+      <w:r>
+        <w:rPr>
+          <w:color w:val="000000"/>
+          <w:sz w:val="20"/>
+          <w:szCs w:val="20"/>
+          <w:rFonts w:ascii="Times New Roman" w:cs="Times New Roman" w:eastAsia="Times New Roman" w:hAnsi="Times New Roman"/>
+        </w:rPr>
+        <w:t xml:space="preserve">Ibid.,</w:t>
+      </w:r>
+      <w:r>
+        <w:rPr>
+          <w:color w:val="000000"/>
+          <w:sz w:val="20"/>
+          <w:szCs w:val="20"/>
+          <w:rFonts w:ascii="Times New Roman" w:cs="Times New Roman" w:eastAsia="Times New Roman" w:hAnsi="Times New Roman"/>
+        </w:rPr>
+        <w:t xml:space="preserve">1</w:t>
+      </w:r>
+    </w:p>
+  </w:footnote>
+  <w:footnote w:id="4">
+    <w:p>
+      <w:pPr>
+        <w:spacing w:line="240"/>
+        <w:ind w:left="0" w:firstLine="272"/>
+        <w:jc w:val="both"/>
+      </w:pPr>
+      <w:r>
+        <w:rPr>
+          <w:rStyle w:val="FootnoteReference"/>
+        </w:rPr>
+        <w:footnoteRef/>
+      </w:r>
+      <w:r>
+        <w:rPr>
+          <w:color w:val="000000"/>
+          <w:sz w:val="20"/>
+          <w:szCs w:val="20"/>
+          <w:rFonts w:ascii="Times New Roman" w:cs="Times New Roman" w:eastAsia="Times New Roman" w:hAnsi="Times New Roman"/>
+        </w:rPr>
+        <w:t xml:space="preserve">Ibid.,</w:t>
+      </w:r>
+      <w:r>
+        <w:rPr>
+          <w:color w:val="000000"/>
+          <w:sz w:val="20"/>
+          <w:szCs w:val="20"/>
+          <w:rFonts w:ascii="Times New Roman" w:cs="Times New Roman" w:eastAsia="Times New Roman" w:hAnsi="Times New Roman"/>
+        </w:rPr>
+      </w:r>
+    </w:p>
+  </w:footnote>
+  <w:footnote w:id="5">
+    <w:p>
+      <w:pPr>
+        <w:spacing w:line="240"/>
+        <w:ind w:left="0" w:firstLine="272"/>
+        <w:jc w:val="both"/>
+      </w:pPr>
+      <w:r>
+        <w:rPr>
+          <w:rStyle w:val="FootnoteReference"/>
+        </w:rPr>
+        <w:footnoteRef/>
+      </w:r>
+      <w:r>
+        <w:rPr>
+          <w:color w:val="000000"/>
+          <w:sz w:val="20"/>
+          <w:szCs w:val="20"/>
+          <w:rFonts w:ascii="Times New Roman" w:cs="Times New Roman" w:eastAsia="Times New Roman" w:hAnsi="Times New Roman"/>
+        </w:rPr>
+        <w:t xml:space="preserve">Ibid.,</w:t>
+      </w:r>
+      <w:r>
+        <w:rPr>
+          <w:color w:val="000000"/>
+          <w:sz w:val="20"/>
+          <w:szCs w:val="20"/>
+          <w:rFonts w:ascii="Times New Roman" w:cs="Times New Roman" w:eastAsia="Times New Roman" w:hAnsi="Times New Roman"/>
+        </w:rPr>
+      </w:r>
+    </w:p>
+  </w:footnote>
+  <w:footnote w:id="6">
+    <w:p>
+      <w:pPr>
+        <w:spacing w:line="240"/>
+        <w:ind w:left="0" w:firstLine="272"/>
+        <w:jc w:val="both"/>
+      </w:pPr>
+      <w:r>
+        <w:rPr>
+          <w:rStyle w:val="FootnoteReference"/>
+        </w:rPr>
+        <w:footnoteRef/>
+      </w:r>
+      <w:r>
+        <w:rPr>
+          <w:color w:val="000000"/>
+          <w:sz w:val="20"/>
+          <w:szCs w:val="20"/>
+          <w:rFonts w:ascii="Times New Roman" w:cs="Times New Roman" w:eastAsia="Times New Roman" w:hAnsi="Times New Roman"/>
+        </w:rPr>
+        <w:t xml:space="preserve">sda, "asda", </w:t>
+      </w:r>
+      <w:r>
+        <w:rPr>
+          <w:i/>
+          <w:iCs/>
+          <w:color w:val="000000"/>
+          <w:sz w:val="20"/>
+          <w:szCs w:val="20"/>
+          <w:rFonts w:ascii="Times New Roman" w:cs="Times New Roman" w:eastAsia="Times New Roman" w:hAnsi="Times New Roman"/>
+        </w:rPr>
+        <w:t xml:space="preserve">sasd, </w:t>
+      </w:r>
+      <w:r>
+        <w:rPr>
+          <w:color w:val="000000"/>
+          <w:sz w:val="20"/>
+          <w:szCs w:val="20"/>
+          <w:rFonts w:ascii="Times New Roman" w:cs="Times New Roman" w:eastAsia="Times New Roman" w:hAnsi="Times New Roman"/>
+        </w:rPr>
+        <w:t xml:space="preserve">Vol. asd, No. adasd (asd), Hal. asdasd.</w:t>
+      </w:r>
+    </w:p>
+  </w:footnote>
+  <w:footnote w:id="7">
+    <w:p>
+      <w:pPr>
+        <w:spacing w:line="240"/>
+        <w:ind w:left="0" w:firstLine="272"/>
+        <w:jc w:val="both"/>
+      </w:pPr>
+      <w:r>
+        <w:rPr>
+          <w:rStyle w:val="FootnoteReference"/>
+        </w:rPr>
+        <w:footnoteRef/>
+      </w:r>
+      <w:r>
+        <w:rPr>
+          <w:color w:val="000000"/>
+          <w:sz w:val="20"/>
+          <w:szCs w:val="20"/>
+          <w:rFonts w:ascii="Times New Roman" w:cs="Times New Roman" w:eastAsia="Times New Roman" w:hAnsi="Times New Roman"/>
+        </w:rPr>
+        <w:t xml:space="preserve">sda, "asda", </w:t>
+      </w:r>
+      <w:r>
+        <w:rPr>
+          <w:i/>
+          <w:iCs/>
+          <w:color w:val="000000"/>
+          <w:sz w:val="20"/>
+          <w:szCs w:val="20"/>
+          <w:rFonts w:ascii="Times New Roman" w:cs="Times New Roman" w:eastAsia="Times New Roman" w:hAnsi="Times New Roman"/>
+        </w:rPr>
+        <w:t xml:space="preserve">sasd, </w:t>
+      </w:r>
+      <w:r>
+        <w:rPr>
+          <w:color w:val="000000"/>
+          <w:sz w:val="20"/>
+          <w:szCs w:val="20"/>
+          <w:rFonts w:ascii="Times New Roman" w:cs="Times New Roman" w:eastAsia="Times New Roman" w:hAnsi="Times New Roman"/>
+        </w:rPr>
+        <w:t xml:space="preserve">Vol. asd, No. adasd (asd), Hal. asdasd.</w:t>
+      </w:r>
+    </w:p>
+  </w:footnote>
+  <w:footnote w:id="8">
+    <w:p>
+      <w:pPr>
+        <w:spacing w:line="240"/>
+        <w:ind w:left="0" w:firstLine="272"/>
+        <w:jc w:val="both"/>
+      </w:pPr>
+      <w:r>
+        <w:rPr>
+          <w:rStyle w:val="FootnoteReference"/>
+        </w:rPr>
+        <w:footnoteRef/>
+      </w:r>
+      <w:r>
+        <w:rPr>
+          <w:color w:val="000000"/>
+          <w:sz w:val="20"/>
+          <w:szCs w:val="20"/>
+          <w:rFonts w:ascii="Times New Roman" w:cs="Times New Roman" w:eastAsia="Times New Roman" w:hAnsi="Times New Roman"/>
+        </w:rPr>
+        <w:t xml:space="preserve">Ibid.,</w:t>
+      </w:r>
+      <w:r>
+        <w:rPr>
+          <w:color w:val="000000"/>
+          <w:sz w:val="20"/>
+          <w:szCs w:val="20"/>
+          <w:rFonts w:ascii="Times New Roman" w:cs="Times New Roman" w:eastAsia="Times New Roman" w:hAnsi="Times New Roman"/>
+        </w:rPr>
+      </w:r>
+    </w:p>
+  </w:footnote>
+  <w:footnote w:id="9">
+    <w:p>
+      <w:pPr>
+        <w:spacing w:line="240"/>
+        <w:ind w:left="0" w:firstLine="272"/>
+        <w:jc w:val="both"/>
+      </w:pPr>
+      <w:r>
+        <w:rPr>
+          <w:rStyle w:val="FootnoteReference"/>
+        </w:rPr>
+        <w:footnoteRef/>
+      </w:r>
+      <w:r>
+        <w:rPr>
+          <w:color w:val="000000"/>
+          <w:sz w:val="20"/>
+          <w:szCs w:val="20"/>
+          <w:rFonts w:ascii="Times New Roman" w:cs="Times New Roman" w:eastAsia="Times New Roman" w:hAnsi="Times New Roman"/>
+        </w:rPr>
+        <w:t xml:space="preserve">Ibid.,</w:t>
+      </w:r>
+      <w:r>
+        <w:rPr>
+          <w:color w:val="000000"/>
+          <w:sz w:val="20"/>
+          <w:szCs w:val="20"/>
+          <w:rFonts w:ascii="Times New Roman" w:cs="Times New Roman" w:eastAsia="Times New Roman" w:hAnsi="Times New Roman"/>
+        </w:rPr>
+      </w:r>
+    </w:p>
+  </w:footnote>
+  <w:footnote w:id="10">
+    <w:p>
+      <w:pPr>
+        <w:spacing w:line="240"/>
+        <w:ind w:left="0" w:firstLine="272"/>
+        <w:jc w:val="both"/>
+      </w:pPr>
+      <w:r>
+        <w:rPr>
+          <w:rStyle w:val="FootnoteReference"/>
+        </w:rPr>
+        <w:footnoteRef/>
+      </w:r>
+      <w:r>
+        <w:rPr>
+          <w:color w:val="000000"/>
+          <w:sz w:val="20"/>
+          <w:szCs w:val="20"/>
+          <w:rFonts w:ascii="Times New Roman" w:cs="Times New Roman" w:eastAsia="Times New Roman" w:hAnsi="Times New Roman"/>
+        </w:rPr>
+        <w:t xml:space="preserve">asd, </w:t>
+      </w:r>
+      <w:r>
+        <w:rPr>
+          <w:i/>
+          <w:iCs/>
+          <w:color w:val="000000"/>
+          <w:sz w:val="20"/>
+          <w:szCs w:val="20"/>
+          <w:rFonts w:ascii="Times New Roman" w:cs="Times New Roman" w:eastAsia="Times New Roman" w:hAnsi="Times New Roman"/>
+        </w:rPr>
+        <w:t xml:space="preserve">Loc.Cit., </w:t>
+      </w:r>
+    </w:p>
+  </w:footnote>
+  <w:footnote w:id="11">
+    <w:p>
+      <w:pPr>
+        <w:spacing w:line="240"/>
+        <w:ind w:left="0" w:firstLine="272"/>
+        <w:jc w:val="both"/>
+      </w:pPr>
+      <w:r>
+        <w:rPr>
+          <w:rStyle w:val="FootnoteReference"/>
+        </w:rPr>
+        <w:footnoteRef/>
+      </w:r>
+      <w:r>
+        <w:rPr>
+          <w:color w:val="000000"/>
+          <w:sz w:val="20"/>
+          <w:szCs w:val="20"/>
+          <w:rFonts w:ascii="Times New Roman" w:cs="Times New Roman" w:eastAsia="Times New Roman" w:hAnsi="Times New Roman"/>
+        </w:rPr>
+        <w:t xml:space="preserve">Ibid.,</w:t>
+      </w:r>
+      <w:r>
+        <w:rPr>
+          <w:color w:val="000000"/>
+          <w:sz w:val="20"/>
+          <w:szCs w:val="20"/>
+          <w:rFonts w:ascii="Times New Roman" w:cs="Times New Roman" w:eastAsia="Times New Roman" w:hAnsi="Times New Roman"/>
+        </w:rPr>
+      </w:r>
+    </w:p>
+  </w:footnote>
+  <w:footnote w:id="12">
+    <w:p>
+      <w:pPr>
+        <w:spacing w:line="240"/>
+        <w:ind w:left="0" w:firstLine="272"/>
+        <w:jc w:val="both"/>
+      </w:pPr>
+      <w:r>
+        <w:rPr>
+          <w:rStyle w:val="FootnoteReference"/>
+        </w:rPr>
+        <w:footnoteRef/>
+      </w:r>
+      <w:r>
+        <w:rPr>
+          <w:color w:val="000000"/>
+          <w:sz w:val="20"/>
+          <w:szCs w:val="20"/>
+          <w:rFonts w:ascii="Times New Roman" w:cs="Times New Roman" w:eastAsia="Times New Roman" w:hAnsi="Times New Roman"/>
+        </w:rPr>
+        <w:t xml:space="preserve">Ibid.,</w:t>
+      </w:r>
+      <w:r>
+        <w:rPr>
+          <w:color w:val="000000"/>
+          <w:sz w:val="20"/>
+          <w:szCs w:val="20"/>
+          <w:rFonts w:ascii="Times New Roman" w:cs="Times New Roman" w:eastAsia="Times New Roman" w:hAnsi="Times New Roman"/>
+        </w:rPr>
+      </w:r>
+    </w:p>
+  </w:footnote>
+  <w:footnote w:id="13">
+    <w:p>
+      <w:pPr>
+        <w:spacing w:line="240"/>
+        <w:ind w:left="0" w:firstLine="272"/>
+        <w:jc w:val="both"/>
+      </w:pPr>
+      <w:r>
+        <w:rPr>
+          <w:rStyle w:val="FootnoteReference"/>
+        </w:rPr>
+        <w:footnoteRef/>
+      </w:r>
+      <w:r>
+        <w:rPr>
+          <w:color w:val="000000"/>
+          <w:sz w:val="20"/>
+          <w:szCs w:val="20"/>
+          <w:rFonts w:ascii="Times New Roman" w:cs="Times New Roman" w:eastAsia="Times New Roman" w:hAnsi="Times New Roman"/>
+        </w:rPr>
+        <w:t xml:space="preserve">Ibid.,</w:t>
+      </w:r>
+      <w:r>
+        <w:rPr>
+          <w:color w:val="000000"/>
+          <w:sz w:val="20"/>
+          <w:szCs w:val="20"/>
+          <w:rFonts w:ascii="Times New Roman" w:cs="Times New Roman" w:eastAsia="Times New Roman" w:hAnsi="Times New Roman"/>
+        </w:rPr>
+      </w:r>
+    </w:p>
+  </w:footnote>
+  <w:footnote w:id="14">
+    <w:p>
+      <w:pPr>
+        <w:spacing w:line="240"/>
+        <w:ind w:left="0" w:firstLine="272"/>
+        <w:jc w:val="both"/>
+      </w:pPr>
+      <w:r>
+        <w:rPr>
+          <w:rStyle w:val="FootnoteReference"/>
+        </w:rPr>
+        <w:footnoteRef/>
+      </w:r>
+      <w:r>
+        <w:rPr>
+          <w:color w:val="000000"/>
+          <w:sz w:val="20"/>
+          <w:szCs w:val="20"/>
+          <w:rFonts w:ascii="Times New Roman" w:cs="Times New Roman" w:eastAsia="Times New Roman" w:hAnsi="Times New Roman"/>
+        </w:rPr>
+        <w:t xml:space="preserve">Ibid.,</w:t>
+      </w:r>
+      <w:r>
+        <w:rPr>
+          <w:color w:val="000000"/>
+          <w:sz w:val="20"/>
+          <w:szCs w:val="20"/>
+          <w:rFonts w:ascii="Times New Roman" w:cs="Times New Roman" w:eastAsia="Times New Roman" w:hAnsi="Times New Roman"/>
+        </w:rPr>
+      </w:r>
+    </w:p>
+  </w:footnote>
+  <w:footnote w:id="15">
+    <w:p>
+      <w:pPr>
+        <w:spacing w:line="240"/>
+        <w:ind w:left="0" w:firstLine="272"/>
+        <w:jc w:val="both"/>
+      </w:pPr>
+      <w:r>
+        <w:rPr>
+          <w:rStyle w:val="FootnoteReference"/>
+        </w:rPr>
+        <w:footnoteRef/>
+      </w:r>
+      <w:r>
+        <w:rPr>
+          <w:color w:val="000000"/>
+          <w:sz w:val="20"/>
+          <w:szCs w:val="20"/>
+          <w:rFonts w:ascii="Times New Roman" w:cs="Times New Roman" w:eastAsia="Times New Roman" w:hAnsi="Times New Roman"/>
+        </w:rPr>
+        <w:t xml:space="preserve">Ibid.,</w:t>
+      </w:r>
+      <w:r>
+        <w:rPr>
+          <w:color w:val="000000"/>
+          <w:sz w:val="20"/>
+          <w:szCs w:val="20"/>
+          <w:rFonts w:ascii="Times New Roman" w:cs="Times New Roman" w:eastAsia="Times New Roman" w:hAnsi="Times New Roman"/>
+        </w:rPr>
+      </w:r>
+    </w:p>
+  </w:footnote>
+  <w:footnote w:id="16">
+    <w:p>
+      <w:pPr>
+        <w:spacing w:line="240"/>
+        <w:ind w:left="0" w:firstLine="272"/>
+        <w:jc w:val="both"/>
+      </w:pPr>
+      <w:r>
+        <w:rPr>
+          <w:rStyle w:val="FootnoteReference"/>
+        </w:rPr>
+        <w:footnoteRef/>
+      </w:r>
+      <w:r>
+        <w:rPr>
+          <w:color w:val="000000"/>
+          <w:sz w:val="20"/>
+          <w:szCs w:val="20"/>
+          <w:rFonts w:ascii="Times New Roman" w:cs="Times New Roman" w:eastAsia="Times New Roman" w:hAnsi="Times New Roman"/>
+        </w:rPr>
+        <w:t xml:space="preserve">dasd, "asdas", </w:t>
+      </w:r>
+      <w:r>
+        <w:rPr>
+          <w:i/>
+          <w:iCs/>
+          <w:color w:val="000000"/>
+          <w:sz w:val="20"/>
+          <w:szCs w:val="20"/>
+          <w:rFonts w:ascii="Times New Roman" w:cs="Times New Roman" w:eastAsia="Times New Roman" w:hAnsi="Times New Roman"/>
+        </w:rPr>
+        <w:t xml:space="preserve">asdasd, </w:t>
+      </w:r>
+      <w:r>
+        <w:rPr>
+          <w:color w:val="000000"/>
+          <w:sz w:val="20"/>
+          <w:szCs w:val="20"/>
+          <w:rFonts w:ascii="Times New Roman" w:cs="Times New Roman" w:eastAsia="Times New Roman" w:hAnsi="Times New Roman"/>
+        </w:rPr>
+        <w:t xml:space="preserve">Vol. asd, No. dasd (asdas), Hal. asdasd.</w:t>
+      </w:r>
+    </w:p>
+  </w:footnote>
+  <w:footnote w:id="17">
+    <w:p>
+      <w:pPr>
+        <w:spacing w:line="240"/>
+        <w:ind w:left="0" w:firstLine="272"/>
+        <w:jc w:val="both"/>
+      </w:pPr>
+      <w:r>
+        <w:rPr>
+          <w:rStyle w:val="FootnoteReference"/>
+        </w:rPr>
+        <w:footnoteRef/>
+      </w:r>
+      <w:r>
+        <w:rPr>
+          <w:color w:val="000000"/>
+          <w:sz w:val="20"/>
+          <w:szCs w:val="20"/>
+          <w:rFonts w:ascii="Times New Roman" w:cs="Times New Roman" w:eastAsia="Times New Roman" w:hAnsi="Times New Roman"/>
+        </w:rPr>
+        <w:t xml:space="preserve">Ibid.,</w:t>
+      </w:r>
+      <w:r>
+        <w:rPr>
+          <w:color w:val="000000"/>
+          <w:sz w:val="20"/>
+          <w:szCs w:val="20"/>
+          <w:rFonts w:ascii="Times New Roman" w:cs="Times New Roman" w:eastAsia="Times New Roman" w:hAnsi="Times New Roman"/>
+        </w:rPr>
+      </w:r>
+    </w:p>
+  </w:footnote>
+  <w:footnote w:id="18">
+    <w:p>
+      <w:pPr>
+        <w:spacing w:line="240"/>
+        <w:ind w:left="0" w:firstLine="272"/>
+        <w:jc w:val="both"/>
+      </w:pPr>
+      <w:r>
+        <w:rPr>
+          <w:rStyle w:val="FootnoteReference"/>
+        </w:rPr>
+        <w:footnoteRef/>
+      </w:r>
+      <w:r>
+        <w:rPr>
+          <w:color w:val="000000"/>
+          <w:sz w:val="20"/>
+          <w:szCs w:val="20"/>
+          <w:rFonts w:ascii="Times New Roman" w:cs="Times New Roman" w:eastAsia="Times New Roman" w:hAnsi="Times New Roman"/>
+        </w:rPr>
+        <w:t xml:space="preserve">sda, "asda", </w:t>
+      </w:r>
+      <w:r>
+        <w:rPr>
+          <w:i/>
+          <w:iCs/>
+          <w:color w:val="000000"/>
+          <w:sz w:val="20"/>
+          <w:szCs w:val="20"/>
+          <w:rFonts w:ascii="Times New Roman" w:cs="Times New Roman" w:eastAsia="Times New Roman" w:hAnsi="Times New Roman"/>
+        </w:rPr>
+        <w:t xml:space="preserve">sasd, </w:t>
+      </w:r>
+      <w:r>
+        <w:rPr>
+          <w:color w:val="000000"/>
+          <w:sz w:val="20"/>
+          <w:szCs w:val="20"/>
+          <w:rFonts w:ascii="Times New Roman" w:cs="Times New Roman" w:eastAsia="Times New Roman" w:hAnsi="Times New Roman"/>
+        </w:rPr>
+        <w:t xml:space="preserve">Vol. asd, No. adasd (asd), Hal. asdasd.</w:t>
+      </w:r>
+    </w:p>
+  </w:footnote>
+  <w:footnote w:id="19">
+    <w:p>
+      <w:pPr>
+        <w:spacing w:line="240"/>
+        <w:ind w:left="0" w:firstLine="272"/>
+        <w:jc w:val="both"/>
+      </w:pPr>
+      <w:r>
+        <w:rPr>
+          <w:rStyle w:val="FootnoteReference"/>
+        </w:rPr>
+        <w:footnoteRef/>
+      </w:r>
+      <w:r>
+        <w:rPr>
+          <w:color w:val="000000"/>
+          <w:sz w:val="20"/>
+          <w:szCs w:val="20"/>
+          <w:rFonts w:ascii="Times New Roman" w:cs="Times New Roman" w:eastAsia="Times New Roman" w:hAnsi="Times New Roman"/>
+        </w:rPr>
+        <w:t xml:space="preserve">Ibid.,</w:t>
+      </w:r>
+      <w:r>
+        <w:rPr>
+          <w:color w:val="000000"/>
+          <w:sz w:val="20"/>
+          <w:szCs w:val="20"/>
+          <w:rFonts w:ascii="Times New Roman" w:cs="Times New Roman" w:eastAsia="Times New Roman" w:hAnsi="Times New Roman"/>
+        </w:rPr>
+      </w:r>
+    </w:p>
+  </w:footnote>
+  <w:footnote w:id="20">
+    <w:p>
+      <w:pPr>
+        <w:spacing w:line="240"/>
+        <w:ind w:left="0" w:firstLine="272"/>
+        <w:jc w:val="both"/>
+      </w:pPr>
+      <w:r>
+        <w:rPr>
+          <w:rStyle w:val="FootnoteReference"/>
+        </w:rPr>
+        <w:footnoteRef/>
+      </w:r>
+      <w:r>
+        <w:rPr>
+          <w:color w:val="000000"/>
+          <w:sz w:val="20"/>
+          <w:szCs w:val="20"/>
+          <w:rFonts w:ascii="Times New Roman" w:cs="Times New Roman" w:eastAsia="Times New Roman" w:hAnsi="Times New Roman"/>
+        </w:rPr>
+        <w:t xml:space="preserve">sda, "asda", </w:t>
+      </w:r>
+      <w:r>
+        <w:rPr>
+          <w:i/>
+          <w:iCs/>
+          <w:color w:val="000000"/>
+          <w:sz w:val="20"/>
+          <w:szCs w:val="20"/>
+          <w:rFonts w:ascii="Times New Roman" w:cs="Times New Roman" w:eastAsia="Times New Roman" w:hAnsi="Times New Roman"/>
+        </w:rPr>
+        <w:t xml:space="preserve">sasd, </w:t>
+      </w:r>
+      <w:r>
+        <w:rPr>
+          <w:color w:val="000000"/>
+          <w:sz w:val="20"/>
+          <w:szCs w:val="20"/>
+          <w:rFonts w:ascii="Times New Roman" w:cs="Times New Roman" w:eastAsia="Times New Roman" w:hAnsi="Times New Roman"/>
+        </w:rPr>
+        <w:t xml:space="preserve">Vol. asd, No. adasd (asd), Hal. asdasd.</w:t>
+      </w:r>
+    </w:p>
+  </w:footnote>
+  <w:footnote w:id="21">
+    <w:p>
+      <w:pPr>
+        <w:spacing w:line="240"/>
+        <w:ind w:left="0" w:firstLine="272"/>
+        <w:jc w:val="both"/>
+      </w:pPr>
+      <w:r>
+        <w:rPr>
+          <w:rStyle w:val="FootnoteReference"/>
+        </w:rPr>
+        <w:footnoteRef/>
+      </w:r>
+      <w:r>
+        <w:rPr>
+          <w:color w:val="000000"/>
+          <w:sz w:val="20"/>
+          <w:szCs w:val="20"/>
+          <w:rFonts w:ascii="Times New Roman" w:cs="Times New Roman" w:eastAsia="Times New Roman" w:hAnsi="Times New Roman"/>
+        </w:rPr>
+        <w:t xml:space="preserve">Ibid.,</w:t>
+      </w:r>
+      <w:r>
+        <w:rPr>
+          <w:color w:val="000000"/>
+          <w:sz w:val="20"/>
+          <w:szCs w:val="20"/>
+          <w:rFonts w:ascii="Times New Roman" w:cs="Times New Roman" w:eastAsia="Times New Roman" w:hAnsi="Times New Roman"/>
+        </w:rPr>
+      </w:r>
+    </w:p>
+  </w:footnote>
+  <w:footnote w:id="22">
+    <w:p>
+      <w:pPr>
+        <w:spacing w:line="240"/>
+        <w:ind w:left="0" w:firstLine="272"/>
+        <w:jc w:val="both"/>
+      </w:pPr>
+      <w:r>
+        <w:rPr>
+          <w:rStyle w:val="FootnoteReference"/>
+        </w:rPr>
+        <w:footnoteRef/>
+      </w:r>
+      <w:r>
+        <w:rPr>
+          <w:color w:val="000000"/>
+          <w:sz w:val="20"/>
+          <w:szCs w:val="20"/>
+          <w:rFonts w:ascii="Times New Roman" w:cs="Times New Roman" w:eastAsia="Times New Roman" w:hAnsi="Times New Roman"/>
+        </w:rPr>
+        <w:t xml:space="preserve">Ibid.,</w:t>
+      </w:r>
+      <w:r>
+        <w:rPr>
+          <w:color w:val="000000"/>
+          <w:sz w:val="20"/>
+          <w:szCs w:val="20"/>
+          <w:rFonts w:ascii="Times New Roman" w:cs="Times New Roman" w:eastAsia="Times New Roman" w:hAnsi="Times New Roman"/>
+        </w:rPr>
+      </w:r>
+    </w:p>
+  </w:footnote>
+  <w:footnote w:id="23">
+    <w:p>
+      <w:pPr>
+        <w:spacing w:line="240"/>
+        <w:ind w:left="0" w:firstLine="272"/>
+        <w:jc w:val="both"/>
+      </w:pPr>
+      <w:r>
+        <w:rPr>
+          <w:rStyle w:val="FootnoteReference"/>
+        </w:rPr>
+        <w:footnoteRef/>
+      </w:r>
+      <w:r>
+        <w:rPr>
+          <w:color w:val="000000"/>
+          <w:sz w:val="20"/>
+          <w:szCs w:val="20"/>
+          <w:rFonts w:ascii="Times New Roman" w:cs="Times New Roman" w:eastAsia="Times New Roman" w:hAnsi="Times New Roman"/>
+        </w:rPr>
+        <w:t xml:space="preserve">asd, </w:t>
+      </w:r>
+      <w:r>
+        <w:rPr>
+          <w:i/>
+          <w:iCs/>
+          <w:color w:val="000000"/>
+          <w:sz w:val="20"/>
+          <w:szCs w:val="20"/>
+          <w:rFonts w:ascii="Times New Roman" w:cs="Times New Roman" w:eastAsia="Times New Roman" w:hAnsi="Times New Roman"/>
+        </w:rPr>
+        <w:t xml:space="preserve">Loc.Cit., </w:t>
+      </w:r>
+    </w:p>
+  </w:footnote>
+  <w:footnote w:id="24">
+    <w:p>
+      <w:pPr>
+        <w:spacing w:line="240"/>
+        <w:ind w:left="0" w:firstLine="272"/>
+        <w:jc w:val="both"/>
+      </w:pPr>
+      <w:r>
+        <w:rPr>
+          <w:rStyle w:val="FootnoteReference"/>
+        </w:rPr>
+        <w:footnoteRef/>
+      </w:r>
+      <w:r>
+        <w:rPr>
+          <w:color w:val="000000"/>
+          <w:sz w:val="20"/>
+          <w:szCs w:val="20"/>
+          <w:rFonts w:ascii="Times New Roman" w:cs="Times New Roman" w:eastAsia="Times New Roman" w:hAnsi="Times New Roman"/>
+        </w:rPr>
+        <w:t xml:space="preserve">dasd, </w:t>
+      </w:r>
+      <w:r>
+        <w:rPr>
+          <w:i/>
+          <w:iCs/>
+          <w:color w:val="000000"/>
+          <w:sz w:val="20"/>
+          <w:szCs w:val="20"/>
+          <w:rFonts w:ascii="Times New Roman" w:cs="Times New Roman" w:eastAsia="Times New Roman" w:hAnsi="Times New Roman"/>
+        </w:rPr>
+        <w:t xml:space="preserve">Loc.Cit., </w:t>
       </w:r>
     </w:p>
   </w:footnote>

</xml_diff>

<commit_message>
perbaikan pembalikan nama pada daftar pustaka
</commit_message>
<xml_diff>
--- a/formating-docx/doc/My Document.docx
+++ b/formating-docx/doc/My Document.docx
@@ -2396,7 +2396,7 @@
           <w:szCs w:val="24"/>
           <w:rFonts w:ascii="Times New Roman" w:cs="Times New Roman" w:eastAsia="Times New Roman" w:hAnsi="Times New Roman"/>
         </w:rPr>
-        <w:t xml:space="preserve">dasd. asdas. "asdas". </w:t>
+        <w:t xml:space="preserve">Hamid, Azwar. skld fklsdf. "ajsd lkajsd akljsd asd ". </w:t>
       </w:r>
       <w:r>
         <w:rPr>
@@ -2407,16 +2407,16 @@
           <w:szCs w:val="24"/>
           <w:rFonts w:ascii="Times New Roman" w:cs="Times New Roman" w:eastAsia="Times New Roman" w:hAnsi="Times New Roman"/>
         </w:rPr>
-        <w:t xml:space="preserve">asdasd, </w:t>
-      </w:r>
-      <w:r>
-        <w:rPr>
-          <w:color w:val="000000"/>
-          <w:sz w:val="24"/>
-          <w:szCs w:val="24"/>
-          <w:rFonts w:ascii="Times New Roman" w:cs="Times New Roman" w:eastAsia="Times New Roman" w:hAnsi="Times New Roman"/>
-        </w:rPr>
-        <w:t xml:space="preserve">Vol. asd, No. dasd.</w:t>
+        <w:t xml:space="preserve">ad jalfk df, </w:t>
+      </w:r>
+      <w:r>
+        <w:rPr>
+          <w:color w:val="000000"/>
+          <w:sz w:val="24"/>
+          <w:szCs w:val="24"/>
+          <w:rFonts w:ascii="Times New Roman" w:cs="Times New Roman" w:eastAsia="Times New Roman" w:hAnsi="Times New Roman"/>
+        </w:rPr>
+        <w:t xml:space="preserve">Vol. kdjfsn df, No. sdfnfs ld.</w:t>
       </w:r>
     </w:p>
     <w:p>
@@ -2432,7 +2432,7 @@
           <w:szCs w:val="24"/>
           <w:rFonts w:ascii="Times New Roman" w:cs="Times New Roman" w:eastAsia="Times New Roman" w:hAnsi="Times New Roman"/>
         </w:rPr>
-        <w:t xml:space="preserve">sda. asd. "asda". </w:t>
+        <w:t xml:space="preserve">Il, Sam. akjsd. "ajd kajdf ksdfksjdf". </w:t>
       </w:r>
       <w:r>
         <w:rPr>
@@ -2443,16 +2443,16 @@
           <w:szCs w:val="24"/>
           <w:rFonts w:ascii="Times New Roman" w:cs="Times New Roman" w:eastAsia="Times New Roman" w:hAnsi="Times New Roman"/>
         </w:rPr>
-        <w:t xml:space="preserve">sasd, </w:t>
-      </w:r>
-      <w:r>
-        <w:rPr>
-          <w:color w:val="000000"/>
-          <w:sz w:val="24"/>
-          <w:szCs w:val="24"/>
-          <w:rFonts w:ascii="Times New Roman" w:cs="Times New Roman" w:eastAsia="Times New Roman" w:hAnsi="Times New Roman"/>
-        </w:rPr>
-        <w:t xml:space="preserve">Vol. asd, No. adasd.</w:t>
+        <w:t xml:space="preserve">akjsd naj sd, </w:t>
+      </w:r>
+      <w:r>
+        <w:rPr>
+          <w:color w:val="000000"/>
+          <w:sz w:val="24"/>
+          <w:szCs w:val="24"/>
+          <w:rFonts w:ascii="Times New Roman" w:cs="Times New Roman" w:eastAsia="Times New Roman" w:hAnsi="Times New Roman"/>
+        </w:rPr>
+        <w:t xml:space="preserve">Vol. aksjd , No. asjd.</w:t>
       </w:r>
     </w:p>
     <w:p>
@@ -2468,7 +2468,7 @@
           <w:szCs w:val="24"/>
           <w:rFonts w:ascii="Times New Roman" w:cs="Times New Roman" w:eastAsia="Times New Roman" w:hAnsi="Times New Roman"/>
         </w:rPr>
-        <w:t xml:space="preserve">sda. asd. "asda". </w:t>
+        <w:t xml:space="preserve">Jalaludi, Ijal. akjsd. "lasdnalsd akj sdnasd ". </w:t>
       </w:r>
       <w:r>
         <w:rPr>
@@ -2479,16 +2479,16 @@
           <w:szCs w:val="24"/>
           <w:rFonts w:ascii="Times New Roman" w:cs="Times New Roman" w:eastAsia="Times New Roman" w:hAnsi="Times New Roman"/>
         </w:rPr>
-        <w:t xml:space="preserve">sasd, </w:t>
-      </w:r>
-      <w:r>
-        <w:rPr>
-          <w:color w:val="000000"/>
-          <w:sz w:val="24"/>
-          <w:szCs w:val="24"/>
-          <w:rFonts w:ascii="Times New Roman" w:cs="Times New Roman" w:eastAsia="Times New Roman" w:hAnsi="Times New Roman"/>
-        </w:rPr>
-        <w:t xml:space="preserve">Vol. asd, No. adasd.</w:t>
+        <w:t xml:space="preserve">akjsd naj sd, </w:t>
+      </w:r>
+      <w:r>
+        <w:rPr>
+          <w:color w:val="000000"/>
+          <w:sz w:val="24"/>
+          <w:szCs w:val="24"/>
+          <w:rFonts w:ascii="Times New Roman" w:cs="Times New Roman" w:eastAsia="Times New Roman" w:hAnsi="Times New Roman"/>
+        </w:rPr>
+        <w:t xml:space="preserve">Vol. aksjd , No. asjd.</w:t>
       </w:r>
     </w:p>
     <w:p>
@@ -2504,7 +2504,7 @@
           <w:szCs w:val="24"/>
           <w:rFonts w:ascii="Times New Roman" w:cs="Times New Roman" w:eastAsia="Times New Roman" w:hAnsi="Times New Roman"/>
         </w:rPr>
-        <w:t xml:space="preserve">sda. asd. "asda". </w:t>
+        <w:t xml:space="preserve">Juardi, Jono. akjsd . </w:t>
       </w:r>
       <w:r>
         <w:rPr>
@@ -2515,16 +2515,16 @@
           <w:szCs w:val="24"/>
           <w:rFonts w:ascii="Times New Roman" w:cs="Times New Roman" w:eastAsia="Times New Roman" w:hAnsi="Times New Roman"/>
         </w:rPr>
-        <w:t xml:space="preserve">sasd, </w:t>
-      </w:r>
-      <w:r>
-        <w:rPr>
-          <w:color w:val="000000"/>
-          <w:sz w:val="24"/>
-          <w:szCs w:val="24"/>
-          <w:rFonts w:ascii="Times New Roman" w:cs="Times New Roman" w:eastAsia="Times New Roman" w:hAnsi="Times New Roman"/>
-        </w:rPr>
-        <w:t xml:space="preserve">Vol. asd, No. adasd.</w:t>
+        <w:t xml:space="preserve">ashd ka lsjdasdajksd k. </w:t>
+      </w:r>
+      <w:r>
+        <w:rPr>
+          <w:color w:val="000000"/>
+          <w:sz w:val="24"/>
+          <w:szCs w:val="24"/>
+          <w:rFonts w:ascii="Times New Roman" w:cs="Times New Roman" w:eastAsia="Times New Roman" w:hAnsi="Times New Roman"/>
+        </w:rPr>
+        <w:t xml:space="preserve"> asdn ajks: ajksd nakds.</w:t>
       </w:r>
     </w:p>
     <w:p>
@@ -2540,7 +2540,7 @@
           <w:szCs w:val="24"/>
           <w:rFonts w:ascii="Times New Roman" w:cs="Times New Roman" w:eastAsia="Times New Roman" w:hAnsi="Times New Roman"/>
         </w:rPr>
-        <w:t xml:space="preserve">sda. asd. "asda". </w:t>
+        <w:t xml:space="preserve">Lias, Asa. akjsd. "paosdpk w". </w:t>
       </w:r>
       <w:r>
         <w:rPr>
@@ -2551,16 +2551,16 @@
           <w:szCs w:val="24"/>
           <w:rFonts w:ascii="Times New Roman" w:cs="Times New Roman" w:eastAsia="Times New Roman" w:hAnsi="Times New Roman"/>
         </w:rPr>
-        <w:t xml:space="preserve">sasd, </w:t>
-      </w:r>
-      <w:r>
-        <w:rPr>
-          <w:color w:val="000000"/>
-          <w:sz w:val="24"/>
-          <w:szCs w:val="24"/>
-          <w:rFonts w:ascii="Times New Roman" w:cs="Times New Roman" w:eastAsia="Times New Roman" w:hAnsi="Times New Roman"/>
-        </w:rPr>
-        <w:t xml:space="preserve">Vol. asd, No. adasd.</w:t>
+        <w:t xml:space="preserve">akjsd naj sd, </w:t>
+      </w:r>
+      <w:r>
+        <w:rPr>
+          <w:color w:val="000000"/>
+          <w:sz w:val="24"/>
+          <w:szCs w:val="24"/>
+          <w:rFonts w:ascii="Times New Roman" w:cs="Times New Roman" w:eastAsia="Times New Roman" w:hAnsi="Times New Roman"/>
+        </w:rPr>
+        <w:t xml:space="preserve">Vol. aksjd , No. asjd.</w:t>
       </w:r>
     </w:p>
     <w:p>
@@ -2576,7 +2576,7 @@
           <w:szCs w:val="24"/>
           <w:rFonts w:ascii="Times New Roman" w:cs="Times New Roman" w:eastAsia="Times New Roman" w:hAnsi="Times New Roman"/>
         </w:rPr>
-        <w:t xml:space="preserve">sda. asd. "asda". </w:t>
+        <w:t xml:space="preserve">Nail, Juan. akjsd. "asjd aj sdkasjd ". </w:t>
       </w:r>
       <w:r>
         <w:rPr>
@@ -2587,16 +2587,16 @@
           <w:szCs w:val="24"/>
           <w:rFonts w:ascii="Times New Roman" w:cs="Times New Roman" w:eastAsia="Times New Roman" w:hAnsi="Times New Roman"/>
         </w:rPr>
-        <w:t xml:space="preserve">sasd, </w:t>
-      </w:r>
-      <w:r>
-        <w:rPr>
-          <w:color w:val="000000"/>
-          <w:sz w:val="24"/>
-          <w:szCs w:val="24"/>
-          <w:rFonts w:ascii="Times New Roman" w:cs="Times New Roman" w:eastAsia="Times New Roman" w:hAnsi="Times New Roman"/>
-        </w:rPr>
-        <w:t xml:space="preserve">Vol. asd, No. adasd.</w:t>
+        <w:t xml:space="preserve">akjsd naj sd, </w:t>
+      </w:r>
+      <w:r>
+        <w:rPr>
+          <w:color w:val="000000"/>
+          <w:sz w:val="24"/>
+          <w:szCs w:val="24"/>
+          <w:rFonts w:ascii="Times New Roman" w:cs="Times New Roman" w:eastAsia="Times New Roman" w:hAnsi="Times New Roman"/>
+        </w:rPr>
+        <w:t xml:space="preserve">Vol. aksjd , No. asjd.</w:t>
       </w:r>
     </w:p>
     <w:p>
@@ -2612,7 +2612,7 @@
           <w:szCs w:val="24"/>
           <w:rFonts w:ascii="Times New Roman" w:cs="Times New Roman" w:eastAsia="Times New Roman" w:hAnsi="Times New Roman"/>
         </w:rPr>
-        <w:t xml:space="preserve">asd. aswda. "asd". </w:t>
+        <w:t xml:space="preserve">Stuward, Alisa. akjsd. "askdj asasd k". </w:t>
       </w:r>
       <w:r>
         <w:rPr>
@@ -2623,16 +2623,16 @@
           <w:szCs w:val="24"/>
           <w:rFonts w:ascii="Times New Roman" w:cs="Times New Roman" w:eastAsia="Times New Roman" w:hAnsi="Times New Roman"/>
         </w:rPr>
-        <w:t xml:space="preserve">asd, </w:t>
-      </w:r>
-      <w:r>
-        <w:rPr>
-          <w:color w:val="000000"/>
-          <w:sz w:val="24"/>
-          <w:szCs w:val="24"/>
-          <w:rFonts w:ascii="Times New Roman" w:cs="Times New Roman" w:eastAsia="Times New Roman" w:hAnsi="Times New Roman"/>
-        </w:rPr>
-        <w:t xml:space="preserve">Vol. sdas, No. ds.</w:t>
+        <w:t xml:space="preserve">akjsd naj sd, </w:t>
+      </w:r>
+      <w:r>
+        <w:rPr>
+          <w:color w:val="000000"/>
+          <w:sz w:val="24"/>
+          <w:szCs w:val="24"/>
+          <w:rFonts w:ascii="Times New Roman" w:cs="Times New Roman" w:eastAsia="Times New Roman" w:hAnsi="Times New Roman"/>
+        </w:rPr>
+        <w:t xml:space="preserve">Vol. aksjd , No. asjd.</w:t>
       </w:r>
     </w:p>
     <w:sectPr>
@@ -2756,7 +2756,7 @@
           <w:szCs w:val="20"/>
           <w:rFonts w:ascii="Times New Roman" w:cs="Times New Roman" w:eastAsia="Times New Roman" w:hAnsi="Times New Roman"/>
         </w:rPr>
-        <w:t xml:space="preserve">asd, "asd", </w:t>
+        <w:t xml:space="preserve">Il, Sam, "ajd kajdf ksdfksjdf", </w:t>
       </w:r>
       <w:r>
         <w:rPr>
@@ -2767,16 +2767,16 @@
           <w:szCs w:val="20"/>
           <w:rFonts w:ascii="Times New Roman" w:cs="Times New Roman" w:eastAsia="Times New Roman" w:hAnsi="Times New Roman"/>
         </w:rPr>
-        <w:t xml:space="preserve">asd, </w:t>
-      </w:r>
-      <w:r>
-        <w:rPr>
-          <w:color w:val="000000"/>
-          <w:sz w:val="20"/>
-          <w:szCs w:val="20"/>
-          <w:rFonts w:ascii="Times New Roman" w:cs="Times New Roman" w:eastAsia="Times New Roman" w:hAnsi="Times New Roman"/>
-        </w:rPr>
-        <w:t xml:space="preserve">Vol. sdas, No. ds (aswda), Hal. dasdas.</w:t>
+        <w:t xml:space="preserve">akjsd naj sd, </w:t>
+      </w:r>
+      <w:r>
+        <w:rPr>
+          <w:color w:val="000000"/>
+          <w:sz w:val="20"/>
+          <w:szCs w:val="20"/>
+          <w:rFonts w:ascii="Times New Roman" w:cs="Times New Roman" w:eastAsia="Times New Roman" w:hAnsi="Times New Roman"/>
+        </w:rPr>
+        <w:t xml:space="preserve">Vol. aksjd , No. asjd (akjsd), Hal. 90.</w:t>
       </w:r>
     </w:p>
   </w:footnote>
@@ -2800,7 +2800,7 @@
           <w:szCs w:val="20"/>
           <w:rFonts w:ascii="Times New Roman" w:cs="Times New Roman" w:eastAsia="Times New Roman" w:hAnsi="Times New Roman"/>
         </w:rPr>
-        <w:t xml:space="preserve">sda, "asda", </w:t>
+        <w:t xml:space="preserve">Lias, Asa, "paosdpk w", </w:t>
       </w:r>
       <w:r>
         <w:rPr>
@@ -2811,16 +2811,16 @@
           <w:szCs w:val="20"/>
           <w:rFonts w:ascii="Times New Roman" w:cs="Times New Roman" w:eastAsia="Times New Roman" w:hAnsi="Times New Roman"/>
         </w:rPr>
-        <w:t xml:space="preserve">sasd, </w:t>
-      </w:r>
-      <w:r>
-        <w:rPr>
-          <w:color w:val="000000"/>
-          <w:sz w:val="20"/>
-          <w:szCs w:val="20"/>
-          <w:rFonts w:ascii="Times New Roman" w:cs="Times New Roman" w:eastAsia="Times New Roman" w:hAnsi="Times New Roman"/>
-        </w:rPr>
-        <w:t xml:space="preserve">Vol. asd, No. adasd (asd), Hal. asdasd.</w:t>
+        <w:t xml:space="preserve">akjsd naj sd, </w:t>
+      </w:r>
+      <w:r>
+        <w:rPr>
+          <w:color w:val="000000"/>
+          <w:sz w:val="20"/>
+          <w:szCs w:val="20"/>
+          <w:rFonts w:ascii="Times New Roman" w:cs="Times New Roman" w:eastAsia="Times New Roman" w:hAnsi="Times New Roman"/>
+        </w:rPr>
+        <w:t xml:space="preserve">Vol. aksjd , No. asjd (akjsd), Hal. 22.</w:t>
       </w:r>
     </w:p>
   </w:footnote>
@@ -2941,7 +2941,7 @@
           <w:szCs w:val="20"/>
           <w:rFonts w:ascii="Times New Roman" w:cs="Times New Roman" w:eastAsia="Times New Roman" w:hAnsi="Times New Roman"/>
         </w:rPr>
-        <w:t xml:space="preserve">sda, "asda", </w:t>
+        <w:t xml:space="preserve">Juardi, Jono, </w:t>
       </w:r>
       <w:r>
         <w:rPr>
@@ -2952,16 +2952,16 @@
           <w:szCs w:val="20"/>
           <w:rFonts w:ascii="Times New Roman" w:cs="Times New Roman" w:eastAsia="Times New Roman" w:hAnsi="Times New Roman"/>
         </w:rPr>
-        <w:t xml:space="preserve">sasd, </w:t>
-      </w:r>
-      <w:r>
-        <w:rPr>
-          <w:color w:val="000000"/>
-          <w:sz w:val="20"/>
-          <w:szCs w:val="20"/>
-          <w:rFonts w:ascii="Times New Roman" w:cs="Times New Roman" w:eastAsia="Times New Roman" w:hAnsi="Times New Roman"/>
-        </w:rPr>
-        <w:t xml:space="preserve">Vol. asd, No. adasd (asd), Hal. asdasd.</w:t>
+        <w:t xml:space="preserve">ashd ka lsjdasdajksd k, </w:t>
+      </w:r>
+      <w:r>
+        <w:rPr>
+          <w:color w:val="000000"/>
+          <w:sz w:val="20"/>
+          <w:szCs w:val="20"/>
+          <w:rFonts w:ascii="Times New Roman" w:cs="Times New Roman" w:eastAsia="Times New Roman" w:hAnsi="Times New Roman"/>
+        </w:rPr>
+        <w:t xml:space="preserve">(asdn ajks: ajksd nakds, akjsd ), Hal. 5.</w:t>
       </w:r>
     </w:p>
   </w:footnote>
@@ -2985,7 +2985,7 @@
           <w:szCs w:val="20"/>
           <w:rFonts w:ascii="Times New Roman" w:cs="Times New Roman" w:eastAsia="Times New Roman" w:hAnsi="Times New Roman"/>
         </w:rPr>
-        <w:t xml:space="preserve">sda, "asda", </w:t>
+        <w:t xml:space="preserve">Stuward, Alisa, "askdj asasd k", </w:t>
       </w:r>
       <w:r>
         <w:rPr>
@@ -2996,16 +2996,16 @@
           <w:szCs w:val="20"/>
           <w:rFonts w:ascii="Times New Roman" w:cs="Times New Roman" w:eastAsia="Times New Roman" w:hAnsi="Times New Roman"/>
         </w:rPr>
-        <w:t xml:space="preserve">sasd, </w:t>
-      </w:r>
-      <w:r>
-        <w:rPr>
-          <w:color w:val="000000"/>
-          <w:sz w:val="20"/>
-          <w:szCs w:val="20"/>
-          <w:rFonts w:ascii="Times New Roman" w:cs="Times New Roman" w:eastAsia="Times New Roman" w:hAnsi="Times New Roman"/>
-        </w:rPr>
-        <w:t xml:space="preserve">Vol. asd, No. adasd (asd), Hal. asdasd.</w:t>
+        <w:t xml:space="preserve">akjsd naj sd, </w:t>
+      </w:r>
+      <w:r>
+        <w:rPr>
+          <w:color w:val="000000"/>
+          <w:sz w:val="20"/>
+          <w:szCs w:val="20"/>
+          <w:rFonts w:ascii="Times New Roman" w:cs="Times New Roman" w:eastAsia="Times New Roman" w:hAnsi="Times New Roman"/>
+        </w:rPr>
+        <w:t xml:space="preserve">Vol. aksjd , No. asjd (akjsd), Hal. 10.</w:t>
       </w:r>
     </w:p>
   </w:footnote>
@@ -3093,7 +3093,7 @@
           <w:szCs w:val="20"/>
           <w:rFonts w:ascii="Times New Roman" w:cs="Times New Roman" w:eastAsia="Times New Roman" w:hAnsi="Times New Roman"/>
         </w:rPr>
-        <w:t xml:space="preserve">asd, </w:t>
+        <w:t xml:space="preserve">Il, Sam, </w:t>
       </w:r>
       <w:r>
         <w:rPr>
@@ -3288,7 +3288,7 @@
           <w:szCs w:val="20"/>
           <w:rFonts w:ascii="Times New Roman" w:cs="Times New Roman" w:eastAsia="Times New Roman" w:hAnsi="Times New Roman"/>
         </w:rPr>
-        <w:t xml:space="preserve">dasd, "asdas", </w:t>
+        <w:t xml:space="preserve">Hamid, Azwar, "ajsd lkajsd akljsd asd ", </w:t>
       </w:r>
       <w:r>
         <w:rPr>
@@ -3299,16 +3299,16 @@
           <w:szCs w:val="20"/>
           <w:rFonts w:ascii="Times New Roman" w:cs="Times New Roman" w:eastAsia="Times New Roman" w:hAnsi="Times New Roman"/>
         </w:rPr>
-        <w:t xml:space="preserve">asdasd, </w:t>
-      </w:r>
-      <w:r>
-        <w:rPr>
-          <w:color w:val="000000"/>
-          <w:sz w:val="20"/>
-          <w:szCs w:val="20"/>
-          <w:rFonts w:ascii="Times New Roman" w:cs="Times New Roman" w:eastAsia="Times New Roman" w:hAnsi="Times New Roman"/>
-        </w:rPr>
-        <w:t xml:space="preserve">Vol. asd, No. dasd (asdas), Hal. asdasd.</w:t>
+        <w:t xml:space="preserve">ad jalfk df, </w:t>
+      </w:r>
+      <w:r>
+        <w:rPr>
+          <w:color w:val="000000"/>
+          <w:sz w:val="20"/>
+          <w:szCs w:val="20"/>
+          <w:rFonts w:ascii="Times New Roman" w:cs="Times New Roman" w:eastAsia="Times New Roman" w:hAnsi="Times New Roman"/>
+        </w:rPr>
+        <w:t xml:space="preserve">Vol. kdjfsn df, No. sdfnfs ld (skld fklsdf), Hal. 12.</w:t>
       </w:r>
     </w:p>
   </w:footnote>
@@ -3364,7 +3364,7 @@
           <w:szCs w:val="20"/>
           <w:rFonts w:ascii="Times New Roman" w:cs="Times New Roman" w:eastAsia="Times New Roman" w:hAnsi="Times New Roman"/>
         </w:rPr>
-        <w:t xml:space="preserve">sda, "asda", </w:t>
+        <w:t xml:space="preserve">Nail, Juan, "asjd aj sdkasjd ", </w:t>
       </w:r>
       <w:r>
         <w:rPr>
@@ -3375,16 +3375,16 @@
           <w:szCs w:val="20"/>
           <w:rFonts w:ascii="Times New Roman" w:cs="Times New Roman" w:eastAsia="Times New Roman" w:hAnsi="Times New Roman"/>
         </w:rPr>
-        <w:t xml:space="preserve">sasd, </w:t>
-      </w:r>
-      <w:r>
-        <w:rPr>
-          <w:color w:val="000000"/>
-          <w:sz w:val="20"/>
-          <w:szCs w:val="20"/>
-          <w:rFonts w:ascii="Times New Roman" w:cs="Times New Roman" w:eastAsia="Times New Roman" w:hAnsi="Times New Roman"/>
-        </w:rPr>
-        <w:t xml:space="preserve">Vol. asd, No. adasd (asd), Hal. asdasd.</w:t>
+        <w:t xml:space="preserve">akjsd naj sd, </w:t>
+      </w:r>
+      <w:r>
+        <w:rPr>
+          <w:color w:val="000000"/>
+          <w:sz w:val="20"/>
+          <w:szCs w:val="20"/>
+          <w:rFonts w:ascii="Times New Roman" w:cs="Times New Roman" w:eastAsia="Times New Roman" w:hAnsi="Times New Roman"/>
+        </w:rPr>
+        <w:t xml:space="preserve">Vol. aksjd , No. asjd (akjsd), Hal. 14.</w:t>
       </w:r>
     </w:p>
   </w:footnote>
@@ -3440,7 +3440,7 @@
           <w:szCs w:val="20"/>
           <w:rFonts w:ascii="Times New Roman" w:cs="Times New Roman" w:eastAsia="Times New Roman" w:hAnsi="Times New Roman"/>
         </w:rPr>
-        <w:t xml:space="preserve">sda, "asda", </w:t>
+        <w:t xml:space="preserve">Jalaludi, Ijal, "lasdnalsd akj sdnasd ", </w:t>
       </w:r>
       <w:r>
         <w:rPr>
@@ -3451,16 +3451,16 @@
           <w:szCs w:val="20"/>
           <w:rFonts w:ascii="Times New Roman" w:cs="Times New Roman" w:eastAsia="Times New Roman" w:hAnsi="Times New Roman"/>
         </w:rPr>
-        <w:t xml:space="preserve">sasd, </w:t>
-      </w:r>
-      <w:r>
-        <w:rPr>
-          <w:color w:val="000000"/>
-          <w:sz w:val="20"/>
-          <w:szCs w:val="20"/>
-          <w:rFonts w:ascii="Times New Roman" w:cs="Times New Roman" w:eastAsia="Times New Roman" w:hAnsi="Times New Roman"/>
-        </w:rPr>
-        <w:t xml:space="preserve">Vol. asd, No. adasd (asd), Hal. asdasd.</w:t>
+        <w:t xml:space="preserve">akjsd naj sd, </w:t>
+      </w:r>
+      <w:r>
+        <w:rPr>
+          <w:color w:val="000000"/>
+          <w:sz w:val="20"/>
+          <w:szCs w:val="20"/>
+          <w:rFonts w:ascii="Times New Roman" w:cs="Times New Roman" w:eastAsia="Times New Roman" w:hAnsi="Times New Roman"/>
+        </w:rPr>
+        <w:t xml:space="preserve">Vol. aksjd , No. asjd (akjsd), Hal. 35.</w:t>
       </w:r>
     </w:p>
   </w:footnote>
@@ -3548,7 +3548,7 @@
           <w:szCs w:val="20"/>
           <w:rFonts w:ascii="Times New Roman" w:cs="Times New Roman" w:eastAsia="Times New Roman" w:hAnsi="Times New Roman"/>
         </w:rPr>
-        <w:t xml:space="preserve">asd, </w:t>
+        <w:t xml:space="preserve">Il, Sam, </w:t>
       </w:r>
       <w:r>
         <w:rPr>
@@ -3583,7 +3583,7 @@
           <w:szCs w:val="20"/>
           <w:rFonts w:ascii="Times New Roman" w:cs="Times New Roman" w:eastAsia="Times New Roman" w:hAnsi="Times New Roman"/>
         </w:rPr>
-        <w:t xml:space="preserve">dasd, </w:t>
+        <w:t xml:space="preserve">Hamid, Azwar, </w:t>
       </w:r>
       <w:r>
         <w:rPr>

</xml_diff>

<commit_message>
membuat sistem download universal selsai
</commit_message>
<xml_diff>
--- a/formating-docx/doc/My Document.docx
+++ b/formating-docx/doc/My Document.docx
@@ -261,7 +261,7 @@
         <w:pStyle w:val="normal"/>
         <w:numPr>
           <w:ilvl w:val="0"/>
-          <w:numId w:val="7"/>
+          <w:numId w:val="29"/>
         </w:numPr>
         <w:tabs>
           <w:tab w:val="right" w:pos="7823" w:leader="dot"/>
@@ -279,7 +279,7 @@
         <w:pStyle w:val="normal"/>
         <w:numPr>
           <w:ilvl w:val="0"/>
-          <w:numId w:val="7"/>
+          <w:numId w:val="29"/>
         </w:numPr>
         <w:tabs>
           <w:tab w:val="right" w:pos="7823" w:leader="dot"/>
@@ -306,7 +306,7 @@
         <w:pStyle w:val="normal"/>
         <w:numPr>
           <w:ilvl w:val="0"/>
-          <w:numId w:val="8"/>
+          <w:numId w:val="30"/>
         </w:numPr>
         <w:tabs>
           <w:tab w:val="right" w:pos="7823" w:leader="dot"/>
@@ -324,7 +324,7 @@
         <w:pStyle w:val="normal"/>
         <w:numPr>
           <w:ilvl w:val="0"/>
-          <w:numId w:val="8"/>
+          <w:numId w:val="30"/>
         </w:numPr>
         <w:tabs>
           <w:tab w:val="right" w:pos="7823" w:leader="dot"/>
@@ -342,7 +342,7 @@
         <w:pStyle w:val="normal"/>
         <w:numPr>
           <w:ilvl w:val="0"/>
-          <w:numId w:val="8"/>
+          <w:numId w:val="30"/>
         </w:numPr>
         <w:tabs>
           <w:tab w:val="right" w:pos="7823" w:leader="dot"/>
@@ -369,7 +369,7 @@
         <w:pStyle w:val="normal"/>
         <w:numPr>
           <w:ilvl w:val="0"/>
-          <w:numId w:val="9"/>
+          <w:numId w:val="31"/>
         </w:numPr>
         <w:tabs>
           <w:tab w:val="right" w:pos="7823" w:leader="dot"/>
@@ -387,7 +387,7 @@
         <w:pStyle w:val="normal"/>
         <w:numPr>
           <w:ilvl w:val="0"/>
-          <w:numId w:val="9"/>
+          <w:numId w:val="31"/>
         </w:numPr>
         <w:tabs>
           <w:tab w:val="right" w:pos="7823" w:leader="dot"/>
@@ -454,7 +454,7 @@
         <w:pStyle w:val="bold"/>
         <w:numPr>
           <w:ilvl w:val="0"/>
-          <w:numId w:val="10"/>
+          <w:numId w:val="32"/>
         </w:numPr>
         <w:spacing w:line="360"/>
         <w:ind w:left="283" w:hanging="272" w:firstLine="0"/>
@@ -479,7 +479,7 @@
         <w:pStyle w:val="bold"/>
         <w:numPr>
           <w:ilvl w:val="0"/>
-          <w:numId w:val="10"/>
+          <w:numId w:val="32"/>
         </w:numPr>
         <w:spacing w:line="360"/>
         <w:ind w:left="283" w:hanging="272" w:firstLine="0"/>
@@ -494,7 +494,7 @@
         <w:pStyle w:val="normal"/>
         <w:numPr>
           <w:ilvl w:val="0"/>
-          <w:numId w:val="11"/>
+          <w:numId w:val="33"/>
         </w:numPr>
         <w:spacing w:line="360"/>
         <w:ind w:left="566" w:hanging="277" w:firstLine="277"/>
@@ -509,7 +509,7 @@
         <w:pStyle w:val="bold"/>
         <w:numPr>
           <w:ilvl w:val="0"/>
-          <w:numId w:val="10"/>
+          <w:numId w:val="32"/>
         </w:numPr>
         <w:spacing w:line="360"/>
         <w:ind w:left="283" w:hanging="272" w:firstLine="0"/>
@@ -524,7 +524,7 @@
         <w:pStyle w:val="normal"/>
         <w:numPr>
           <w:ilvl w:val="0"/>
-          <w:numId w:val="12"/>
+          <w:numId w:val="34"/>
         </w:numPr>
         <w:spacing w:line="360"/>
         <w:ind w:left="566" w:hanging="277" w:firstLine="277"/>
@@ -564,7 +564,7 @@
         <w:pStyle w:val="bold"/>
         <w:numPr>
           <w:ilvl w:val="0"/>
-          <w:numId w:val="13"/>
+          <w:numId w:val="35"/>
         </w:numPr>
         <w:spacing w:line="360"/>
         <w:ind w:left="283" w:hanging="272" w:firstLine="0"/>
@@ -681,7 +681,7 @@
         <w:pStyle w:val="bold"/>
         <w:numPr>
           <w:ilvl w:val="0"/>
-          <w:numId w:val="13"/>
+          <w:numId w:val="35"/>
         </w:numPr>
         <w:spacing w:line="360"/>
         <w:ind w:left="283" w:hanging="272" w:firstLine="0"/>
@@ -798,7 +798,7 @@
         <w:pStyle w:val="normal"/>
         <w:numPr>
           <w:ilvl w:val="0"/>
-          <w:numId w:val="14"/>
+          <w:numId w:val="36"/>
         </w:numPr>
         <w:spacing w:line="360"/>
         <w:ind w:left="566" w:hanging="277" w:firstLine="277"/>
@@ -819,7 +819,7 @@
         <w:pStyle w:val="normal"/>
         <w:numPr>
           <w:ilvl w:val="0"/>
-          <w:numId w:val="14"/>
+          <w:numId w:val="36"/>
         </w:numPr>
         <w:spacing w:line="360"/>
         <w:ind w:left="566" w:hanging="277" w:firstLine="277"/>
@@ -840,7 +840,7 @@
         <w:pStyle w:val="normal"/>
         <w:numPr>
           <w:ilvl w:val="0"/>
-          <w:numId w:val="14"/>
+          <w:numId w:val="36"/>
         </w:numPr>
         <w:spacing w:line="360"/>
         <w:ind w:left="566" w:hanging="277" w:firstLine="277"/>
@@ -877,7 +877,7 @@
         <w:pStyle w:val="normal"/>
         <w:numPr>
           <w:ilvl w:val="0"/>
-          <w:numId w:val="15"/>
+          <w:numId w:val="37"/>
         </w:numPr>
         <w:spacing w:line="360"/>
         <w:ind w:left="566" w:hanging="277" w:firstLine="277"/>
@@ -898,7 +898,7 @@
         <w:pStyle w:val="normal"/>
         <w:numPr>
           <w:ilvl w:val="0"/>
-          <w:numId w:val="15"/>
+          <w:numId w:val="37"/>
         </w:numPr>
         <w:spacing w:line="360"/>
         <w:ind w:left="566" w:hanging="277" w:firstLine="277"/>
@@ -935,7 +935,7 @@
         <w:pStyle w:val="normal"/>
         <w:numPr>
           <w:ilvl w:val="0"/>
-          <w:numId w:val="16"/>
+          <w:numId w:val="38"/>
         </w:numPr>
         <w:spacing w:line="360"/>
         <w:ind w:left="566" w:hanging="277" w:firstLine="277"/>
@@ -956,7 +956,7 @@
         <w:pStyle w:val="normal"/>
         <w:numPr>
           <w:ilvl w:val="0"/>
-          <w:numId w:val="16"/>
+          <w:numId w:val="38"/>
         </w:numPr>
         <w:spacing w:line="360"/>
         <w:ind w:left="566" w:hanging="277" w:firstLine="277"/>
@@ -977,7 +977,7 @@
         <w:pStyle w:val="normal"/>
         <w:numPr>
           <w:ilvl w:val="0"/>
-          <w:numId w:val="16"/>
+          <w:numId w:val="38"/>
         </w:numPr>
         <w:spacing w:line="360"/>
         <w:ind w:left="566" w:hanging="277" w:firstLine="277"/>
@@ -1286,7 +1286,7 @@
         <w:pStyle w:val="bold"/>
         <w:numPr>
           <w:ilvl w:val="0"/>
-          <w:numId w:val="13"/>
+          <w:numId w:val="35"/>
         </w:numPr>
         <w:spacing w:line="360"/>
         <w:ind w:left="283" w:hanging="272" w:firstLine="0"/>
@@ -1387,7 +1387,7 @@
         <w:pStyle w:val="bold"/>
         <w:numPr>
           <w:ilvl w:val="0"/>
-          <w:numId w:val="13"/>
+          <w:numId w:val="35"/>
         </w:numPr>
         <w:spacing w:line="360"/>
         <w:ind w:left="283" w:hanging="272" w:firstLine="0"/>
@@ -1408,7 +1408,7 @@
         <w:pStyle w:val="normal"/>
         <w:numPr>
           <w:ilvl w:val="0"/>
-          <w:numId w:val="17"/>
+          <w:numId w:val="39"/>
         </w:numPr>
         <w:spacing w:line="360"/>
         <w:ind w:left="566" w:hanging="277" w:firstLine="277"/>
@@ -1493,7 +1493,7 @@
         <w:pStyle w:val="normal"/>
         <w:numPr>
           <w:ilvl w:val="0"/>
-          <w:numId w:val="17"/>
+          <w:numId w:val="39"/>
         </w:numPr>
         <w:spacing w:line="360"/>
         <w:ind w:left="566" w:hanging="277" w:firstLine="277"/>
@@ -1514,7 +1514,7 @@
         <w:pStyle w:val="normal"/>
         <w:numPr>
           <w:ilvl w:val="0"/>
-          <w:numId w:val="18"/>
+          <w:numId w:val="40"/>
         </w:numPr>
         <w:spacing w:line="360"/>
         <w:ind w:left="850" w:hanging="283" w:firstLine="283"/>
@@ -1551,7 +1551,7 @@
         <w:pStyle w:val="normal"/>
         <w:numPr>
           <w:ilvl w:val="0"/>
-          <w:numId w:val="18"/>
+          <w:numId w:val="40"/>
         </w:numPr>
         <w:spacing w:line="360"/>
         <w:ind w:left="850" w:hanging="283" w:firstLine="283"/>
@@ -1588,7 +1588,7 @@
         <w:pStyle w:val="normal"/>
         <w:numPr>
           <w:ilvl w:val="0"/>
-          <w:numId w:val="18"/>
+          <w:numId w:val="40"/>
         </w:numPr>
         <w:spacing w:line="360"/>
         <w:ind w:left="850" w:hanging="283" w:firstLine="283"/>
@@ -1625,7 +1625,7 @@
         <w:pStyle w:val="normal"/>
         <w:numPr>
           <w:ilvl w:val="0"/>
-          <w:numId w:val="18"/>
+          <w:numId w:val="40"/>
         </w:numPr>
         <w:spacing w:line="360"/>
         <w:ind w:left="850" w:hanging="283" w:firstLine="283"/>
@@ -1662,7 +1662,7 @@
         <w:pStyle w:val="normal"/>
         <w:numPr>
           <w:ilvl w:val="0"/>
-          <w:numId w:val="18"/>
+          <w:numId w:val="40"/>
         </w:numPr>
         <w:spacing w:line="360"/>
         <w:ind w:left="850" w:hanging="283" w:firstLine="283"/>
@@ -1699,7 +1699,7 @@
         <w:pStyle w:val="normal"/>
         <w:numPr>
           <w:ilvl w:val="0"/>
-          <w:numId w:val="17"/>
+          <w:numId w:val="39"/>
         </w:numPr>
         <w:spacing w:line="360"/>
         <w:ind w:left="566" w:hanging="277" w:firstLine="277"/>
@@ -1720,7 +1720,7 @@
         <w:pStyle w:val="normal"/>
         <w:numPr>
           <w:ilvl w:val="0"/>
-          <w:numId w:val="19"/>
+          <w:numId w:val="41"/>
         </w:numPr>
         <w:spacing w:line="360"/>
         <w:ind w:left="850" w:hanging="283" w:firstLine="283"/>
@@ -1741,7 +1741,7 @@
         <w:pStyle w:val="normal"/>
         <w:numPr>
           <w:ilvl w:val="0"/>
-          <w:numId w:val="20"/>
+          <w:numId w:val="42"/>
         </w:numPr>
         <w:spacing w:line="360"/>
         <w:ind w:left="1133" w:hanging="283" w:firstLine="283"/>
@@ -1762,7 +1762,7 @@
         <w:pStyle w:val="normal"/>
         <w:numPr>
           <w:ilvl w:val="0"/>
-          <w:numId w:val="20"/>
+          <w:numId w:val="42"/>
         </w:numPr>
         <w:spacing w:line="360"/>
         <w:ind w:left="1133" w:hanging="283" w:firstLine="283"/>
@@ -1783,7 +1783,7 @@
         <w:pStyle w:val="normal"/>
         <w:numPr>
           <w:ilvl w:val="0"/>
-          <w:numId w:val="20"/>
+          <w:numId w:val="42"/>
         </w:numPr>
         <w:spacing w:line="360"/>
         <w:ind w:left="1133" w:hanging="283" w:firstLine="283"/>
@@ -1804,7 +1804,7 @@
         <w:pStyle w:val="normal"/>
         <w:numPr>
           <w:ilvl w:val="0"/>
-          <w:numId w:val="20"/>
+          <w:numId w:val="42"/>
         </w:numPr>
         <w:spacing w:line="360"/>
         <w:ind w:left="1133" w:hanging="283" w:firstLine="283"/>
@@ -1825,7 +1825,7 @@
         <w:pStyle w:val="normal"/>
         <w:numPr>
           <w:ilvl w:val="0"/>
-          <w:numId w:val="20"/>
+          <w:numId w:val="42"/>
         </w:numPr>
         <w:spacing w:line="360"/>
         <w:ind w:left="1133" w:hanging="283" w:firstLine="283"/>
@@ -1846,7 +1846,7 @@
         <w:pStyle w:val="normal"/>
         <w:numPr>
           <w:ilvl w:val="0"/>
-          <w:numId w:val="20"/>
+          <w:numId w:val="42"/>
         </w:numPr>
         <w:spacing w:line="360"/>
         <w:ind w:left="1133" w:hanging="283" w:firstLine="283"/>
@@ -1867,7 +1867,7 @@
         <w:pStyle w:val="normal"/>
         <w:numPr>
           <w:ilvl w:val="0"/>
-          <w:numId w:val="20"/>
+          <w:numId w:val="42"/>
         </w:numPr>
         <w:spacing w:line="360"/>
         <w:ind w:left="1133" w:hanging="283" w:firstLine="283"/>
@@ -1888,7 +1888,7 @@
         <w:pStyle w:val="normal"/>
         <w:numPr>
           <w:ilvl w:val="0"/>
-          <w:numId w:val="20"/>
+          <w:numId w:val="42"/>
         </w:numPr>
         <w:spacing w:line="360"/>
         <w:ind w:left="1133" w:hanging="283" w:firstLine="283"/>
@@ -1909,7 +1909,7 @@
         <w:pStyle w:val="normal"/>
         <w:numPr>
           <w:ilvl w:val="0"/>
-          <w:numId w:val="20"/>
+          <w:numId w:val="42"/>
         </w:numPr>
         <w:spacing w:line="360"/>
         <w:ind w:left="1133" w:hanging="283" w:firstLine="283"/>
@@ -2026,7 +2026,7 @@
         <w:pStyle w:val="normal"/>
         <w:numPr>
           <w:ilvl w:val="0"/>
-          <w:numId w:val="19"/>
+          <w:numId w:val="41"/>
         </w:numPr>
         <w:spacing w:line="360"/>
         <w:ind w:left="850" w:hanging="283" w:firstLine="283"/>
@@ -2047,7 +2047,7 @@
         <w:pStyle w:val="normal"/>
         <w:numPr>
           <w:ilvl w:val="0"/>
-          <w:numId w:val="21"/>
+          <w:numId w:val="43"/>
         </w:numPr>
         <w:spacing w:line="360"/>
         <w:ind w:left="1133" w:hanging="283" w:firstLine="283"/>
@@ -2068,7 +2068,7 @@
         <w:pStyle w:val="normal"/>
         <w:numPr>
           <w:ilvl w:val="0"/>
-          <w:numId w:val="21"/>
+          <w:numId w:val="43"/>
         </w:numPr>
         <w:spacing w:line="360"/>
         <w:ind w:left="1133" w:hanging="283" w:firstLine="283"/>
@@ -2089,7 +2089,7 @@
         <w:pStyle w:val="normal"/>
         <w:numPr>
           <w:ilvl w:val="0"/>
-          <w:numId w:val="21"/>
+          <w:numId w:val="43"/>
         </w:numPr>
         <w:spacing w:line="360"/>
         <w:ind w:left="1133" w:hanging="283" w:firstLine="283"/>
@@ -2110,7 +2110,7 @@
         <w:pStyle w:val="normal"/>
         <w:numPr>
           <w:ilvl w:val="0"/>
-          <w:numId w:val="21"/>
+          <w:numId w:val="43"/>
         </w:numPr>
         <w:spacing w:line="360"/>
         <w:ind w:left="1133" w:hanging="283" w:firstLine="283"/>
@@ -2131,7 +2131,7 @@
         <w:pStyle w:val="normal"/>
         <w:numPr>
           <w:ilvl w:val="0"/>
-          <w:numId w:val="21"/>
+          <w:numId w:val="43"/>
         </w:numPr>
         <w:spacing w:line="360"/>
         <w:ind w:left="1133" w:hanging="283" w:firstLine="283"/>
@@ -2201,7 +2201,7 @@
         <w:pStyle w:val="bold"/>
         <w:numPr>
           <w:ilvl w:val="0"/>
-          <w:numId w:val="22"/>
+          <w:numId w:val="44"/>
         </w:numPr>
         <w:spacing w:line="360"/>
         <w:ind w:left="283" w:hanging="272" w:firstLine="0"/>
@@ -2226,7 +2226,7 @@
         <w:pStyle w:val="bold"/>
         <w:numPr>
           <w:ilvl w:val="0"/>
-          <w:numId w:val="22"/>
+          <w:numId w:val="44"/>
         </w:numPr>
         <w:spacing w:line="360"/>
         <w:ind w:left="283" w:hanging="272" w:firstLine="0"/>
@@ -2392,7 +2392,7 @@
 
 <file path=word/numbering.xml><?xml version="1.0" encoding="utf-8"?>
 <w:numbering xmlns:wpc="http://schemas.microsoft.com/office/word/2010/wordprocessingCanvas" xmlns:mc="http://schemas.openxmlformats.org/markup-compatibility/2006" xmlns:o="urn:schemas-microsoft-com:office:office" xmlns:r="http://schemas.openxmlformats.org/officeDocument/2006/relationships" xmlns:m="http://schemas.openxmlformats.org/officeDocument/2006/math" xmlns:v="urn:schemas-microsoft-com:vml" xmlns:wp14="http://schemas.microsoft.com/office/word/2010/wordprocessingDrawing" xmlns:wp="http://schemas.openxmlformats.org/drawingml/2006/wordprocessingDrawing" xmlns:w10="urn:schemas-microsoft-com:office:word" xmlns:w="http://schemas.openxmlformats.org/wordprocessingml/2006/main" xmlns:w14="http://schemas.microsoft.com/office/word/2010/wordml" xmlns:w15="http://schemas.microsoft.com/office/word/2012/wordml" xmlns:wpg="http://schemas.microsoft.com/office/word/2010/wordprocessingGroup" xmlns:wpi="http://schemas.microsoft.com/office/word/2010/wordprocessingInk" xmlns:wne="http://schemas.microsoft.com/office/word/2006/wordml" xmlns:wps="http://schemas.microsoft.com/office/word/2010/wordprocessingShape" mc:Ignorable="w14 w15 wp14">
-  <w:abstractNum w:abstractNumId="1" w15:restartNumberingAfterBreak="0">
+  <w:abstractNum w:abstractNumId="23" w15:restartNumberingAfterBreak="0">
     <w:multiLevelType w:val="hybridMultilevel"/>
     <w:lvl w:ilvl="0" w15:tentative="1">
       <w:start w:val="1"/>
@@ -2476,7 +2476,7 @@
       </w:pPr>
     </w:lvl>
   </w:abstractNum>
-  <w:abstractNum w:abstractNumId="2" w15:restartNumberingAfterBreak="0">
+  <w:abstractNum w:abstractNumId="24" w15:restartNumberingAfterBreak="0">
     <w:multiLevelType w:val="hybridMultilevel"/>
     <w:lvl w:ilvl="0" w15:tentative="1">
       <w:start w:val="1"/>
@@ -2485,7 +2485,7 @@
       <w:lvlJc w:val="left"/>
     </w:lvl>
   </w:abstractNum>
-  <w:abstractNum w:abstractNumId="3" w15:restartNumberingAfterBreak="0">
+  <w:abstractNum w:abstractNumId="25" w15:restartNumberingAfterBreak="0">
     <w:multiLevelType w:val="hybridMultilevel"/>
     <w:lvl w:ilvl="0" w15:tentative="1">
       <w:start w:val="1"/>
@@ -2494,7 +2494,7 @@
       <w:lvlJc w:val="left"/>
     </w:lvl>
   </w:abstractNum>
-  <w:abstractNum w:abstractNumId="4" w15:restartNumberingAfterBreak="0">
+  <w:abstractNum w:abstractNumId="26" w15:restartNumberingAfterBreak="0">
     <w:multiLevelType w:val="hybridMultilevel"/>
     <w:lvl w:ilvl="0" w15:tentative="1">
       <w:start w:val="1"/>
@@ -2503,7 +2503,7 @@
       <w:lvlJc w:val="left"/>
     </w:lvl>
   </w:abstractNum>
-  <w:abstractNum w:abstractNumId="5" w15:restartNumberingAfterBreak="0">
+  <w:abstractNum w:abstractNumId="27" w15:restartNumberingAfterBreak="0">
     <w:multiLevelType w:val="hybridMultilevel"/>
     <w:lvl w:ilvl="0" w15:tentative="1">
       <w:start w:val="1"/>
@@ -2512,7 +2512,7 @@
       <w:lvlJc w:val="left"/>
     </w:lvl>
   </w:abstractNum>
-  <w:abstractNum w:abstractNumId="6" w15:restartNumberingAfterBreak="0">
+  <w:abstractNum w:abstractNumId="28" w15:restartNumberingAfterBreak="0">
     <w:multiLevelType w:val="hybridMultilevel"/>
     <w:lvl w:ilvl="0" w15:tentative="1">
       <w:start w:val="1"/>
@@ -2522,103 +2522,103 @@
     </w:lvl>
   </w:abstractNum>
   <w:num w:numId="1">
-    <w:abstractNumId w:val="1"/>
+    <w:abstractNumId w:val="23"/>
     <w:lvlOverride w:ilvl="0">
       <w:startOverride w:val="1"/>
     </w:lvlOverride>
   </w:num>
-  <w:num w:numId="7">
-    <w:abstractNumId w:val="2"/>
+  <w:num w:numId="29">
+    <w:abstractNumId w:val="24"/>
     <w:lvlOverride w:ilvl="0">
       <w:startOverride w:val="1"/>
     </w:lvlOverride>
   </w:num>
-  <w:num w:numId="8">
-    <w:abstractNumId w:val="2"/>
+  <w:num w:numId="30">
+    <w:abstractNumId w:val="24"/>
     <w:lvlOverride w:ilvl="0">
       <w:startOverride w:val="1"/>
     </w:lvlOverride>
   </w:num>
-  <w:num w:numId="9">
-    <w:abstractNumId w:val="2"/>
+  <w:num w:numId="31">
+    <w:abstractNumId w:val="24"/>
     <w:lvlOverride w:ilvl="0">
       <w:startOverride w:val="1"/>
     </w:lvlOverride>
   </w:num>
-  <w:num w:numId="10">
-    <w:abstractNumId w:val="2"/>
+  <w:num w:numId="32">
+    <w:abstractNumId w:val="24"/>
     <w:lvlOverride w:ilvl="0">
       <w:startOverride w:val="1"/>
     </w:lvlOverride>
   </w:num>
-  <w:num w:numId="11">
-    <w:abstractNumId w:val="3"/>
+  <w:num w:numId="33">
+    <w:abstractNumId w:val="25"/>
     <w:lvlOverride w:ilvl="0">
       <w:startOverride w:val="1"/>
     </w:lvlOverride>
   </w:num>
-  <w:num w:numId="12">
-    <w:abstractNumId w:val="3"/>
+  <w:num w:numId="34">
+    <w:abstractNumId w:val="25"/>
     <w:lvlOverride w:ilvl="0">
       <w:startOverride w:val="1"/>
     </w:lvlOverride>
   </w:num>
-  <w:num w:numId="13">
-    <w:abstractNumId w:val="2"/>
+  <w:num w:numId="35">
+    <w:abstractNumId w:val="24"/>
     <w:lvlOverride w:ilvl="0">
       <w:startOverride w:val="1"/>
     </w:lvlOverride>
   </w:num>
-  <w:num w:numId="14">
-    <w:abstractNumId w:val="3"/>
+  <w:num w:numId="36">
+    <w:abstractNumId w:val="25"/>
     <w:lvlOverride w:ilvl="0">
       <w:startOverride w:val="1"/>
     </w:lvlOverride>
   </w:num>
-  <w:num w:numId="15">
-    <w:abstractNumId w:val="3"/>
+  <w:num w:numId="37">
+    <w:abstractNumId w:val="25"/>
     <w:lvlOverride w:ilvl="0">
       <w:startOverride w:val="1"/>
     </w:lvlOverride>
   </w:num>
-  <w:num w:numId="16">
-    <w:abstractNumId w:val="3"/>
+  <w:num w:numId="38">
+    <w:abstractNumId w:val="25"/>
     <w:lvlOverride w:ilvl="0">
       <w:startOverride w:val="1"/>
     </w:lvlOverride>
   </w:num>
-  <w:num w:numId="17">
-    <w:abstractNumId w:val="3"/>
+  <w:num w:numId="39">
+    <w:abstractNumId w:val="25"/>
     <w:lvlOverride w:ilvl="0">
       <w:startOverride w:val="1"/>
     </w:lvlOverride>
   </w:num>
-  <w:num w:numId="18">
-    <w:abstractNumId w:val="4"/>
+  <w:num w:numId="40">
+    <w:abstractNumId w:val="26"/>
     <w:lvlOverride w:ilvl="0">
       <w:startOverride w:val="1"/>
     </w:lvlOverride>
   </w:num>
-  <w:num w:numId="19">
-    <w:abstractNumId w:val="4"/>
+  <w:num w:numId="41">
+    <w:abstractNumId w:val="26"/>
     <w:lvlOverride w:ilvl="0">
       <w:startOverride w:val="1"/>
     </w:lvlOverride>
   </w:num>
-  <w:num w:numId="20">
-    <w:abstractNumId w:val="5"/>
+  <w:num w:numId="42">
+    <w:abstractNumId w:val="27"/>
     <w:lvlOverride w:ilvl="0">
       <w:startOverride w:val="1"/>
     </w:lvlOverride>
   </w:num>
-  <w:num w:numId="21">
-    <w:abstractNumId w:val="5"/>
+  <w:num w:numId="43">
+    <w:abstractNumId w:val="27"/>
     <w:lvlOverride w:ilvl="0">
       <w:startOverride w:val="1"/>
     </w:lvlOverride>
   </w:num>
-  <w:num w:numId="22">
-    <w:abstractNumId w:val="2"/>
+  <w:num w:numId="44">
+    <w:abstractNumId w:val="24"/>
     <w:lvlOverride w:ilvl="0">
       <w:startOverride w:val="1"/>
     </w:lvlOverride>

</xml_diff>